<commit_message>
Created clean figures and added ABAI poster
</commit_message>
<xml_diff>
--- a/Manuscript_BRM/Manuscript_OpenSourceRelationalNetworkDerivationVisualizationTaskGeneration.docx
+++ b/Manuscript_BRM/Manuscript_OpenSourceRelationalNetworkDerivationVisualizationTaskGeneration.docx
@@ -186,15 +186,7 @@
         <w:t xml:space="preserve"> or</w:t>
       </w:r>
       <w:r>
-        <w:t xml:space="preserve"> Henri </w:t>
-      </w:r>
-      <w:proofErr w:type="spellStart"/>
-      <w:r>
-        <w:t>Dunantlaan</w:t>
-      </w:r>
-      <w:proofErr w:type="spellEnd"/>
-      <w:r>
-        <w:t xml:space="preserve"> 2, 9000, Ghent, Belgium. </w:t>
+        <w:t xml:space="preserve"> Henri Dunantlaan 2, 9000, Ghent, Belgium. </w:t>
       </w:r>
       <w:r>
         <w:t>The work presented here was supported</w:t>
@@ -206,7 +198,13 @@
         <w:t xml:space="preserve"> </w:t>
       </w:r>
       <w:r>
-        <w:t>fundamental research grant (11M0323N) of the Flemish Research Foundation</w:t>
+        <w:t>fundamental research grant (11M032</w:t>
+      </w:r>
+      <w:r>
+        <w:t>5</w:t>
+      </w:r>
+      <w:r>
+        <w:t>N) of the Flemish Research Foundation</w:t>
       </w:r>
       <w:r>
         <w:t xml:space="preserve"> to MR.</w:t>
@@ -244,19 +242,43 @@
         <w:pStyle w:val="APA7Body"/>
       </w:pPr>
       <w:r>
-        <w:t>Relational reasoning</w:t>
-      </w:r>
-      <w:r>
-        <w:t xml:space="preserve"> is suggested to be a</w:t>
-      </w:r>
-      <w:r>
-        <w:t xml:space="preserve"> cornerstone of human higher cognition, and therefore a prime subject of psychological </w:t>
-      </w:r>
-      <w:r>
-        <w:t xml:space="preserve">and artificial intelligence </w:t>
-      </w:r>
-      <w:r>
-        <w:t xml:space="preserve">research. </w:t>
+        <w:t xml:space="preserve">Researchers across </w:t>
+      </w:r>
+      <w:r>
+        <w:t xml:space="preserve">various fields of study </w:t>
+      </w:r>
+      <w:r>
+        <w:t>in</w:t>
+      </w:r>
+      <w:r>
+        <w:t xml:space="preserve"> behavioral psychology</w:t>
+      </w:r>
+      <w:r>
+        <w:t xml:space="preserve">, </w:t>
+      </w:r>
+      <w:r>
+        <w:t>cognitive neuroscience</w:t>
+      </w:r>
+      <w:r>
+        <w:t>, biology and</w:t>
+      </w:r>
+      <w:r>
+        <w:t xml:space="preserve"> computer science</w:t>
+      </w:r>
+      <w:r>
+        <w:t xml:space="preserve"> agree that relational abilities </w:t>
+      </w:r>
+      <w:r>
+        <w:t xml:space="preserve">are a cornerstone of human cognition and intelligence. As a results, many different </w:t>
+      </w:r>
+      <w:r>
+        <w:t xml:space="preserve">procedures have been developed to probe relational abilities, and relational tasks </w:t>
+      </w:r>
+      <w:r>
+        <w:t>are often part of broader intelligence tests.</w:t>
+      </w:r>
+      <w:r>
+        <w:t xml:space="preserve"> </w:t>
       </w:r>
       <w:r>
         <w:t xml:space="preserve">Human relational abilities are extremely generative, </w:t>
@@ -265,7 +287,10 @@
         <w:t>allowing individuals to flexibly adapt to novel environments</w:t>
       </w:r>
       <w:r>
-        <w:t>. Unfortunately, this generativity also complicates r</w:t>
+        <w:t>, but this</w:t>
+      </w:r>
+      <w:r>
+        <w:t xml:space="preserve"> generativity also complicates r</w:t>
       </w:r>
       <w:r>
         <w:t xml:space="preserve">esearch </w:t>
@@ -274,31 +299,45 @@
         <w:t xml:space="preserve">on </w:t>
       </w:r>
       <w:r>
-        <w:t xml:space="preserve">complex relational cognition </w:t>
-      </w:r>
-      <w:r>
-        <w:t xml:space="preserve">because visualizing </w:t>
-      </w:r>
-      <w:r>
-        <w:t>the network of relations that governs an individual’s behavior, or establishing such complex relational control in the lab</w:t>
+        <w:t>complex relational cognition</w:t>
+      </w:r>
+      <w:r>
+        <w:t>.</w:t>
+      </w:r>
+      <w:r>
+        <w:t xml:space="preserve"> </w:t>
+      </w:r>
+      <w:r>
+        <w:t>V</w:t>
+      </w:r>
+      <w:r>
+        <w:t xml:space="preserve">isualizing </w:t>
+      </w:r>
+      <w:r>
+        <w:t>the network</w:t>
+      </w:r>
+      <w:r>
+        <w:t>(s)</w:t>
+      </w:r>
+      <w:r>
+        <w:t xml:space="preserve"> of relations that govern</w:t>
+      </w:r>
+      <w:r>
+        <w:t>(</w:t>
+      </w:r>
+      <w:r>
+        <w:t>s</w:t>
+      </w:r>
+      <w:r>
+        <w:t>)</w:t>
+      </w:r>
+      <w:r>
+        <w:t xml:space="preserve"> an individual’s behavior, or establishing such complex relational control in the lab</w:t>
       </w:r>
       <w:r>
         <w:t xml:space="preserve"> is difficult and cumbersome</w:t>
       </w:r>
       <w:r>
-        <w:t xml:space="preserve">, resulting in an empirical basis that is limited to </w:t>
-      </w:r>
-      <w:r>
-        <w:rPr>
-          <w:i/>
-          <w:iCs/>
-        </w:rPr>
-        <w:t>relatively</w:t>
-      </w:r>
-      <w:r>
-        <w:t xml:space="preserve"> simple phenomena</w:t>
-      </w:r>
-      <w:r>
         <w:t xml:space="preserve">. </w:t>
       </w:r>
       <w:r>
@@ -311,7 +350,13 @@
         <w:t xml:space="preserve"> </w:t>
       </w:r>
       <w:r>
-        <w:t xml:space="preserve">resources that we hope can </w:t>
+        <w:t xml:space="preserve">resources that </w:t>
+      </w:r>
+      <w:r>
+        <w:t>aim to</w:t>
+      </w:r>
+      <w:r>
+        <w:t xml:space="preserve"> </w:t>
       </w:r>
       <w:r>
         <w:t xml:space="preserve">facilitate research into </w:t>
@@ -329,16 +374,49 @@
         <w:t xml:space="preserve">a set of </w:t>
       </w:r>
       <w:r>
+        <w:t xml:space="preserve">so-called relational derivation </w:t>
+      </w:r>
+      <w:r>
         <w:t xml:space="preserve">tables that can be used to automate relational derivation </w:t>
       </w:r>
       <w:r>
-        <w:t>in computer programs and illustrate their value in three tools derived from them</w:t>
-      </w:r>
-      <w:r>
-        <w:t xml:space="preserve"> to </w:t>
-      </w:r>
-      <w:r>
-        <w:t>automatically (1) visualize a relational network of baseline and derived relations, (2)  generate a match-to-sample procedure with user-defined task parameters and (3) generate a set of syllogistic reasoning problems provided user-specified task characteristics</w:t>
+        <w:t>in computer programs</w:t>
+      </w:r>
+      <w:r>
+        <w:t xml:space="preserve">. We </w:t>
+      </w:r>
+      <w:r>
+        <w:t xml:space="preserve">derived three tools from them that </w:t>
+      </w:r>
+      <w:r>
+        <w:t xml:space="preserve">illustrate </w:t>
+      </w:r>
+      <w:r>
+        <w:t>their use:</w:t>
+      </w:r>
+      <w:r>
+        <w:t xml:space="preserve"> </w:t>
+      </w:r>
+      <w:r>
+        <w:t>automatically (1) visualize a relational network of baseline and derived relations, (2)  generate match</w:t>
+      </w:r>
+      <w:r>
+        <w:t>ing</w:t>
+      </w:r>
+      <w:r>
+        <w:t>-to-sample procedure</w:t>
+      </w:r>
+      <w:r>
+        <w:t>s</w:t>
+      </w:r>
+      <w:r>
+        <w:t xml:space="preserve"> with user-defined task parameters and (3) generate a set of syllogistic reasoning problems </w:t>
+      </w:r>
+      <w:r>
+        <w:t>with</w:t>
+      </w:r>
+      <w:r>
+        <w:t xml:space="preserve"> user-specified task characteristics</w:t>
       </w:r>
       <w:r>
         <w:t xml:space="preserve">. </w:t>
@@ -350,13 +428,10 @@
         <w:t xml:space="preserve">researchers overcome </w:t>
       </w:r>
       <w:r>
-        <w:t xml:space="preserve">(some of) </w:t>
-      </w:r>
-      <w:r>
-        <w:t>these</w:t>
-      </w:r>
-      <w:r>
-        <w:t xml:space="preserve"> limitations </w:t>
+        <w:t>some of the difficulties associated with studying relational abilities in human or artificial systems</w:t>
+      </w:r>
+      <w:r>
+        <w:t xml:space="preserve"> </w:t>
       </w:r>
       <w:r>
         <w:t xml:space="preserve">and as such </w:t>
@@ -422,77 +497,926 @@
     <w:p>
       <w:pPr>
         <w:pStyle w:val="APA7Body"/>
-      </w:pPr>
-      <w:r>
-        <w:t xml:space="preserve">The human capacity for relational reasoning is </w:t>
-      </w:r>
-      <w:r>
-        <w:t>suggested to be a</w:t>
-      </w:r>
-      <w:r>
-        <w:t xml:space="preserve"> cornerstone of complex cognition and intelligent behavior</w:t>
-      </w:r>
-      <w:r>
-        <w:t xml:space="preserve"> (e.g., Hayes et al, 2001; Penn et al., 2008; Halford et al., 2010; Gentner &amp; Smith, 2013; McLoughlin et al., 2020)</w:t>
+        <w:rPr>
+          <w:szCs w:val="20"/>
+        </w:rPr>
+      </w:pPr>
+      <w:r>
+        <w:rPr>
+          <w:szCs w:val="20"/>
+        </w:rPr>
+        <w:t>R</w:t>
+      </w:r>
+      <w:r>
+        <w:rPr>
+          <w:szCs w:val="20"/>
+        </w:rPr>
+        <w:t xml:space="preserve">esearchers from different fields in psychological research have emphasized the importance of relational </w:t>
+      </w:r>
+      <w:r>
+        <w:rPr>
+          <w:szCs w:val="20"/>
+        </w:rPr>
+        <w:t>abilities</w:t>
+      </w:r>
+      <w:r>
+        <w:rPr>
+          <w:szCs w:val="20"/>
+        </w:rPr>
+        <w:t xml:space="preserve"> as a cornerstone of human cognition (e.g., Hayes et al., 2001; </w:t>
+      </w:r>
+      <w:r>
+        <w:rPr>
+          <w:szCs w:val="20"/>
+        </w:rPr>
+        <w:t xml:space="preserve">Hummel &amp; Holyoak, 2001; </w:t>
+      </w:r>
+      <w:r>
+        <w:rPr>
+          <w:szCs w:val="20"/>
+        </w:rPr>
+        <w:t>Penn et al., 2008; Halford et al., 2010; Gentner &amp; Smith, 2013; Hughes &amp; Barnes-Holmes, 2015</w:t>
+      </w:r>
+      <w:r>
+        <w:rPr>
+          <w:szCs w:val="20"/>
+        </w:rPr>
+        <w:t xml:space="preserve">; </w:t>
+      </w:r>
+      <w:r>
+        <w:rPr>
+          <w:szCs w:val="20"/>
+        </w:rPr>
+        <w:t>McLoughlin et al., 2020) and intelligence more generally (e.g., Cassidy et al., 2011; Colbert et al., 2018</w:t>
+      </w:r>
+      <w:r>
+        <w:rPr>
+          <w:szCs w:val="20"/>
+        </w:rPr>
+        <w:t>;</w:t>
+      </w:r>
+      <w:r>
+        <w:rPr>
+          <w:szCs w:val="20"/>
+        </w:rPr>
+        <w:t xml:space="preserve"> May et al., 2022</w:t>
+      </w:r>
+      <w:r>
+        <w:rPr>
+          <w:szCs w:val="20"/>
+        </w:rPr>
+        <w:t>)</w:t>
+      </w:r>
+      <w:r>
+        <w:rPr>
+          <w:szCs w:val="20"/>
+        </w:rPr>
+        <w:t xml:space="preserve">. </w:t>
+      </w:r>
+      <w:r>
+        <w:rPr>
+          <w:szCs w:val="20"/>
+        </w:rPr>
+        <w:t xml:space="preserve">Many procedures have been developped to probe </w:t>
+      </w:r>
+      <w:r>
+        <w:rPr>
+          <w:szCs w:val="20"/>
+        </w:rPr>
+        <w:t xml:space="preserve">or train </w:t>
+      </w:r>
+      <w:r>
+        <w:rPr>
+          <w:szCs w:val="20"/>
+        </w:rPr>
+        <w:t xml:space="preserve">relational abilities in </w:t>
+      </w:r>
+      <w:r>
+        <w:rPr>
+          <w:szCs w:val="20"/>
+        </w:rPr>
+        <w:t xml:space="preserve">nonhuman animals (e.g., </w:t>
+      </w:r>
+      <w:r>
+        <w:rPr>
+          <w:szCs w:val="20"/>
+        </w:rPr>
+        <w:t>Harlow, 1</w:t>
+      </w:r>
+      <w:r>
+        <w:rPr>
+          <w:szCs w:val="20"/>
+        </w:rPr>
+        <w:t>9</w:t>
+      </w:r>
+      <w:r>
+        <w:rPr>
+          <w:szCs w:val="20"/>
+        </w:rPr>
+        <w:t>49</w:t>
+      </w:r>
+      <w:r>
+        <w:rPr>
+          <w:szCs w:val="20"/>
+        </w:rPr>
+        <w:t xml:space="preserve">; </w:t>
+      </w:r>
+      <w:r>
+        <w:rPr>
+          <w:szCs w:val="20"/>
+        </w:rPr>
+        <w:t>Premack, 1983;</w:t>
+      </w:r>
+      <w:r>
+        <w:rPr>
+          <w:szCs w:val="20"/>
+        </w:rPr>
+        <w:t xml:space="preserve"> Penn et al., 2008</w:t>
+      </w:r>
+      <w:r>
+        <w:rPr>
+          <w:szCs w:val="20"/>
+        </w:rPr>
+        <w:t xml:space="preserve">), </w:t>
+      </w:r>
+      <w:r>
+        <w:rPr>
+          <w:szCs w:val="20"/>
+        </w:rPr>
+        <w:t xml:space="preserve">humans (e.g., </w:t>
+      </w:r>
+      <w:r>
+        <w:rPr>
+          <w:szCs w:val="20"/>
+        </w:rPr>
+        <w:t>Alexander et al., 2016; Colbert et al., 2020</w:t>
+      </w:r>
+      <w:r>
+        <w:rPr>
+          <w:szCs w:val="20"/>
+        </w:rPr>
+        <w:t>; Dixon et al., 2021</w:t>
+      </w:r>
+      <w:r>
+        <w:rPr>
+          <w:szCs w:val="20"/>
+        </w:rPr>
+        <w:t>)</w:t>
+      </w:r>
+      <w:r>
+        <w:rPr>
+          <w:szCs w:val="20"/>
+        </w:rPr>
+        <w:t xml:space="preserve"> and artificial systems (Hummel &amp; Holyoak, 2001</w:t>
+      </w:r>
+      <w:r>
+        <w:rPr>
+          <w:szCs w:val="20"/>
+        </w:rPr>
+        <w:t xml:space="preserve">; </w:t>
+      </w:r>
+      <w:proofErr w:type="spellStart"/>
+      <w:r>
+        <w:rPr>
+          <w:szCs w:val="20"/>
+        </w:rPr>
+        <w:t>Eisape</w:t>
+      </w:r>
+      <w:proofErr w:type="spellEnd"/>
+      <w:r>
+        <w:rPr>
+          <w:szCs w:val="20"/>
+        </w:rPr>
+        <w:t xml:space="preserve"> et al., 2024</w:t>
+      </w:r>
+      <w:r>
+        <w:rPr>
+          <w:szCs w:val="20"/>
+        </w:rPr>
+        <w:t xml:space="preserve">). </w:t>
+      </w:r>
+      <w:r>
+        <w:rPr>
+          <w:szCs w:val="20"/>
+        </w:rPr>
+        <w:t>Some have been proposed to be</w:t>
+      </w:r>
+      <w:r>
+        <w:rPr>
+          <w:szCs w:val="20"/>
+        </w:rPr>
+        <w:t xml:space="preserve"> </w:t>
+      </w:r>
+      <w:r>
+        <w:rPr>
+          <w:szCs w:val="20"/>
+        </w:rPr>
+        <w:t>a proxy-measure of intelligence (e.g., Cassidy et al., 2011; Colbert et al., 2017; May et al., 2022), while others</w:t>
+      </w:r>
+      <w:r>
+        <w:rPr>
+          <w:szCs w:val="20"/>
+        </w:rPr>
+        <w:t xml:space="preserve"> are part of</w:t>
+      </w:r>
+      <w:r>
+        <w:rPr>
+          <w:szCs w:val="20"/>
+        </w:rPr>
+        <w:t xml:space="preserve"> many modern intelligence tests (</w:t>
+      </w:r>
+      <w:r>
+        <w:rPr>
+          <w:szCs w:val="20"/>
+        </w:rPr>
+        <w:t xml:space="preserve">i.e., tasks like matrix reasoning, verbal analogies, etc.; </w:t>
+      </w:r>
+      <w:r>
+        <w:rPr>
+          <w:szCs w:val="20"/>
+        </w:rPr>
+        <w:t xml:space="preserve">e.g., </w:t>
+      </w:r>
+      <w:r>
+        <w:t xml:space="preserve">Raven &amp; Raven, 2003; </w:t>
+      </w:r>
+      <w:r>
+        <w:rPr>
+          <w:lang w:val="en-GB"/>
+        </w:rPr>
+        <w:t>Kaufman, A. S., &amp; Lichtenberger, E. O.</w:t>
+      </w:r>
+      <w:r>
+        <w:rPr>
+          <w:lang w:val="en-GB"/>
+        </w:rPr>
+        <w:t xml:space="preserve">, </w:t>
+      </w:r>
+      <w:r>
+        <w:rPr>
+          <w:lang w:val="en-GB"/>
+        </w:rPr>
+        <w:t>2006</w:t>
+      </w:r>
+      <w:r>
+        <w:rPr>
+          <w:lang w:val="en-GB"/>
+        </w:rPr>
+        <w:t xml:space="preserve">; </w:t>
+      </w:r>
+      <w:r>
+        <w:t xml:space="preserve">Wechsler, 2008; </w:t>
+      </w:r>
+      <w:r>
+        <w:rPr>
+          <w:szCs w:val="20"/>
+        </w:rPr>
+        <w:t>Cassidy et al., 201</w:t>
+      </w:r>
+      <w:r>
+        <w:rPr>
+          <w:szCs w:val="20"/>
+        </w:rPr>
+        <w:t>1</w:t>
+      </w:r>
+      <w:r>
+        <w:rPr>
+          <w:szCs w:val="20"/>
+        </w:rPr>
+        <w:t>; Colbert et al., 2017).</w:t>
+      </w:r>
+      <w:r>
+        <w:rPr>
+          <w:szCs w:val="20"/>
+        </w:rPr>
+        <w:t xml:space="preserve"> </w:t>
+      </w:r>
+      <w:r>
+        <w:rPr>
+          <w:szCs w:val="20"/>
+        </w:rPr>
+        <w:t xml:space="preserve">In the current </w:t>
+      </w:r>
+      <w:r>
+        <w:rPr>
+          <w:szCs w:val="20"/>
+        </w:rPr>
+        <w:t>paper we describe a set of tools that aim to facilitate future research on relational abilities in different systems</w:t>
+      </w:r>
+      <w:r>
+        <w:rPr>
+          <w:szCs w:val="20"/>
+        </w:rPr>
+        <w:t xml:space="preserve"> (nonhuman animals, humans, artificial systems)</w:t>
+      </w:r>
+      <w:r>
+        <w:rPr>
+          <w:szCs w:val="20"/>
+        </w:rPr>
+        <w:t xml:space="preserve">. </w:t>
+      </w:r>
+    </w:p>
+    <w:p>
+      <w:pPr>
+        <w:pStyle w:val="APA7Body"/>
+      </w:pPr>
+      <w:r>
+        <w:t>Human relational abilities are extremely generative, allowing individuals to flexibly adapt to novel environments</w:t>
+      </w:r>
+      <w:r>
+        <w:t xml:space="preserve">. Humans only need to learn about a handful of relations </w:t>
+      </w:r>
+      <w:r>
+        <w:t>to derive a myriad of new relations (</w:t>
+      </w:r>
+      <w:r>
+        <w:t xml:space="preserve">Hayes et al., 2001; </w:t>
+      </w:r>
+      <w:r>
+        <w:t xml:space="preserve">Hayes, 2012; </w:t>
+      </w:r>
+      <w:r>
+        <w:t>Smith &amp; Hayes, 2022</w:t>
+      </w:r>
+      <w:r>
+        <w:t xml:space="preserve">; </w:t>
+      </w:r>
+      <w:r>
+        <w:t>e.g., if one knows A is related to B and B is related to C, one can derive a relation between B and A, between C and A, between A and C, and between C and B</w:t>
+      </w:r>
+      <w:r>
+        <w:t>).</w:t>
+      </w:r>
+      <w:r>
+        <w:t xml:space="preserve"> This generativity quickly results in complex relational networks and behavioral repertoires</w:t>
+      </w:r>
+      <w:r>
+        <w:t xml:space="preserve">, which are often difficult to </w:t>
+      </w:r>
+      <w:r>
+        <w:t xml:space="preserve">describe, let alone </w:t>
+      </w:r>
+      <w:r>
+        <w:t>study in a controlled laboratory setting</w:t>
+      </w:r>
+      <w:r>
+        <w:t>.</w:t>
+      </w:r>
+      <w:r>
+        <w:t xml:space="preserve"> However, </w:t>
+      </w:r>
+      <w:r>
+        <w:t xml:space="preserve">if we want to explore the </w:t>
+      </w:r>
+      <w:r>
+        <w:t xml:space="preserve">full extent of relational abilities </w:t>
+      </w:r>
+      <w:r>
+        <w:t xml:space="preserve">and their implications for intelligence </w:t>
+      </w:r>
+      <w:r>
+        <w:t xml:space="preserve">in humans or other systems, it </w:t>
+      </w:r>
+      <w:r>
+        <w:t>is</w:t>
+      </w:r>
+      <w:r>
+        <w:t xml:space="preserve"> necessary to </w:t>
+      </w:r>
+      <w:r>
+        <w:t xml:space="preserve">have highly specified </w:t>
+      </w:r>
+      <w:r>
+        <w:t>task procedures (e.g., Cortes et al., 2021)</w:t>
+      </w:r>
+      <w:r>
+        <w:t xml:space="preserve"> as well as detailed analytic and descriptive models</w:t>
+      </w:r>
+      <w:r>
+        <w:t xml:space="preserve"> (Smith &amp; Hayes, 2022)</w:t>
+      </w:r>
+      <w:r>
+        <w:t>.</w:t>
+      </w:r>
+    </w:p>
+    <w:p>
+      <w:pPr>
+        <w:pStyle w:val="APA7Body"/>
+      </w:pPr>
+      <w:r>
+        <w:t xml:space="preserve">Another area where relational </w:t>
+      </w:r>
+      <w:r>
+        <w:t xml:space="preserve">abilities have become increasingly relevant is </w:t>
+      </w:r>
+      <w:r>
+        <w:t xml:space="preserve">artificial intelligence (AI) </w:t>
+      </w:r>
+      <w:r>
+        <w:t>research.</w:t>
+      </w:r>
+      <w:r>
+        <w:t xml:space="preserve"> AI researchers </w:t>
+      </w:r>
+      <w:r>
+        <w:t>have also assessed relational abilities of artificial systems as a cornerstone of general intelligence</w:t>
+      </w:r>
+      <w:r>
+        <w:t xml:space="preserve"> </w:t>
+      </w:r>
+      <w:r>
+        <w:t xml:space="preserve">(e.g., </w:t>
+      </w:r>
+      <w:r>
+        <w:t>Hummel &amp; Holyoak, 2001</w:t>
+      </w:r>
+      <w:r>
+        <w:t xml:space="preserve">; </w:t>
+      </w:r>
+      <w:proofErr w:type="spellStart"/>
+      <w:r>
+        <w:t>Eisape</w:t>
+      </w:r>
+      <w:proofErr w:type="spellEnd"/>
+      <w:r>
+        <w:t xml:space="preserve"> et al., </w:t>
+      </w:r>
+      <w:r>
+        <w:lastRenderedPageBreak/>
+        <w:t>2024; Ozeki et al., 2024; Ando et al., 2024; Wu &amp; Deng, 2024</w:t>
+      </w:r>
+      <w:r>
+        <w:t>)</w:t>
+      </w:r>
+      <w:r>
+        <w:t xml:space="preserve">, </w:t>
+      </w:r>
+      <w:r>
+        <w:t>increasingly</w:t>
+      </w:r>
+      <w:r>
+        <w:t xml:space="preserve"> draw upon insights from other research traditions</w:t>
+      </w:r>
+      <w:r>
+        <w:t xml:space="preserve"> in developing </w:t>
+      </w:r>
+      <w:r>
+        <w:t>artificially intelligent systems</w:t>
+      </w:r>
+      <w:r>
+        <w:t xml:space="preserve"> </w:t>
+      </w:r>
+      <w:r>
+        <w:t>(</w:t>
+      </w:r>
+      <w:r>
+        <w:t xml:space="preserve">e.g., </w:t>
+      </w:r>
+      <w:r>
+        <w:t xml:space="preserve">Ninness &amp; Ninness, 2020; </w:t>
+      </w:r>
+      <w:r>
+        <w:t xml:space="preserve">Edwards et al., 2022; </w:t>
+      </w:r>
+      <w:r>
+        <w:t>Johansson, 2024)</w:t>
       </w:r>
       <w:r>
         <w:t xml:space="preserve"> and </w:t>
       </w:r>
       <w:r>
-        <w:t xml:space="preserve">has received increasing research attention in fields such as behavioral </w:t>
-      </w:r>
-      <w:r>
-        <w:t>psychology, cognitive and neuropsychology, linguistics and computer science.</w:t>
+        <w:t>explore the implementation of relational networks in neural network models</w:t>
+      </w:r>
+      <w:r>
+        <w:t xml:space="preserve"> (e.g., Santoro et al., 2017; </w:t>
+      </w:r>
+      <w:r>
+        <w:t>Webb et al., 2024)</w:t>
+      </w:r>
+      <w:r>
+        <w:t>.</w:t>
+      </w:r>
+      <w:r>
+        <w:t xml:space="preserve"> However, </w:t>
+      </w:r>
+      <w:r>
+        <w:t>the relational information they learn is often hidden in the black box-nature of their many hidden layers</w:t>
+      </w:r>
+      <w:r>
+        <w:t xml:space="preserve"> (Smith &amp; Hayes, 2022)</w:t>
+      </w:r>
+      <w:r>
+        <w:t>, an area of focus for future research</w:t>
+      </w:r>
+      <w:r>
+        <w:t>.</w:t>
+      </w:r>
+    </w:p>
+    <w:p>
+      <w:pPr>
+        <w:pStyle w:val="APA7Body"/>
+      </w:pPr>
+      <w:r>
+        <w:t xml:space="preserve">This paper describes a set of open-source </w:t>
+      </w:r>
+      <w:r>
+        <w:t xml:space="preserve">tools that </w:t>
+      </w:r>
+      <w:r>
+        <w:t>aim to complement and facilitate research on relational abilities in different systems, be that nonhuman animals, humans or artificial systems. Inspired by the work of Allen (198</w:t>
+      </w:r>
+      <w:r>
+        <w:t xml:space="preserve">3), </w:t>
+      </w:r>
+      <w:r>
+        <w:t>who worked on representation of temporal relation</w:t>
+      </w:r>
+      <w:r>
+        <w:t>s</w:t>
+      </w:r>
+      <w:r>
+        <w:t xml:space="preserve"> in computer systems</w:t>
+      </w:r>
+      <w:r>
+        <w:t xml:space="preserve">, </w:t>
+      </w:r>
+      <w:r>
+        <w:t xml:space="preserve">we constructed </w:t>
+      </w:r>
+      <w:r>
+        <w:t xml:space="preserve">an set of </w:t>
+      </w:r>
+      <w:r>
+        <w:t xml:space="preserve">so-called </w:t>
+      </w:r>
+      <w:r>
+        <w:t>transitivity tables</w:t>
+      </w:r>
+      <w:r>
+        <w:t xml:space="preserve"> (also referred to as composition tables in logic)</w:t>
+      </w:r>
+      <w:r>
+        <w:t xml:space="preserve">. </w:t>
+      </w:r>
+      <w:r>
+        <w:t>As the name suggests, these</w:t>
+      </w:r>
+      <w:r>
+        <w:t xml:space="preserve"> tables describe </w:t>
+      </w:r>
+      <w:r>
+        <w:t xml:space="preserve">the transitivity of various combinations of relations (i.e., </w:t>
+      </w:r>
+      <w:r>
+        <w:t>if A is before B and B is before C, A is before C; and if A is opposite to B</w:t>
+      </w:r>
+      <w:r>
+        <w:t xml:space="preserve"> and B is opposite to C, A and C are the same). Where Allen’s tables contained only temporal relations</w:t>
+      </w:r>
+      <w:r>
+        <w:t xml:space="preserve"> (e.g., before, after, meets, starts)</w:t>
+      </w:r>
+      <w:r>
+        <w:t xml:space="preserve">, </w:t>
+      </w:r>
+      <w:r>
+        <w:t>the</w:t>
       </w:r>
       <w:r>
         <w:t xml:space="preserve"> </w:t>
       </w:r>
       <w:r>
-        <w:t>Across these research fields, p</w:t>
-      </w:r>
-      <w:r>
-        <w:t xml:space="preserve">rocedures involving complex relational reasoning are developed to assess </w:t>
-      </w:r>
-      <w:r>
-        <w:t xml:space="preserve">the ability in an experimental context (e.g., </w:t>
-      </w:r>
-      <w:r>
-        <w:t xml:space="preserve">the relational abilities index, Stewart et al., 2016, Cummins et al., </w:t>
-      </w:r>
-      <w:r>
-        <w:t>2023</w:t>
+        <w:t>tables</w:t>
+      </w:r>
+      <w:r>
+        <w:t xml:space="preserve"> described here contain other relationships also (e.g., equivalence, difference, opposition, comparison, hierarchy, temporal, …)</w:t>
+      </w:r>
+      <w:r>
+        <w:t xml:space="preserve">. Furthermore, </w:t>
+      </w:r>
+      <w:r>
+        <w:t>we also included a table for the reversal of relations (e.g., if A is more than B, B is less than A</w:t>
+      </w:r>
+      <w:r>
+        <w:t>; therefore, the tables are hereafter referred to as relational derivation tables</w:t>
+      </w:r>
+      <w:r>
+        <w:t>). These</w:t>
+      </w:r>
+      <w:r>
+        <w:t xml:space="preserve"> tables can be used for </w:t>
+      </w:r>
+      <w:r>
+        <w:t xml:space="preserve">constructing algorithms capable of </w:t>
+      </w:r>
+      <w:r>
+        <w:t xml:space="preserve">automated reasoning </w:t>
+      </w:r>
+      <w:r>
+        <w:t>about relations, which can in turn be implemented i</w:t>
+      </w:r>
+      <w:r>
+        <w:t>n different applications. We describe three such applications here</w:t>
+      </w:r>
+      <w:r>
+        <w:t>, using automated relational derivation</w:t>
+      </w:r>
+      <w:r>
+        <w:t xml:space="preserve"> (</w:t>
+      </w:r>
+      <w:r>
+        <w:t xml:space="preserve">1) for visualizing relational networks; (2) </w:t>
+      </w:r>
+      <w:r>
+        <w:t>creating syllogistic reasoning</w:t>
+      </w:r>
+      <w:r>
+        <w:t xml:space="preserve"> problems</w:t>
+      </w:r>
+      <w:r>
+        <w:t xml:space="preserve">; and (3) </w:t>
+      </w:r>
+      <w:r>
+        <w:t>creating matching-to-sample procedures. We first describe the tables in more detail, before illustrating their use in these applications.</w:t>
+      </w:r>
+    </w:p>
+    <w:p>
+      <w:pPr>
+        <w:pStyle w:val="APA7H3"/>
+      </w:pPr>
+      <w:r>
+        <w:t>Relational Derivation Tables</w:t>
+      </w:r>
+    </w:p>
+    <w:p>
+      <w:pPr>
+        <w:pStyle w:val="APA7Body"/>
+      </w:pPr>
+      <w:r>
+        <w:t xml:space="preserve">Inspired by Allen’s (1983) </w:t>
+      </w:r>
+      <w:r>
+        <w:t xml:space="preserve">work on the representation of temporal relations in computer systems, we developed a set of relational derivation tables that can be used </w:t>
+      </w:r>
+      <w:r>
+        <w:t xml:space="preserve">to </w:t>
+      </w:r>
+      <w:r>
+        <w:t xml:space="preserve">automate reasoning about relations. </w:t>
+      </w:r>
+      <w:r>
+        <w:t>Such tools for automated reasoning about relations are not readily available to researchers</w:t>
+      </w:r>
+      <w:r>
+        <w:t xml:space="preserve"> (Smith &amp; Hayes, 2022)</w:t>
+      </w:r>
+      <w:r>
+        <w:t xml:space="preserve">, and where they are, they are often allow for </w:t>
+      </w:r>
+      <w:r>
+        <w:lastRenderedPageBreak/>
+        <w:t>only a limited number of relations</w:t>
+      </w:r>
+      <w:r>
+        <w:t xml:space="preserve">. </w:t>
+      </w:r>
+      <w:r>
+        <w:t xml:space="preserve">We expanded on </w:t>
+      </w:r>
+      <w:r>
+        <w:t>Allen’s idea and created relational derivation tables that include both the reversals</w:t>
+      </w:r>
+      <w:r>
+        <w:t xml:space="preserve"> [(as)symmetry]</w:t>
+      </w:r>
+      <w:r>
+        <w:t xml:space="preserve"> and transitivity of relations</w:t>
+      </w:r>
+      <w:r>
+        <w:t xml:space="preserve">, and include many other relations beyond temporal relations. </w:t>
+      </w:r>
+      <w:r>
+        <w:t>While other relations can be included, we chose to limit ourselves to this set of relations</w:t>
+      </w:r>
+      <w:r>
+        <w:t xml:space="preserve"> currently, as we believe it already provides </w:t>
+      </w:r>
+      <w:r>
+        <w:t xml:space="preserve">prototypical versions of the most studied relations in psychological research (e.g., Hayes et al., 2001; </w:t>
+      </w:r>
+      <w:r>
+        <w:t>Penn et al., 2008</w:t>
+      </w:r>
+      <w:r>
+        <w:t xml:space="preserve">; Colbert et al., 2020). </w:t>
+      </w:r>
+      <w:r>
+        <w:t xml:space="preserve">Below, we describe the different tables in more detail, before </w:t>
+      </w:r>
+      <w:r>
+        <w:t>providing a walkthrough of the scripts that can be used to produce them in Python.</w:t>
+      </w:r>
+    </w:p>
+    <w:p>
+      <w:pPr>
+        <w:pStyle w:val="APA7Body"/>
+      </w:pPr>
+      <w:r>
+        <w:rPr>
+          <w:b/>
+          <w:bCs w:val="0"/>
+        </w:rPr>
+        <w:t>Mutual Entailment</w:t>
+      </w:r>
+      <w:r>
+        <w:t xml:space="preserve">. </w:t>
+      </w:r>
+      <w:r>
+        <w:t>The mutual entailment table is illustrated in Figure 1. It contains many relations, from equivalence, difference</w:t>
+      </w:r>
+      <w:r>
+        <w:t xml:space="preserve"> and </w:t>
+      </w:r>
+      <w:r>
+        <w:t>opposition</w:t>
+      </w:r>
+      <w:r>
+        <w:t xml:space="preserve"> relations </w:t>
+      </w:r>
+      <w:r>
+        <w:t>to</w:t>
+      </w:r>
+      <w:r>
+        <w:t xml:space="preserve"> </w:t>
+      </w:r>
+      <w:r>
+        <w:t>comparative</w:t>
+      </w:r>
+      <w:r>
+        <w:t xml:space="preserve"> relations (more than, less than), hierarchical relations (</w:t>
+      </w:r>
+      <w:r>
+        <w:t>contains, is part of) and</w:t>
+      </w:r>
+      <w:r>
+        <w:t xml:space="preserve"> temporal</w:t>
+      </w:r>
+      <w:r>
+        <w:t xml:space="preserve"> relations. </w:t>
+      </w:r>
+      <w:r>
+        <w:t>Equivalence</w:t>
+      </w:r>
+      <w:r>
+        <w:t xml:space="preserve"> </w:t>
+      </w:r>
+      <w:r>
+        <w:t>relations are defined by symmetry (Sidman &amp; Tailby, 1982</w:t>
+      </w:r>
+      <w:r>
+        <w:t xml:space="preserve">; </w:t>
+      </w:r>
+      <w:r>
+        <w:t>if A is equivalent to B, B is equivalent to A</w:t>
+      </w:r>
+      <w:r>
+        <w:t xml:space="preserve">; </w:t>
+      </w:r>
+      <w:r>
+        <w:t xml:space="preserve">any </w:t>
+      </w:r>
+      <w:r>
+        <w:t xml:space="preserve">response to </w:t>
+      </w:r>
+      <w:proofErr w:type="spellStart"/>
+      <w:r>
+        <w:t>A</w:t>
+      </w:r>
+      <w:proofErr w:type="spellEnd"/>
+      <w:r>
+        <w:t xml:space="preserve"> in relation to B is </w:t>
+      </w:r>
+      <w:r>
+        <w:t xml:space="preserve">functionally </w:t>
+      </w:r>
+      <w:r>
+        <w:t xml:space="preserve">identical to </w:t>
+      </w:r>
+      <w:r>
+        <w:t>response to B in relation to A</w:t>
       </w:r>
       <w:r>
         <w:t>)</w:t>
       </w:r>
       <w:r>
-        <w:t>, relate it to some other construct (e.g., fluid intelligence</w:t>
-      </w:r>
-      <w:r>
-        <w:t xml:space="preserve">, Crone et al., 2009; </w:t>
-      </w:r>
-      <w:r>
-        <w:t>Colbert et al., 20</w:t>
-      </w:r>
-      <w:r>
-        <w:t xml:space="preserve">17) or to </w:t>
-      </w:r>
-      <w:r>
-        <w:t>train the ability or those it is purported to underpin (e.g.,</w:t>
-      </w:r>
-      <w:r>
-        <w:t xml:space="preserve"> Colbert et al., 2018; Dixon et al., </w:t>
-      </w:r>
-      <w:r>
-        <w:t>202</w:t>
-      </w:r>
-      <w:r>
-        <w:t>2</w:t>
+        <w:t xml:space="preserve">. Some other relations, like difference and opposition are </w:t>
+      </w:r>
+      <w:r>
+        <w:t xml:space="preserve">also </w:t>
+      </w:r>
+      <w:r>
+        <w:t>symmetric</w:t>
+      </w:r>
+      <w:r>
+        <w:t>al</w:t>
+      </w:r>
+      <w:r>
+        <w:t xml:space="preserve"> </w:t>
+      </w:r>
+      <w:r>
+        <w:t xml:space="preserve">(e.g., if A is different from B, B is different from A, and if A is opposite to B, B is opposite to A). </w:t>
+      </w:r>
+      <w:r>
+        <w:t>M</w:t>
+      </w:r>
+      <w:r>
+        <w:t>ost relations other than equivalence</w:t>
+      </w:r>
+      <w:r>
+        <w:t xml:space="preserve">, however, are not symmetrical. Instead, they </w:t>
+      </w:r>
+      <w:r>
+        <w:t>(</w:t>
+      </w:r>
+      <w:r>
+        <w:t>often</w:t>
       </w:r>
       <w:r>
         <w:t>)</w:t>
       </w:r>
       <w:r>
+        <w:t xml:space="preserve"> form pairs of relations</w:t>
+      </w:r>
+      <w:r>
+        <w:t xml:space="preserve"> within which the mutually entailed response to one relation is the other relation </w:t>
+      </w:r>
+      <w:r>
+        <w:t>For instance</w:t>
+      </w:r>
+      <w:r>
+        <w:t>, for comparative relations</w:t>
+      </w:r>
+      <w:r>
+        <w:t>,</w:t>
+      </w:r>
+      <w:r>
+        <w:t xml:space="preserve"> if A is more than B, B is less than C</w:t>
+      </w:r>
+      <w:r>
+        <w:t>. O</w:t>
+      </w:r>
+      <w:r>
+        <w:t xml:space="preserve">ther examples include </w:t>
+      </w:r>
+      <w:r>
+        <w:t xml:space="preserve">the </w:t>
+      </w:r>
+      <w:r>
+        <w:t xml:space="preserve">temporal relations </w:t>
+      </w:r>
+      <w:r>
+        <w:t>‘</w:t>
+      </w:r>
+      <w:r>
+        <w:t>before</w:t>
+      </w:r>
+      <w:r>
+        <w:t>’</w:t>
+      </w:r>
+      <w:r>
+        <w:t xml:space="preserve"> and </w:t>
+      </w:r>
+      <w:r>
+        <w:t>‘</w:t>
+      </w:r>
+      <w:r>
+        <w:t>after</w:t>
+      </w:r>
+      <w:r>
+        <w:t>’ (as well as those described by Allen, 1983)</w:t>
+      </w:r>
+      <w:r>
+        <w:t xml:space="preserve"> or </w:t>
+      </w:r>
+      <w:r>
+        <w:t>hierarchical relations like ‘contains’ and ‘is part of’</w:t>
+      </w:r>
+      <w:r>
+        <w:t xml:space="preserve">. </w:t>
+      </w:r>
+    </w:p>
+    <w:p>
+      <w:pPr>
+        <w:pStyle w:val="APA7Body"/>
+      </w:pPr>
+      <w:r>
+        <w:rPr>
+          <w:b/>
+          <w:bCs w:val="0"/>
+        </w:rPr>
+        <w:t>Combinatorial Entailment</w:t>
+      </w:r>
+      <w:r>
         <w:t>.</w:t>
       </w:r>
       <w:r>
@@ -504,181 +1428,364 @@
         <w:pStyle w:val="APA7Body"/>
       </w:pPr>
       <w:r>
-        <w:t xml:space="preserve">Smith &amp; Hayes (2022) make point that AI </w:t>
-      </w:r>
-      <w:r>
-        <w:t xml:space="preserve">research also increasingly makes use of </w:t>
-      </w:r>
-      <w:r>
-        <w:t>relational algorithms with the hopes of achieving human-level flexibility and generativity (e.g., Santoro et al., 2020</w:t>
-      </w:r>
-      <w:r>
-        <w:t>;</w:t>
-      </w:r>
-      <w:r>
-        <w:t xml:space="preserve"> Ninness and Ninness, </w:t>
-      </w:r>
-      <w:r>
-        <w:t>2020;</w:t>
-      </w:r>
-      <w:r>
-        <w:t xml:space="preserve"> …) but that the relational information they learn is often hidden in the black box-nature of their many hidden layers.</w:t>
-      </w:r>
-    </w:p>
-    <w:p>
-      <w:pPr>
-        <w:pStyle w:val="APA7Body"/>
-      </w:pPr>
-    </w:p>
-    <w:p>
-      <w:pPr>
-        <w:pStyle w:val="APA7Body"/>
-      </w:pPr>
-      <w:r>
-        <w:t xml:space="preserve"> In order to explore the broader implications of assessing and training relational reasoning for complex issues in human cognition</w:t>
-      </w:r>
-      <w:r>
-        <w:t>,</w:t>
-      </w:r>
-      <w:r>
-        <w:t xml:space="preserve"> it is necessary to have both highly specified tasks (e.g., see Cortes et al., 2021) and carefully crafted analytic and descriptive models. We will use the example of RFT to explain why that is so.</w:t>
-      </w:r>
-      <w:r>
-        <w:t xml:space="preserve"> RFT </w:t>
-      </w:r>
-      <w:r>
-        <w:t>accounts for generativity in human language through a learned behavior of combining two or more previously trained relations into novel derived (not directly trained</w:t>
-      </w:r>
-      <w:r>
-        <w:t xml:space="preserve"> or reinforced</w:t>
-      </w:r>
-      <w:r>
-        <w:t xml:space="preserve">) relations. For example, if </w:t>
-      </w:r>
+        <w:t xml:space="preserve">Step-by-step description of script for </w:t>
+      </w:r>
+      <w:r>
+        <w:t>d</w:t>
+      </w:r>
+      <w:r>
+        <w:t>erivation</w:t>
+      </w:r>
+      <w:r>
+        <w:t>.</w:t>
+      </w:r>
+      <w:r>
+        <w:t xml:space="preserve"> </w:t>
+      </w:r>
+      <w:r>
+        <w:t>T</w:t>
+      </w:r>
+      <w:r>
+        <w:t xml:space="preserve">he </w:t>
+      </w:r>
+      <w:proofErr w:type="spellStart"/>
       <w:r>
         <w:rPr>
           <w:i/>
           <w:iCs/>
         </w:rPr>
-        <w:t xml:space="preserve">A </w:t>
-      </w:r>
-      <w:r>
-        <w:t xml:space="preserve">is less than </w:t>
+        <w:t>DerivationTablesFromSourceRelations</w:t>
+      </w:r>
+      <w:proofErr w:type="spellEnd"/>
+      <w:r>
+        <w:t xml:space="preserve"> Python function</w:t>
+      </w:r>
+      <w:r>
+        <w:t xml:space="preserve"> </w:t>
+      </w:r>
+      <w:r>
+        <w:t>generate</w:t>
+      </w:r>
+      <w:r>
+        <w:t>s</w:t>
+      </w:r>
+      <w:r>
+        <w:t xml:space="preserve"> the relational derivation tables </w:t>
+      </w:r>
+      <w:r>
+        <w:t>(</w:t>
+      </w:r>
+      <w:r>
+        <w:t>in Python</w:t>
+      </w:r>
+      <w:r>
+        <w:t>)</w:t>
+      </w:r>
+      <w:r>
+        <w:t xml:space="preserve"> for a given set of source relations. </w:t>
+      </w:r>
+      <w:r>
+        <w:t xml:space="preserve">The function takes one optional </w:t>
+      </w:r>
+      <w:r>
+        <w:t>input argument, which allows u</w:t>
+      </w:r>
+      <w:r>
+        <w:t xml:space="preserve">sers </w:t>
+      </w:r>
+      <w:r>
+        <w:t xml:space="preserve">to </w:t>
+      </w:r>
+      <w:r>
+        <w:t>specify the relations for which they want to create the tables</w:t>
+      </w:r>
+      <w:r>
+        <w:t>. This input argument</w:t>
+      </w:r>
+      <w:r>
+        <w:t xml:space="preserve"> (named</w:t>
+      </w:r>
+      <w:r>
+        <w:t xml:space="preserve"> </w:t>
       </w:r>
       <w:r>
         <w:rPr>
           <w:i/>
           <w:iCs/>
         </w:rPr>
-        <w:t xml:space="preserve">B </w:t>
-      </w:r>
-      <w:r>
-        <w:t xml:space="preserve">and </w:t>
+        <w:t>relations</w:t>
       </w:r>
       <w:r>
         <w:rPr>
           <w:i/>
           <w:iCs/>
         </w:rPr>
-        <w:t xml:space="preserve">B </w:t>
-      </w:r>
-      <w:r>
-        <w:t>is less than</w:t>
-      </w:r>
-      <w:r>
-        <w:t xml:space="preserve"> C</w:t>
-      </w:r>
-      <w:r>
-        <w:t>, one can also derive the relation between A and C (assuming a prior</w:t>
-      </w:r>
-      <w:r>
-        <w:t xml:space="preserve"> learning history </w:t>
-      </w:r>
-    </w:p>
-    <w:p>
-      <w:pPr>
-        <w:pStyle w:val="APA7Body"/>
-      </w:pPr>
-      <w:r>
-        <w:t>Results in massive relational networks</w:t>
-      </w:r>
-      <w:r>
-        <w:t xml:space="preserve"> and relational behavioral repertoires</w:t>
-      </w:r>
-      <w:r>
-        <w:t xml:space="preserve">, </w:t>
-      </w:r>
-      <w:r>
-        <w:t>barely matched by experimental procedures -&gt; extrapolation</w:t>
-      </w:r>
-    </w:p>
-    <w:p>
-      <w:pPr>
-        <w:pStyle w:val="APA7Body"/>
-        <w:numPr>
-          <w:ilvl w:val="0"/>
-          <w:numId w:val="2"/>
-        </w:numPr>
-      </w:pPr>
-      <w:r>
-        <w:t>Related work</w:t>
-      </w:r>
-      <w:r>
-        <w:t>: Allen (1983)</w:t>
-      </w:r>
-      <w:r>
-        <w:t>, Smith &amp; Hayes (22) -&gt; Extended and applied!</w:t>
-      </w:r>
-    </w:p>
-    <w:p>
-      <w:pPr>
-        <w:pStyle w:val="APA7Body"/>
-        <w:ind w:left="1080" w:firstLine="0"/>
-      </w:pPr>
+        <w:t>)</w:t>
+      </w:r>
+      <w:r>
+        <w:t xml:space="preserve"> should be </w:t>
+      </w:r>
+      <w:r>
+        <w:t>a Python dict</w:t>
+      </w:r>
+      <w:r>
+        <w:t>ionary</w:t>
+      </w:r>
+      <w:r>
+        <w:t xml:space="preserve"> in which the keys are the relation labels and the values are the ind</w:t>
+      </w:r>
+      <w:r>
+        <w:t>ices</w:t>
+      </w:r>
+      <w:r>
+        <w:t xml:space="preserve"> those relations will take in the </w:t>
+      </w:r>
+      <w:r>
+        <w:t xml:space="preserve">relational derivation </w:t>
+      </w:r>
+      <w:r>
+        <w:t>tables</w:t>
+      </w:r>
+      <w:r>
+        <w:t xml:space="preserve"> (note that Python uses zero-based indexing, and therefore, the values in the list should also </w:t>
+      </w:r>
       <w:r>
         <w:lastRenderedPageBreak/>
-        <w:t>Derivation tables and scripts +</w:t>
-      </w:r>
-      <w:r>
-        <w:t xml:space="preserve"> can be used to automate things -</w:t>
+        <w:t>start from zero)</w:t>
+      </w:r>
+      <w:r>
+        <w:t>.</w:t>
+      </w:r>
+      <w:r>
+        <w:t xml:space="preserve"> As noted, this is an optional </w:t>
+      </w:r>
+      <w:r>
+        <w:t xml:space="preserve">input </w:t>
+      </w:r>
+      <w:r>
+        <w:t>argument</w:t>
+      </w:r>
+      <w:r>
+        <w:t>:</w:t>
+      </w:r>
+      <w:r>
+        <w:t xml:space="preserve"> If no input is provided, the function </w:t>
+      </w:r>
+      <w:r>
+        <w:t>will generate the tables for a</w:t>
+      </w:r>
+      <w:r>
+        <w:t xml:space="preserve"> default set of relations</w:t>
+      </w:r>
+      <w:r>
+        <w:t xml:space="preserve"> (i.e., same, different, opposite, more than, less than, contains, is part of, before and after)</w:t>
+      </w:r>
+      <w:r>
+        <w:t>.</w:t>
       </w:r>
       <w:r>
         <w:t xml:space="preserve"> </w:t>
       </w:r>
       <w:r>
-        <w:t>applications: visualization and task creation</w:t>
-      </w:r>
-    </w:p>
-    <w:p>
-      <w:pPr>
-        <w:pStyle w:val="APA7H2"/>
-      </w:pPr>
-      <w:r>
-        <w:t>Method</w:t>
-      </w:r>
-    </w:p>
-    <w:p>
-      <w:pPr>
-        <w:pStyle w:val="APA7H3"/>
-      </w:pPr>
-      <w:r>
-        <w:t>Relational Derivation Tables</w:t>
-      </w:r>
-    </w:p>
-    <w:p>
-      <w:pPr>
-        <w:pStyle w:val="APA7Body"/>
-      </w:pPr>
-      <w:r>
-        <w:t xml:space="preserve">Describe composition tables </w:t>
-      </w:r>
-    </w:p>
-    <w:p>
-      <w:pPr>
-        <w:pStyle w:val="APA7Body"/>
-      </w:pPr>
-      <w:r>
-        <w:t>Step-by-step description of script for derivation</w:t>
+        <w:t>The function outputs two variables</w:t>
+      </w:r>
+      <w:r>
+        <w:t xml:space="preserve">. The first, named </w:t>
+      </w:r>
+      <w:r>
+        <w:rPr>
+          <w:i/>
+          <w:iCs/>
+        </w:rPr>
+        <w:t>mutual</w:t>
+      </w:r>
+      <w:r>
+        <w:t xml:space="preserve">, is a </w:t>
+      </w:r>
+      <w:r>
+        <w:t>1-by-n</w:t>
+      </w:r>
+      <w:r>
+        <w:t xml:space="preserve"> array</w:t>
+      </w:r>
+      <w:r>
+        <w:t xml:space="preserve"> (where n is the number of relations in the input dictionary</w:t>
+      </w:r>
+      <w:r>
+        <w:t>, or in the default</w:t>
+      </w:r>
+      <w:r>
+        <w:t>)</w:t>
+      </w:r>
+      <w:r>
+        <w:t xml:space="preserve"> that contains the </w:t>
+      </w:r>
+      <w:r>
+        <w:t>mutually entailed relation (i.e., reversal) for each relation in the input dictionary</w:t>
+      </w:r>
+      <w:r>
+        <w:t xml:space="preserve">. </w:t>
+      </w:r>
+      <w:r>
+        <w:t xml:space="preserve">For example, say we input a dictionary </w:t>
+      </w:r>
+      <w:r>
+        <w:rPr>
+          <w:i/>
+          <w:iCs/>
+        </w:rPr>
+        <w:t>relations</w:t>
+      </w:r>
+      <w:r>
+        <w:t xml:space="preserve"> = {</w:t>
+      </w:r>
+      <w:r>
+        <w:t>‘same’:</w:t>
+      </w:r>
+      <w:r>
+        <w:t xml:space="preserve"> 0</w:t>
+      </w:r>
+      <w:r>
+        <w:t xml:space="preserve">, ‘more than’: </w:t>
+      </w:r>
+      <w:r>
+        <w:t>1</w:t>
+      </w:r>
+      <w:r>
+        <w:t xml:space="preserve">, ‘less than’: </w:t>
+      </w:r>
+      <w:r>
+        <w:t>2</w:t>
+      </w:r>
+      <w:r>
+        <w:t xml:space="preserve">}, the resulting array </w:t>
+      </w:r>
+      <w:r>
+        <w:rPr>
+          <w:i/>
+          <w:iCs/>
+        </w:rPr>
+        <w:t>mutual</w:t>
+      </w:r>
+      <w:r>
+        <w:t xml:space="preserve"> </w:t>
+      </w:r>
+      <w:r>
+        <w:t xml:space="preserve">= </w:t>
+      </w:r>
+      <w:r>
+        <w:t>[</w:t>
+      </w:r>
+      <w:r>
+        <w:t>0, 2, 1]</w:t>
+      </w:r>
+      <w:r>
+        <w:t>.</w:t>
+      </w:r>
+      <w:r>
+        <w:t xml:space="preserve"> That is because the sameness relation is symmetrical, whereas the comparative relations are not.</w:t>
+      </w:r>
+      <w:r>
+        <w:t xml:space="preserve"> </w:t>
+      </w:r>
+      <w:r>
+        <w:t>The second output is a dictionary</w:t>
+      </w:r>
+      <w:r>
+        <w:t xml:space="preserve"> that contains four arrays, one for each order in which two relations can be combined (i.e., linear: A-B and B-C</w:t>
+      </w:r>
+      <w:r>
+        <w:t xml:space="preserve">; one-to-many: A-B and A-C; many-to-one: A-B and C-B; and reversed linear: </w:t>
+      </w:r>
+      <w:r>
+        <w:t xml:space="preserve">B-C and A-B). For symmetrical relations, the </w:t>
+      </w:r>
+      <w:r>
+        <w:t>resulting table will be identical in each order</w:t>
+      </w:r>
+      <w:r>
+        <w:t>, but for asymmetrical relations, different combinations will lead to different derivations.</w:t>
+      </w:r>
+      <w:r>
+        <w:t xml:space="preserve"> </w:t>
+      </w:r>
+      <w:r>
+        <w:t xml:space="preserve">For each order (dictionary key), the value </w:t>
+      </w:r>
+      <w:r>
+        <w:t xml:space="preserve">is an </w:t>
+      </w:r>
+      <w:r>
+        <w:rPr>
+          <w:i/>
+          <w:iCs/>
+        </w:rPr>
+        <w:t>n</w:t>
+      </w:r>
+      <w:r>
+        <w:t>-by-</w:t>
+      </w:r>
+      <w:r>
+        <w:rPr>
+          <w:i/>
+          <w:iCs/>
+        </w:rPr>
+        <w:t>n</w:t>
+      </w:r>
+      <w:r>
+        <w:t xml:space="preserve"> array (where </w:t>
+      </w:r>
+      <w:r>
+        <w:rPr>
+          <w:i/>
+          <w:iCs/>
+        </w:rPr>
+        <w:t>n</w:t>
+      </w:r>
+      <w:r>
+        <w:t xml:space="preserve"> is again the number of </w:t>
+      </w:r>
+      <w:r>
+        <w:t xml:space="preserve">input </w:t>
+      </w:r>
+      <w:r>
+        <w:t>relations)</w:t>
+      </w:r>
+      <w:r>
+        <w:t xml:space="preserve">, in which </w:t>
+      </w:r>
+      <w:r>
+        <w:t xml:space="preserve">the row- and column-indices correspond to those provided in the input, and </w:t>
+      </w:r>
+      <w:r>
+        <w:t>each</w:t>
+      </w:r>
+      <w:r>
+        <w:t xml:space="preserve"> cell in the array contain</w:t>
+      </w:r>
+      <w:r>
+        <w:t>s</w:t>
+      </w:r>
+      <w:r>
+        <w:t xml:space="preserve"> the ind</w:t>
+      </w:r>
+      <w:r>
+        <w:t>ex</w:t>
+      </w:r>
+      <w:r>
+        <w:t xml:space="preserve"> of the relation</w:t>
+      </w:r>
+      <w:r>
+        <w:t xml:space="preserve"> that can be derived </w:t>
+      </w:r>
+      <w:r>
+        <w:t xml:space="preserve">from that particular </w:t>
+      </w:r>
+      <w:r>
+        <w:t>combin</w:t>
+      </w:r>
+      <w:r>
+        <w:t>ation of relations (in a given order).</w:t>
       </w:r>
     </w:p>
     <w:p>
@@ -740,6 +1847,7 @@
         <w:pStyle w:val="APA7H3"/>
       </w:pPr>
       <w:r>
+        <w:lastRenderedPageBreak/>
         <w:t>Generate a Match-to-Sample Task.</w:t>
       </w:r>
     </w:p>
@@ -831,7 +1939,6 @@
         <w:pStyle w:val="APA7Body"/>
       </w:pPr>
       <w:r>
-        <w:lastRenderedPageBreak/>
         <w:t>Automatically and systematically vary parameters of task and generate virtually limitless trials.</w:t>
       </w:r>
     </w:p>
@@ -1028,6 +2135,7 @@
         <w:rPr>
           <w:b/>
         </w:rPr>
+        <w:lastRenderedPageBreak/>
         <w:t>Authors' contributions</w:t>
       </w:r>
       <w:r>
@@ -1158,7 +2266,6 @@
         <w:pStyle w:val="APA7H1"/>
       </w:pPr>
       <w:r>
-        <w:lastRenderedPageBreak/>
         <w:t>References</w:t>
       </w:r>
     </w:p>
@@ -1383,7 +2490,7 @@
       <w:pStyle w:val="Header"/>
     </w:pPr>
     <w:r>
-      <w:t>RELATIONAL NETWORK DERIVATION TABLES</w:t>
+      <w:t>RELATIONAL DERIVATION TABLES</w:t>
     </w:r>
     <w:r>
       <w:ptab w:relativeTo="margin" w:alignment="center" w:leader="none"/>

</xml_diff>

<commit_message>
Bug fixes, updates, streamlit app added
</commit_message>
<xml_diff>
--- a/Manuscript_BRM/Manuscript_OpenSourceRelationalNetworkDerivationVisualizationTaskGeneration.docx
+++ b/Manuscript_BRM/Manuscript_OpenSourceRelationalNetworkDerivationVisualizationTaskGeneration.docx
@@ -34,8 +34,8 @@
       <w:r>
         <w:rPr>
           <w:rStyle w:val="CommentReference"/>
-          <w:rFonts w:asciiTheme="minorHAnsi" w:eastAsiaTheme="minorHAnsi" w:hAnsiTheme="minorHAnsi" w:cstheme="minorBidi"/>
-          <w:b w:val="0"/>
+          <w:sz w:val="24"/>
+          <w:szCs w:val="36"/>
         </w:rPr>
         <w:commentReference w:id="0"/>
       </w:r>
@@ -56,8 +56,8 @@
       <w:r>
         <w:rPr>
           <w:rStyle w:val="CommentReference"/>
-          <w:rFonts w:asciiTheme="minorHAnsi" w:eastAsiaTheme="minorHAnsi" w:hAnsiTheme="minorHAnsi" w:cstheme="minorBidi"/>
-          <w:b w:val="0"/>
+          <w:sz w:val="24"/>
+          <w:szCs w:val="36"/>
         </w:rPr>
         <w:commentReference w:id="1"/>
       </w:r>
@@ -269,7 +269,7 @@
         <w:t xml:space="preserve"> agree that relational abilities </w:t>
       </w:r>
       <w:r>
-        <w:t xml:space="preserve">are a cornerstone of human cognition and intelligence. As a results, many different </w:t>
+        <w:t xml:space="preserve">are a cornerstone of human cognition and intelligence. As a result, many different </w:t>
       </w:r>
       <w:r>
         <w:t xml:space="preserve">procedures have been developed to probe relational abilities, and relational tasks </w:t>
@@ -359,13 +359,13 @@
         <w:t xml:space="preserve"> </w:t>
       </w:r>
       <w:r>
-        <w:t xml:space="preserve">facilitate research into </w:t>
-      </w:r>
-      <w:r>
-        <w:t xml:space="preserve">complex </w:t>
-      </w:r>
-      <w:r>
-        <w:t xml:space="preserve">relational reasoning. </w:t>
+        <w:t>facilitate relational reasoning</w:t>
+      </w:r>
+      <w:r>
+        <w:t xml:space="preserve"> research</w:t>
+      </w:r>
+      <w:r>
+        <w:t xml:space="preserve">. </w:t>
       </w:r>
       <w:r>
         <w:t xml:space="preserve">We provide </w:t>
@@ -675,271 +675,255 @@
         </w:rPr>
         <w:t xml:space="preserve">; </w:t>
       </w:r>
-      <w:proofErr w:type="spellStart"/>
       <w:r>
         <w:rPr>
           <w:szCs w:val="20"/>
         </w:rPr>
-        <w:t>Eisape</w:t>
-      </w:r>
-      <w:proofErr w:type="spellEnd"/>
+        <w:t>Eisape et al., 2024</w:t>
+      </w:r>
       <w:r>
         <w:rPr>
           <w:szCs w:val="20"/>
         </w:rPr>
-        <w:t xml:space="preserve"> et al., 2024</w:t>
+        <w:t xml:space="preserve">). </w:t>
       </w:r>
       <w:r>
         <w:rPr>
           <w:szCs w:val="20"/>
         </w:rPr>
-        <w:t xml:space="preserve">). </w:t>
+        <w:t>Some have been proposed to be</w:t>
       </w:r>
       <w:r>
         <w:rPr>
           <w:szCs w:val="20"/>
         </w:rPr>
-        <w:t>Some have been proposed to be</w:t>
+        <w:t xml:space="preserve"> </w:t>
       </w:r>
       <w:r>
         <w:rPr>
           <w:szCs w:val="20"/>
         </w:rPr>
+        <w:t>a proxy-measure of intelligence (e.g., Cassidy et al., 2011; Colbert et al., 2017; May et al., 2022), while others</w:t>
+      </w:r>
+      <w:r>
+        <w:rPr>
+          <w:szCs w:val="20"/>
+        </w:rPr>
+        <w:t xml:space="preserve"> are part of</w:t>
+      </w:r>
+      <w:r>
+        <w:rPr>
+          <w:szCs w:val="20"/>
+        </w:rPr>
+        <w:t xml:space="preserve"> many modern intelligence tests (</w:t>
+      </w:r>
+      <w:r>
+        <w:rPr>
+          <w:szCs w:val="20"/>
+        </w:rPr>
+        <w:t xml:space="preserve">i.e., tasks like matrix reasoning, verbal analogies, etc.; </w:t>
+      </w:r>
+      <w:r>
+        <w:rPr>
+          <w:szCs w:val="20"/>
+        </w:rPr>
+        <w:t xml:space="preserve">e.g., </w:t>
+      </w:r>
+      <w:r>
+        <w:t xml:space="preserve">Raven &amp; Raven, 2003; </w:t>
+      </w:r>
+      <w:r>
+        <w:rPr>
+          <w:lang w:val="en-GB"/>
+        </w:rPr>
+        <w:t>Kaufman, A. S., &amp; Lichtenberger, E. O.</w:t>
+      </w:r>
+      <w:r>
+        <w:rPr>
+          <w:lang w:val="en-GB"/>
+        </w:rPr>
+        <w:t xml:space="preserve">, </w:t>
+      </w:r>
+      <w:r>
+        <w:rPr>
+          <w:lang w:val="en-GB"/>
+        </w:rPr>
+        <w:t>2006</w:t>
+      </w:r>
+      <w:r>
+        <w:rPr>
+          <w:lang w:val="en-GB"/>
+        </w:rPr>
+        <w:t xml:space="preserve">; </w:t>
+      </w:r>
+      <w:r>
+        <w:t xml:space="preserve">Wechsler, 2008; </w:t>
+      </w:r>
+      <w:r>
+        <w:rPr>
+          <w:szCs w:val="20"/>
+        </w:rPr>
+        <w:t>Cassidy et al., 201</w:t>
+      </w:r>
+      <w:r>
+        <w:rPr>
+          <w:szCs w:val="20"/>
+        </w:rPr>
+        <w:t>1</w:t>
+      </w:r>
+      <w:r>
+        <w:rPr>
+          <w:szCs w:val="20"/>
+        </w:rPr>
+        <w:t>; Colbert et al., 2017).</w:t>
+      </w:r>
+      <w:r>
+        <w:rPr>
+          <w:szCs w:val="20"/>
+        </w:rPr>
         <w:t xml:space="preserve"> </w:t>
       </w:r>
       <w:r>
         <w:rPr>
           <w:szCs w:val="20"/>
         </w:rPr>
-        <w:t>a proxy-measure of intelligence (e.g., Cassidy et al., 2011; Colbert et al., 2017; May et al., 2022), while others</w:t>
+        <w:t xml:space="preserve">In the current </w:t>
       </w:r>
       <w:r>
         <w:rPr>
           <w:szCs w:val="20"/>
         </w:rPr>
-        <w:t xml:space="preserve"> are part of</w:t>
+        <w:t>paper we describe a set of tools that aim to facilitate future research on relational abilities in different systems</w:t>
       </w:r>
       <w:r>
         <w:rPr>
           <w:szCs w:val="20"/>
         </w:rPr>
-        <w:t xml:space="preserve"> many modern intelligence tests (</w:t>
+        <w:t xml:space="preserve"> (nonhuman animals, humans, artificial systems)</w:t>
       </w:r>
       <w:r>
         <w:rPr>
           <w:szCs w:val="20"/>
         </w:rPr>
-        <w:t xml:space="preserve">i.e., tasks like matrix reasoning, verbal analogies, etc.; </w:t>
-      </w:r>
-      <w:r>
-        <w:rPr>
-          <w:szCs w:val="20"/>
-        </w:rPr>
-        <w:t xml:space="preserve">e.g., </w:t>
-      </w:r>
-      <w:r>
-        <w:t xml:space="preserve">Raven &amp; Raven, 2003; </w:t>
-      </w:r>
-      <w:r>
-        <w:rPr>
-          <w:lang w:val="en-GB"/>
-        </w:rPr>
-        <w:t>Kaufman, A. S., &amp; Lichtenberger, E. O.</w:t>
-      </w:r>
-      <w:r>
-        <w:rPr>
-          <w:lang w:val="en-GB"/>
-        </w:rPr>
-        <w:t xml:space="preserve">, </w:t>
-      </w:r>
-      <w:r>
-        <w:rPr>
-          <w:lang w:val="en-GB"/>
-        </w:rPr>
-        <w:t>2006</w:t>
-      </w:r>
-      <w:r>
-        <w:rPr>
-          <w:lang w:val="en-GB"/>
-        </w:rPr>
+        <w:t xml:space="preserve">. </w:t>
+      </w:r>
+    </w:p>
+    <w:p>
+      <w:pPr>
+        <w:pStyle w:val="APA7Body"/>
+      </w:pPr>
+      <w:r>
+        <w:t>Human relational abilities are extremely generative, allowing individuals to flexibly adapt to novel environments</w:t>
+      </w:r>
+      <w:r>
+        <w:t xml:space="preserve">. Humans only need to learn about a handful of relations </w:t>
+      </w:r>
+      <w:r>
+        <w:t>to derive a myriad of new relations (</w:t>
+      </w:r>
+      <w:r>
+        <w:t xml:space="preserve">Hayes et al., 2001; </w:t>
+      </w:r>
+      <w:r>
+        <w:t xml:space="preserve">Hayes, 2012; </w:t>
+      </w:r>
+      <w:r>
+        <w:t>Smith &amp; Hayes, 2022</w:t>
+      </w:r>
+      <w:r>
         <w:t xml:space="preserve">; </w:t>
       </w:r>
       <w:r>
-        <w:t xml:space="preserve">Wechsler, 2008; </w:t>
-      </w:r>
-      <w:r>
-        <w:rPr>
-          <w:szCs w:val="20"/>
-        </w:rPr>
-        <w:t>Cassidy et al., 201</w:t>
-      </w:r>
-      <w:r>
-        <w:rPr>
-          <w:szCs w:val="20"/>
-        </w:rPr>
-        <w:t>1</w:t>
-      </w:r>
-      <w:r>
-        <w:rPr>
-          <w:szCs w:val="20"/>
-        </w:rPr>
-        <w:t>; Colbert et al., 2017).</w:t>
-      </w:r>
-      <w:r>
-        <w:rPr>
-          <w:szCs w:val="20"/>
-        </w:rPr>
+        <w:t>e.g., if one knows A is related to B and B is related to C, one can derive a relation between B and A, between C and A, between A and C, and between C and B</w:t>
+      </w:r>
+      <w:r>
+        <w:t>).</w:t>
+      </w:r>
+      <w:r>
+        <w:t xml:space="preserve"> This generativity quickly results in complex relational networks and behavioral repertoires</w:t>
+      </w:r>
+      <w:r>
+        <w:t xml:space="preserve">, which are often difficult to </w:t>
+      </w:r>
+      <w:r>
+        <w:t xml:space="preserve">describe, let alone </w:t>
+      </w:r>
+      <w:r>
+        <w:t>study in a controlled laboratory setting</w:t>
+      </w:r>
+      <w:r>
+        <w:t>.</w:t>
+      </w:r>
+      <w:r>
+        <w:t xml:space="preserve"> However, </w:t>
+      </w:r>
+      <w:r>
+        <w:t xml:space="preserve">if we want to explore the </w:t>
+      </w:r>
+      <w:r>
+        <w:t xml:space="preserve">full extent of relational abilities </w:t>
+      </w:r>
+      <w:r>
+        <w:t xml:space="preserve">and their implications for intelligence </w:t>
+      </w:r>
+      <w:r>
+        <w:t xml:space="preserve">in humans or other systems, it </w:t>
+      </w:r>
+      <w:r>
+        <w:t>is</w:t>
+      </w:r>
+      <w:r>
+        <w:t xml:space="preserve"> necessary to </w:t>
+      </w:r>
+      <w:r>
+        <w:t xml:space="preserve">have highly specified </w:t>
+      </w:r>
+      <w:r>
+        <w:t>task procedures (e.g., Cortes et al., 2021)</w:t>
+      </w:r>
+      <w:r>
+        <w:t xml:space="preserve"> as well as detailed analytic and descriptive models</w:t>
+      </w:r>
+      <w:r>
+        <w:t xml:space="preserve"> (Smith &amp; Hayes, 2022)</w:t>
+      </w:r>
+      <w:r>
+        <w:t>.</w:t>
+      </w:r>
+    </w:p>
+    <w:p>
+      <w:pPr>
+        <w:pStyle w:val="APA7Body"/>
+      </w:pPr>
+      <w:r>
+        <w:t xml:space="preserve">Another area where relational </w:t>
+      </w:r>
+      <w:r>
+        <w:t xml:space="preserve">abilities have become increasingly relevant is </w:t>
+      </w:r>
+      <w:r>
+        <w:t xml:space="preserve">artificial intelligence (AI) </w:t>
+      </w:r>
+      <w:r>
+        <w:t>research.</w:t>
+      </w:r>
+      <w:r>
+        <w:t xml:space="preserve"> AI researchers </w:t>
+      </w:r>
+      <w:r>
+        <w:t>have also assessed relational abilities of artificial systems as a cornerstone of general intelligence</w:t>
+      </w:r>
+      <w:r>
         <w:t xml:space="preserve"> </w:t>
       </w:r>
       <w:r>
-        <w:rPr>
-          <w:szCs w:val="20"/>
-        </w:rPr>
-        <w:t xml:space="preserve">In the current </w:t>
-      </w:r>
-      <w:r>
-        <w:rPr>
-          <w:szCs w:val="20"/>
-        </w:rPr>
-        <w:t>paper we describe a set of tools that aim to facilitate future research on relational abilities in different systems</w:t>
-      </w:r>
-      <w:r>
-        <w:rPr>
-          <w:szCs w:val="20"/>
-        </w:rPr>
-        <w:t xml:space="preserve"> (nonhuman animals, humans, artificial systems)</w:t>
-      </w:r>
-      <w:r>
-        <w:rPr>
-          <w:szCs w:val="20"/>
-        </w:rPr>
-        <w:t xml:space="preserve">. </w:t>
-      </w:r>
-    </w:p>
-    <w:p>
-      <w:pPr>
-        <w:pStyle w:val="APA7Body"/>
-      </w:pPr>
-      <w:r>
-        <w:t>Human relational abilities are extremely generative, allowing individuals to flexibly adapt to novel environments</w:t>
-      </w:r>
-      <w:r>
-        <w:t xml:space="preserve">. Humans only need to learn about a handful of relations </w:t>
-      </w:r>
-      <w:r>
-        <w:t>to derive a myriad of new relations (</w:t>
-      </w:r>
-      <w:r>
-        <w:t xml:space="preserve">Hayes et al., 2001; </w:t>
-      </w:r>
-      <w:r>
-        <w:t xml:space="preserve">Hayes, 2012; </w:t>
-      </w:r>
-      <w:r>
-        <w:t>Smith &amp; Hayes, 2022</w:t>
-      </w:r>
-      <w:r>
-        <w:t xml:space="preserve">; </w:t>
-      </w:r>
-      <w:r>
-        <w:t>e.g., if one knows A is related to B and B is related to C, one can derive a relation between B and A, between C and A, between A and C, and between C and B</w:t>
-      </w:r>
-      <w:r>
-        <w:t>).</w:t>
-      </w:r>
-      <w:r>
-        <w:t xml:space="preserve"> This generativity quickly results in complex relational networks and behavioral repertoires</w:t>
-      </w:r>
-      <w:r>
-        <w:t xml:space="preserve">, which are often difficult to </w:t>
-      </w:r>
-      <w:r>
-        <w:t xml:space="preserve">describe, let alone </w:t>
-      </w:r>
-      <w:r>
-        <w:t>study in a controlled laboratory setting</w:t>
-      </w:r>
-      <w:r>
-        <w:t>.</w:t>
-      </w:r>
-      <w:r>
-        <w:t xml:space="preserve"> However, </w:t>
-      </w:r>
-      <w:r>
-        <w:t xml:space="preserve">if we want to explore the </w:t>
-      </w:r>
-      <w:r>
-        <w:t xml:space="preserve">full extent of relational abilities </w:t>
-      </w:r>
-      <w:r>
-        <w:t xml:space="preserve">and their implications for intelligence </w:t>
-      </w:r>
-      <w:r>
-        <w:t xml:space="preserve">in humans or other systems, it </w:t>
-      </w:r>
-      <w:r>
-        <w:t>is</w:t>
-      </w:r>
-      <w:r>
-        <w:t xml:space="preserve"> necessary to </w:t>
-      </w:r>
-      <w:r>
-        <w:t xml:space="preserve">have highly specified </w:t>
-      </w:r>
-      <w:r>
-        <w:t>task procedures (e.g., Cortes et al., 2021)</w:t>
-      </w:r>
-      <w:r>
-        <w:t xml:space="preserve"> as well as detailed analytic and descriptive models</w:t>
-      </w:r>
-      <w:r>
-        <w:t xml:space="preserve"> (Smith &amp; Hayes, 2022)</w:t>
-      </w:r>
-      <w:r>
-        <w:t>.</w:t>
-      </w:r>
-    </w:p>
-    <w:p>
-      <w:pPr>
-        <w:pStyle w:val="APA7Body"/>
-      </w:pPr>
-      <w:r>
-        <w:t xml:space="preserve">Another area where relational </w:t>
-      </w:r>
-      <w:r>
-        <w:t xml:space="preserve">abilities have become increasingly relevant is </w:t>
-      </w:r>
-      <w:r>
-        <w:t xml:space="preserve">artificial intelligence (AI) </w:t>
-      </w:r>
-      <w:r>
-        <w:t>research.</w:t>
-      </w:r>
-      <w:r>
-        <w:t xml:space="preserve"> AI researchers </w:t>
-      </w:r>
-      <w:r>
-        <w:t>have also assessed relational abilities of artificial systems as a cornerstone of general intelligence</w:t>
-      </w:r>
-      <w:r>
-        <w:t xml:space="preserve"> </w:t>
-      </w:r>
-      <w:r>
         <w:t xml:space="preserve">(e.g., </w:t>
       </w:r>
       <w:r>
         <w:t>Hummel &amp; Holyoak, 2001</w:t>
       </w:r>
       <w:r>
-        <w:t xml:space="preserve">; </w:t>
-      </w:r>
-      <w:proofErr w:type="spellStart"/>
-      <w:r>
-        <w:t>Eisape</w:t>
-      </w:r>
-      <w:proofErr w:type="spellEnd"/>
-      <w:r>
-        <w:t xml:space="preserve"> et al., </w:t>
+        <w:t xml:space="preserve">; Eisape et al., </w:t>
       </w:r>
       <w:r>
         <w:lastRenderedPageBreak/>
@@ -949,272 +933,320 @@
         <w:t>)</w:t>
       </w:r>
       <w:r>
+        <w:t xml:space="preserve">. AI researchers also </w:t>
+      </w:r>
+      <w:r>
+        <w:t>increasingly</w:t>
+      </w:r>
+      <w:r>
+        <w:t xml:space="preserve"> draw upon insights </w:t>
+      </w:r>
+      <w:r>
+        <w:t xml:space="preserve">about human relational abilities </w:t>
+      </w:r>
+      <w:r>
+        <w:t>from other research traditions</w:t>
+      </w:r>
+      <w:r>
+        <w:t xml:space="preserve"> in developing </w:t>
+      </w:r>
+      <w:r>
+        <w:t>artificially intelligent systems</w:t>
+      </w:r>
+      <w:r>
+        <w:t xml:space="preserve"> </w:t>
+      </w:r>
+      <w:r>
+        <w:t>(</w:t>
+      </w:r>
+      <w:r>
+        <w:t xml:space="preserve">e.g., </w:t>
+      </w:r>
+      <w:r>
+        <w:t xml:space="preserve">Ninness &amp; Ninness, 2020; </w:t>
+      </w:r>
+      <w:r>
+        <w:t xml:space="preserve">Edwards et al., 2022; </w:t>
+      </w:r>
+      <w:r>
+        <w:t>Johansson, 2024)</w:t>
+      </w:r>
+      <w:r>
+        <w:t xml:space="preserve"> and </w:t>
+      </w:r>
+      <w:r>
+        <w:t>explore the implementation of relational networks in neural network models</w:t>
+      </w:r>
+      <w:r>
+        <w:t xml:space="preserve"> (e.g., Santoro et al., 2017; </w:t>
+      </w:r>
+      <w:r>
+        <w:t>Webb et al., 2024</w:t>
+      </w:r>
+      <w:r>
+        <w:t xml:space="preserve">; </w:t>
+      </w:r>
+      <w:r>
+        <w:t>Duran et al., 2026</w:t>
+      </w:r>
+      <w:r>
+        <w:t>)</w:t>
+      </w:r>
+      <w:r>
+        <w:t>.</w:t>
+      </w:r>
+      <w:r>
+        <w:t xml:space="preserve"> However, </w:t>
+      </w:r>
+      <w:r>
+        <w:t>the relational information they learn is often hidden in the black box-nature of their many hidden layers</w:t>
+      </w:r>
+      <w:r>
+        <w:t xml:space="preserve"> (Smith &amp; Hayes, 2022)</w:t>
+      </w:r>
+      <w:r>
+        <w:t xml:space="preserve">, an </w:t>
+      </w:r>
+      <w:r>
+        <w:t xml:space="preserve">important </w:t>
+      </w:r>
+      <w:r>
+        <w:t>area of focus for future research</w:t>
+      </w:r>
+      <w:r>
+        <w:t xml:space="preserve"> to address</w:t>
+      </w:r>
+      <w:r>
+        <w:t>.</w:t>
+      </w:r>
+    </w:p>
+    <w:p>
+      <w:pPr>
+        <w:pStyle w:val="APA7Body"/>
+      </w:pPr>
+      <w:r>
+        <w:t xml:space="preserve">This paper describes a set of open-source </w:t>
+      </w:r>
+      <w:r>
+        <w:t xml:space="preserve">tools that </w:t>
+      </w:r>
+      <w:r>
+        <w:t>aim to complement and facilitate research on relational abilities in different systems, be that nonhuman animals, humans or artificial systems. Inspired by the work of Allen (198</w:t>
+      </w:r>
+      <w:r>
+        <w:t xml:space="preserve">3), </w:t>
+      </w:r>
+      <w:r>
+        <w:t>who worked on</w:t>
+      </w:r>
+      <w:r>
+        <w:t xml:space="preserve"> the</w:t>
+      </w:r>
+      <w:r>
+        <w:t xml:space="preserve"> representation of temporal relation</w:t>
+      </w:r>
+      <w:r>
+        <w:t>s</w:t>
+      </w:r>
+      <w:r>
+        <w:t xml:space="preserve"> in computer systems</w:t>
+      </w:r>
+      <w:r>
         <w:t xml:space="preserve">, </w:t>
       </w:r>
       <w:r>
-        <w:t>increasingly</w:t>
-      </w:r>
-      <w:r>
-        <w:t xml:space="preserve"> draw upon insights from other research traditions</w:t>
-      </w:r>
-      <w:r>
-        <w:t xml:space="preserve"> in developing </w:t>
-      </w:r>
-      <w:r>
-        <w:t>artificially intelligent systems</w:t>
+        <w:t xml:space="preserve">we constructed </w:t>
+      </w:r>
+      <w:r>
+        <w:t xml:space="preserve">a set of </w:t>
+      </w:r>
+      <w:r>
+        <w:t xml:space="preserve">so-called </w:t>
+      </w:r>
+      <w:r>
+        <w:t>transitivity tables</w:t>
+      </w:r>
+      <w:r>
+        <w:t xml:space="preserve"> (also referred to as composition tables in logic)</w:t>
+      </w:r>
+      <w:r>
+        <w:t xml:space="preserve">. </w:t>
+      </w:r>
+      <w:r>
+        <w:t>As the name suggests, these</w:t>
+      </w:r>
+      <w:r>
+        <w:t xml:space="preserve"> tables describe </w:t>
+      </w:r>
+      <w:r>
+        <w:t xml:space="preserve">the transitivity of various combinations of relations (i.e., </w:t>
+      </w:r>
+      <w:r>
+        <w:t>if A is before B and B is before C, A is before C; and if A is opposite to B</w:t>
+      </w:r>
+      <w:r>
+        <w:t xml:space="preserve"> and B is opposite to C, A and C are the same). Where Allen’s tables contained only temporal relations</w:t>
+      </w:r>
+      <w:r>
+        <w:t xml:space="preserve"> (e.g., before, after, meets, starts)</w:t>
+      </w:r>
+      <w:r>
+        <w:t xml:space="preserve">, </w:t>
+      </w:r>
+      <w:r>
+        <w:t>the</w:t>
       </w:r>
       <w:r>
         <w:t xml:space="preserve"> </w:t>
       </w:r>
       <w:r>
-        <w:t>(</w:t>
-      </w:r>
-      <w:r>
-        <w:t xml:space="preserve">e.g., </w:t>
-      </w:r>
-      <w:r>
-        <w:t xml:space="preserve">Ninness &amp; Ninness, 2020; </w:t>
-      </w:r>
-      <w:r>
-        <w:t xml:space="preserve">Edwards et al., 2022; </w:t>
-      </w:r>
-      <w:r>
-        <w:t>Johansson, 2024)</w:t>
-      </w:r>
-      <w:r>
-        <w:t xml:space="preserve"> and </w:t>
-      </w:r>
-      <w:r>
-        <w:t>explore the implementation of relational networks in neural network models</w:t>
-      </w:r>
-      <w:r>
-        <w:t xml:space="preserve"> (e.g., Santoro et al., 2017; </w:t>
-      </w:r>
-      <w:r>
-        <w:t>Webb et al., 2024)</w:t>
+        <w:t>tables</w:t>
+      </w:r>
+      <w:r>
+        <w:t xml:space="preserve"> described here contain other relationships also (e.g., equivalence, difference, opposition, comparison, hierarchy, temporal, …)</w:t>
+      </w:r>
+      <w:r>
+        <w:t xml:space="preserve">. Furthermore, </w:t>
+      </w:r>
+      <w:r>
+        <w:t xml:space="preserve">we also included a table </w:t>
+      </w:r>
+      <w:r>
+        <w:t xml:space="preserve">representing the bidirectionality </w:t>
+      </w:r>
+      <w:r>
+        <w:t>of relations (e.g., if A is more than B, B is less than A</w:t>
+      </w:r>
+      <w:r>
+        <w:t>; therefore, the tables are hereafter referred to as relational derivation tables</w:t>
+      </w:r>
+      <w:r>
+        <w:t>). These</w:t>
+      </w:r>
+      <w:r>
+        <w:t xml:space="preserve"> tables can be used for </w:t>
+      </w:r>
+      <w:r>
+        <w:t xml:space="preserve">constructing algorithms capable of </w:t>
+      </w:r>
+      <w:r>
+        <w:t xml:space="preserve">automated reasoning </w:t>
+      </w:r>
+      <w:r>
+        <w:t>about relations, which can in turn be implemented i</w:t>
+      </w:r>
+      <w:r>
+        <w:t>n different applications. We describe three such applications here</w:t>
+      </w:r>
+      <w:r>
+        <w:t>, using automated relational derivation</w:t>
+      </w:r>
+      <w:r>
+        <w:t xml:space="preserve"> (</w:t>
+      </w:r>
+      <w:r>
+        <w:t xml:space="preserve">1) for visualizing relational networks; (2) </w:t>
+      </w:r>
+      <w:r>
+        <w:t>creating syllogistic reasoning</w:t>
+      </w:r>
+      <w:r>
+        <w:t xml:space="preserve"> problems</w:t>
+      </w:r>
+      <w:r>
+        <w:t xml:space="preserve">; and (3) </w:t>
+      </w:r>
+      <w:r>
+        <w:t>creating matching-to-sample procedures. We first describe the tables in more detail, before illustrating their use in these applications.</w:t>
+      </w:r>
+    </w:p>
+    <w:p>
+      <w:pPr>
+        <w:pStyle w:val="APA7H3"/>
+      </w:pPr>
+      <w:r>
+        <w:t>Relational Derivation Tables</w:t>
+      </w:r>
+    </w:p>
+    <w:p>
+      <w:pPr>
+        <w:pStyle w:val="APA7Body"/>
+      </w:pPr>
+      <w:r>
+        <w:t xml:space="preserve">Inspired by Allen’s (1983) </w:t>
+      </w:r>
+      <w:r>
+        <w:t xml:space="preserve">work on the representation of temporal relations in computer systems, we developed a set of relational derivation tables that can be used </w:t>
+      </w:r>
+      <w:r>
+        <w:t xml:space="preserve">to </w:t>
+      </w:r>
+      <w:r>
+        <w:t xml:space="preserve">automate reasoning about relations. </w:t>
+      </w:r>
+      <w:r>
+        <w:t xml:space="preserve">Such tools for automated reasoning about relations are not readily </w:t>
+      </w:r>
+      <w:r>
+        <w:lastRenderedPageBreak/>
+        <w:t>available to researchers</w:t>
+      </w:r>
+      <w:r>
+        <w:t xml:space="preserve"> (Smith &amp; Hayes, 2022)</w:t>
+      </w:r>
+      <w:r>
+        <w:t>, and where they are, they are often allow for only a limited number of relations</w:t>
+      </w:r>
+      <w:r>
+        <w:t xml:space="preserve">. </w:t>
+      </w:r>
+      <w:r>
+        <w:t xml:space="preserve">We expanded on </w:t>
+      </w:r>
+      <w:r>
+        <w:t>Allen’s idea and created relational derivation tables that include both the reversals</w:t>
+      </w:r>
+      <w:r>
+        <w:t xml:space="preserve"> [(as)symmetry]</w:t>
+      </w:r>
+      <w:r>
+        <w:t xml:space="preserve"> and transitivity of relations</w:t>
+      </w:r>
+      <w:r>
+        <w:t xml:space="preserve">, and include many other relations beyond temporal relations. </w:t>
+      </w:r>
+      <w:r>
+        <w:t>While other relations can be included, we chose to limit ourselves to this set of relations</w:t>
+      </w:r>
+      <w:r>
+        <w:t xml:space="preserve"> currently, as we believe it already provides </w:t>
+      </w:r>
+      <w:r>
+        <w:t xml:space="preserve">prototypical versions of the most studied relations in psychological research (e.g., Hayes et al., 2001; </w:t>
+      </w:r>
+      <w:r>
+        <w:t>Penn et al., 2008</w:t>
+      </w:r>
+      <w:r>
+        <w:t xml:space="preserve">; Colbert et al., 2020). </w:t>
+      </w:r>
+      <w:r>
+        <w:t xml:space="preserve">Below, we describe the different tables in more detail, before </w:t>
+      </w:r>
+      <w:r>
+        <w:t>providing a walkthrough of the scripts that can be used to produce them in Python.</w:t>
+      </w:r>
+      <w:r>
+        <w:t xml:space="preserve"> The tables and software tools are available as a python module on the Open Science Framework</w:t>
+      </w:r>
+      <w:r>
+        <w:rPr>
+          <w:rStyle w:val="FootnoteReference"/>
+        </w:rPr>
+        <w:footnoteReference w:id="1"/>
       </w:r>
       <w:r>
         <w:t>.</w:t>
-      </w:r>
-      <w:r>
-        <w:t xml:space="preserve"> However, </w:t>
-      </w:r>
-      <w:r>
-        <w:t>the relational information they learn is often hidden in the black box-nature of their many hidden layers</w:t>
-      </w:r>
-      <w:r>
-        <w:t xml:space="preserve"> (Smith &amp; Hayes, 2022)</w:t>
-      </w:r>
-      <w:r>
-        <w:t>, an area of focus for future research</w:t>
-      </w:r>
-      <w:r>
-        <w:t>.</w:t>
-      </w:r>
-    </w:p>
-    <w:p>
-      <w:pPr>
-        <w:pStyle w:val="APA7Body"/>
-      </w:pPr>
-      <w:r>
-        <w:t xml:space="preserve">This paper describes a set of open-source </w:t>
-      </w:r>
-      <w:r>
-        <w:t xml:space="preserve">tools that </w:t>
-      </w:r>
-      <w:r>
-        <w:t>aim to complement and facilitate research on relational abilities in different systems, be that nonhuman animals, humans or artificial systems. Inspired by the work of Allen (198</w:t>
-      </w:r>
-      <w:r>
-        <w:t xml:space="preserve">3), </w:t>
-      </w:r>
-      <w:r>
-        <w:t>who worked on representation of temporal relation</w:t>
-      </w:r>
-      <w:r>
-        <w:t>s</w:t>
-      </w:r>
-      <w:r>
-        <w:t xml:space="preserve"> in computer systems</w:t>
-      </w:r>
-      <w:r>
-        <w:t xml:space="preserve">, </w:t>
-      </w:r>
-      <w:r>
-        <w:t xml:space="preserve">we constructed </w:t>
-      </w:r>
-      <w:r>
-        <w:t xml:space="preserve">an set of </w:t>
-      </w:r>
-      <w:r>
-        <w:t xml:space="preserve">so-called </w:t>
-      </w:r>
-      <w:r>
-        <w:t>transitivity tables</w:t>
-      </w:r>
-      <w:r>
-        <w:t xml:space="preserve"> (also referred to as composition tables in logic)</w:t>
-      </w:r>
-      <w:r>
-        <w:t xml:space="preserve">. </w:t>
-      </w:r>
-      <w:r>
-        <w:t>As the name suggests, these</w:t>
-      </w:r>
-      <w:r>
-        <w:t xml:space="preserve"> tables describe </w:t>
-      </w:r>
-      <w:r>
-        <w:t xml:space="preserve">the transitivity of various combinations of relations (i.e., </w:t>
-      </w:r>
-      <w:r>
-        <w:t>if A is before B and B is before C, A is before C; and if A is opposite to B</w:t>
-      </w:r>
-      <w:r>
-        <w:t xml:space="preserve"> and B is opposite to C, A and C are the same). Where Allen’s tables contained only temporal relations</w:t>
-      </w:r>
-      <w:r>
-        <w:t xml:space="preserve"> (e.g., before, after, meets, starts)</w:t>
-      </w:r>
-      <w:r>
-        <w:t xml:space="preserve">, </w:t>
-      </w:r>
-      <w:r>
-        <w:t>the</w:t>
-      </w:r>
-      <w:r>
-        <w:t xml:space="preserve"> </w:t>
-      </w:r>
-      <w:r>
-        <w:t>tables</w:t>
-      </w:r>
-      <w:r>
-        <w:t xml:space="preserve"> described here contain other relationships also (e.g., equivalence, difference, opposition, comparison, hierarchy, temporal, …)</w:t>
-      </w:r>
-      <w:r>
-        <w:t xml:space="preserve">. Furthermore, </w:t>
-      </w:r>
-      <w:r>
-        <w:t>we also included a table for the reversal of relations (e.g., if A is more than B, B is less than A</w:t>
-      </w:r>
-      <w:r>
-        <w:t>; therefore, the tables are hereafter referred to as relational derivation tables</w:t>
-      </w:r>
-      <w:r>
-        <w:t>). These</w:t>
-      </w:r>
-      <w:r>
-        <w:t xml:space="preserve"> tables can be used for </w:t>
-      </w:r>
-      <w:r>
-        <w:t xml:space="preserve">constructing algorithms capable of </w:t>
-      </w:r>
-      <w:r>
-        <w:t xml:space="preserve">automated reasoning </w:t>
-      </w:r>
-      <w:r>
-        <w:t>about relations, which can in turn be implemented i</w:t>
-      </w:r>
-      <w:r>
-        <w:t>n different applications. We describe three such applications here</w:t>
-      </w:r>
-      <w:r>
-        <w:t>, using automated relational derivation</w:t>
-      </w:r>
-      <w:r>
-        <w:t xml:space="preserve"> (</w:t>
-      </w:r>
-      <w:r>
-        <w:t xml:space="preserve">1) for visualizing relational networks; (2) </w:t>
-      </w:r>
-      <w:r>
-        <w:t>creating syllogistic reasoning</w:t>
-      </w:r>
-      <w:r>
-        <w:t xml:space="preserve"> problems</w:t>
-      </w:r>
-      <w:r>
-        <w:t xml:space="preserve">; and (3) </w:t>
-      </w:r>
-      <w:r>
-        <w:t>creating matching-to-sample procedures. We first describe the tables in more detail, before illustrating their use in these applications.</w:t>
-      </w:r>
-    </w:p>
-    <w:p>
-      <w:pPr>
-        <w:pStyle w:val="APA7H3"/>
-      </w:pPr>
-      <w:r>
-        <w:t>Relational Derivation Tables</w:t>
-      </w:r>
-    </w:p>
-    <w:p>
-      <w:pPr>
-        <w:pStyle w:val="APA7Body"/>
-      </w:pPr>
-      <w:r>
-        <w:t xml:space="preserve">Inspired by Allen’s (1983) </w:t>
-      </w:r>
-      <w:r>
-        <w:t xml:space="preserve">work on the representation of temporal relations in computer systems, we developed a set of relational derivation tables that can be used </w:t>
-      </w:r>
-      <w:r>
-        <w:t xml:space="preserve">to </w:t>
-      </w:r>
-      <w:r>
-        <w:t xml:space="preserve">automate reasoning about relations. </w:t>
-      </w:r>
-      <w:r>
-        <w:t>Such tools for automated reasoning about relations are not readily available to researchers</w:t>
-      </w:r>
-      <w:r>
-        <w:t xml:space="preserve"> (Smith &amp; Hayes, 2022)</w:t>
-      </w:r>
-      <w:r>
-        <w:t xml:space="preserve">, and where they are, they are often allow for </w:t>
-      </w:r>
-      <w:r>
-        <w:lastRenderedPageBreak/>
-        <w:t>only a limited number of relations</w:t>
-      </w:r>
-      <w:r>
-        <w:t xml:space="preserve">. </w:t>
-      </w:r>
-      <w:r>
-        <w:t xml:space="preserve">We expanded on </w:t>
-      </w:r>
-      <w:r>
-        <w:t>Allen’s idea and created relational derivation tables that include both the reversals</w:t>
-      </w:r>
-      <w:r>
-        <w:t xml:space="preserve"> [(as)symmetry]</w:t>
-      </w:r>
-      <w:r>
-        <w:t xml:space="preserve"> and transitivity of relations</w:t>
-      </w:r>
-      <w:r>
-        <w:t xml:space="preserve">, and include many other relations beyond temporal relations. </w:t>
-      </w:r>
-      <w:r>
-        <w:t>While other relations can be included, we chose to limit ourselves to this set of relations</w:t>
-      </w:r>
-      <w:r>
-        <w:t xml:space="preserve"> currently, as we believe it already provides </w:t>
-      </w:r>
-      <w:r>
-        <w:t xml:space="preserve">prototypical versions of the most studied relations in psychological research (e.g., Hayes et al., 2001; </w:t>
-      </w:r>
-      <w:r>
-        <w:t>Penn et al., 2008</w:t>
-      </w:r>
-      <w:r>
-        <w:t xml:space="preserve">; Colbert et al., 2020). </w:t>
-      </w:r>
-      <w:r>
-        <w:t xml:space="preserve">Below, we describe the different tables in more detail, before </w:t>
-      </w:r>
-      <w:r>
-        <w:t>providing a walkthrough of the scripts that can be used to produce them in Python.</w:t>
       </w:r>
     </w:p>
     <w:p>
@@ -1232,7 +1264,13 @@
         <w:t xml:space="preserve">. </w:t>
       </w:r>
       <w:r>
-        <w:t>The mutual entailment table is illustrated in Figure 1. It contains many relations, from equivalence, difference</w:t>
+        <w:t xml:space="preserve">The mutual entailment table is illustrated in Figure 1. It </w:t>
+      </w:r>
+      <w:r>
+        <w:t xml:space="preserve">includes </w:t>
+      </w:r>
+      <w:r>
+        <w:t>equivalence, difference</w:t>
       </w:r>
       <w:r>
         <w:t xml:space="preserve"> and </w:t>
@@ -1241,168 +1279,226 @@
         <w:t>opposition</w:t>
       </w:r>
       <w:r>
-        <w:t xml:space="preserve"> relations </w:t>
-      </w:r>
-      <w:r>
-        <w:t>to</w:t>
+        <w:t xml:space="preserve">, </w:t>
+      </w:r>
+      <w:r>
+        <w:t>comparative</w:t>
+      </w:r>
+      <w:r>
+        <w:t xml:space="preserve"> relations (</w:t>
+      </w:r>
+      <w:r>
+        <w:t xml:space="preserve">e.g., </w:t>
+      </w:r>
+      <w:r>
+        <w:t>more than, less than), hierarchical relations (</w:t>
+      </w:r>
+      <w:r>
+        <w:t>contains, is part of) and</w:t>
+      </w:r>
+      <w:r>
+        <w:t xml:space="preserve"> temporal</w:t>
+      </w:r>
+      <w:r>
+        <w:t xml:space="preserve"> relations. </w:t>
+      </w:r>
+      <w:r>
+        <w:t>Equivalence</w:t>
       </w:r>
       <w:r>
         <w:t xml:space="preserve"> </w:t>
       </w:r>
       <w:r>
-        <w:t>comparative</w:t>
-      </w:r>
-      <w:r>
-        <w:t xml:space="preserve"> relations (more than, less than), hierarchical relations (</w:t>
-      </w:r>
-      <w:r>
-        <w:t>contains, is part of) and</w:t>
-      </w:r>
-      <w:r>
-        <w:t xml:space="preserve"> temporal</w:t>
-      </w:r>
-      <w:r>
-        <w:t xml:space="preserve"> relations. </w:t>
-      </w:r>
-      <w:r>
-        <w:t>Equivalence</w:t>
+        <w:t>relations are defined by symmetry (Sidman &amp; Tailby, 1982</w:t>
+      </w:r>
+      <w:r>
+        <w:t xml:space="preserve">; </w:t>
+      </w:r>
+      <w:r>
+        <w:t>if A is equivalent to B, B is equivalent to A</w:t>
+      </w:r>
+      <w:r>
+        <w:t xml:space="preserve">; </w:t>
+      </w:r>
+      <w:r>
+        <w:t xml:space="preserve">any </w:t>
+      </w:r>
+      <w:r>
+        <w:t xml:space="preserve">response to A in relation to B is </w:t>
+      </w:r>
+      <w:r>
+        <w:t xml:space="preserve">functionally </w:t>
+      </w:r>
+      <w:r>
+        <w:t xml:space="preserve">identical to </w:t>
+      </w:r>
+      <w:r>
+        <w:t>response to B in relation to A</w:t>
+      </w:r>
+      <w:r>
+        <w:t>)</w:t>
+      </w:r>
+      <w:r>
+        <w:t xml:space="preserve">. Some other relations, like difference and opposition are </w:t>
+      </w:r>
+      <w:r>
+        <w:t xml:space="preserve">also </w:t>
+      </w:r>
+      <w:r>
+        <w:t>symmetric</w:t>
+      </w:r>
+      <w:r>
+        <w:t>al</w:t>
       </w:r>
       <w:r>
         <w:t xml:space="preserve"> </w:t>
       </w:r>
       <w:r>
-        <w:t>relations are defined by symmetry (Sidman &amp; Tailby, 1982</w:t>
-      </w:r>
-      <w:r>
-        <w:t xml:space="preserve">; </w:t>
-      </w:r>
-      <w:r>
-        <w:t>if A is equivalent to B, B is equivalent to A</w:t>
-      </w:r>
-      <w:r>
-        <w:t xml:space="preserve">; </w:t>
-      </w:r>
-      <w:r>
-        <w:t xml:space="preserve">any </w:t>
-      </w:r>
-      <w:r>
-        <w:t xml:space="preserve">response to </w:t>
-      </w:r>
-      <w:proofErr w:type="spellStart"/>
-      <w:r>
-        <w:t>A</w:t>
-      </w:r>
-      <w:proofErr w:type="spellEnd"/>
-      <w:r>
-        <w:t xml:space="preserve"> in relation to B is </w:t>
-      </w:r>
-      <w:r>
-        <w:t xml:space="preserve">functionally </w:t>
-      </w:r>
-      <w:r>
-        <w:t xml:space="preserve">identical to </w:t>
-      </w:r>
-      <w:r>
-        <w:t>response to B in relation to A</w:t>
+        <w:t xml:space="preserve">(e.g., if A is different from B, B is different from A, and if A is opposite to B, B is opposite to A). </w:t>
+      </w:r>
+      <w:r>
+        <w:t>M</w:t>
+      </w:r>
+      <w:r>
+        <w:t>ost relations other than equivalence</w:t>
+      </w:r>
+      <w:r>
+        <w:t xml:space="preserve">, however, are not symmetrical. Instead, they </w:t>
+      </w:r>
+      <w:r>
+        <w:t>(</w:t>
+      </w:r>
+      <w:r>
+        <w:t>often</w:t>
       </w:r>
       <w:r>
         <w:t>)</w:t>
       </w:r>
       <w:r>
-        <w:t xml:space="preserve">. Some other relations, like difference and opposition are </w:t>
-      </w:r>
-      <w:r>
-        <w:t xml:space="preserve">also </w:t>
-      </w:r>
-      <w:r>
-        <w:t>symmetric</w:t>
-      </w:r>
-      <w:r>
-        <w:t>al</w:t>
+        <w:t xml:space="preserve"> form pairs of relations</w:t>
+      </w:r>
+      <w:r>
+        <w:t xml:space="preserve"> within which the mutually entailed response to one relation is the other relation</w:t>
+      </w:r>
+      <w:r>
+        <w:t xml:space="preserve"> (e.g., </w:t>
+      </w:r>
+      <w:r>
+        <w:t>comparative relations</w:t>
+      </w:r>
+      <w:r>
+        <w:t xml:space="preserve"> like</w:t>
+      </w:r>
+      <w:r>
+        <w:t xml:space="preserve"> A is more than B</w:t>
+      </w:r>
+      <w:r>
+        <w:t xml:space="preserve"> and </w:t>
+      </w:r>
+      <w:r>
+        <w:t>B is less than C</w:t>
+      </w:r>
+      <w:r>
+        <w:t>)</w:t>
+      </w:r>
+      <w:r>
+        <w:t>. O</w:t>
+      </w:r>
+      <w:r>
+        <w:t xml:space="preserve">ther examples include </w:t>
+      </w:r>
+      <w:r>
+        <w:t xml:space="preserve">the </w:t>
+      </w:r>
+      <w:r>
+        <w:t xml:space="preserve">temporal relations </w:t>
+      </w:r>
+      <w:r>
+        <w:t>‘</w:t>
+      </w:r>
+      <w:r>
+        <w:t>before</w:t>
+      </w:r>
+      <w:r>
+        <w:t>’</w:t>
+      </w:r>
+      <w:r>
+        <w:t xml:space="preserve"> and </w:t>
+      </w:r>
+      <w:r>
+        <w:t>‘</w:t>
+      </w:r>
+      <w:r>
+        <w:t>after</w:t>
+      </w:r>
+      <w:r>
+        <w:t>’ (as well as those described by Allen, 1983)</w:t>
       </w:r>
       <w:r>
         <w:t xml:space="preserve"> </w:t>
       </w:r>
       <w:r>
-        <w:t xml:space="preserve">(e.g., if A is different from B, B is different from A, and if A is opposite to B, B is opposite to A). </w:t>
-      </w:r>
-      <w:r>
-        <w:t>M</w:t>
-      </w:r>
-      <w:r>
-        <w:t>ost relations other than equivalence</w:t>
-      </w:r>
-      <w:r>
-        <w:t xml:space="preserve">, however, are not symmetrical. Instead, they </w:t>
-      </w:r>
-      <w:r>
-        <w:t>(</w:t>
-      </w:r>
-      <w:r>
-        <w:t>often</w:t>
+        <w:t>and</w:t>
+      </w:r>
+      <w:r>
+        <w:t xml:space="preserve"> </w:t>
+      </w:r>
+      <w:r>
+        <w:t xml:space="preserve">hierarchical relations </w:t>
+      </w:r>
+      <w:r>
+        <w:t xml:space="preserve">(e.g., </w:t>
+      </w:r>
+      <w:r>
+        <w:t>‘contains’ and ‘is part of’</w:t>
       </w:r>
       <w:r>
         <w:t>)</w:t>
       </w:r>
       <w:r>
-        <w:t xml:space="preserve"> form pairs of relations</w:t>
-      </w:r>
-      <w:r>
-        <w:t xml:space="preserve"> within which the mutually entailed response to one relation is the other relation </w:t>
-      </w:r>
-      <w:r>
-        <w:t>For instance</w:t>
-      </w:r>
-      <w:r>
-        <w:t>, for comparative relations</w:t>
-      </w:r>
-      <w:r>
-        <w:t>,</w:t>
-      </w:r>
-      <w:r>
-        <w:t xml:space="preserve"> if A is more than B, B is less than C</w:t>
-      </w:r>
-      <w:r>
-        <w:t>. O</w:t>
-      </w:r>
-      <w:r>
-        <w:t xml:space="preserve">ther examples include </w:t>
-      </w:r>
-      <w:r>
-        <w:t xml:space="preserve">the </w:t>
-      </w:r>
-      <w:r>
-        <w:t xml:space="preserve">temporal relations </w:t>
-      </w:r>
-      <w:r>
-        <w:t>‘</w:t>
-      </w:r>
-      <w:r>
-        <w:t>before</w:t>
-      </w:r>
-      <w:r>
-        <w:t>’</w:t>
-      </w:r>
-      <w:r>
-        <w:t xml:space="preserve"> and </w:t>
-      </w:r>
-      <w:r>
-        <w:t>‘</w:t>
-      </w:r>
-      <w:r>
-        <w:t>after</w:t>
-      </w:r>
-      <w:r>
-        <w:t>’ (as well as those described by Allen, 1983)</w:t>
-      </w:r>
-      <w:r>
-        <w:t xml:space="preserve"> or </w:t>
-      </w:r>
-      <w:r>
-        <w:t>hierarchical relations like ‘contains’ and ‘is part of’</w:t>
-      </w:r>
-      <w:r>
         <w:t xml:space="preserve">. </w:t>
+      </w:r>
+      <w:r>
+        <w:t xml:space="preserve"> </w:t>
+      </w:r>
+      <w:r>
+        <w:t xml:space="preserve">The tables illustrated only include a subset of all relations currently supported by the </w:t>
+      </w:r>
+      <w:r>
+        <w:t>software to keep the illustrations legible.</w:t>
+      </w:r>
+      <w:r>
+        <w:t xml:space="preserve"> These relations can be thought of as general categories of which many other relations are specific exemplars (i.e., they follow the exact same derivation patterns</w:t>
+      </w:r>
+      <w:r>
+        <w:t>; we elaborate on the implications of this observation in the Discussion section).</w:t>
+      </w:r>
+      <w:r>
+        <w:t xml:space="preserve"> An overview of all </w:t>
+      </w:r>
+      <w:r>
+        <w:t xml:space="preserve">relations </w:t>
+      </w:r>
+      <w:r>
+        <w:t xml:space="preserve">that </w:t>
+      </w:r>
+      <w:r>
+        <w:t xml:space="preserve">are </w:t>
+      </w:r>
+      <w:r>
+        <w:t>currently supported</w:t>
+      </w:r>
+      <w:r>
+        <w:t xml:space="preserve"> can be found in </w:t>
+      </w:r>
+      <w:r>
+        <w:rPr>
+          <w:color w:val="EE0000"/>
+        </w:rPr>
+        <w:t>Appendix A1</w:t>
+      </w:r>
+      <w:r>
+        <w:t>.</w:t>
       </w:r>
     </w:p>
     <w:p>
@@ -1414,6 +1510,7 @@
           <w:b/>
           <w:bCs w:val="0"/>
         </w:rPr>
+        <w:lastRenderedPageBreak/>
         <w:t>Combinatorial Entailment</w:t>
       </w:r>
       <w:r>
@@ -1428,13 +1525,13 @@
         <w:pStyle w:val="APA7Body"/>
       </w:pPr>
       <w:r>
-        <w:t xml:space="preserve">Step-by-step description of script for </w:t>
-      </w:r>
-      <w:r>
-        <w:t>d</w:t>
-      </w:r>
-      <w:r>
-        <w:t>erivation</w:t>
+        <w:t>Describe combinatorial entailment table</w:t>
+      </w:r>
+      <w:r>
+        <w:t>s</w:t>
+      </w:r>
+      <w:r>
+        <w:t xml:space="preserve"> superficially</w:t>
       </w:r>
       <w:r>
         <w:t>.</w:t>
@@ -1442,288 +1539,755 @@
       <w:r>
         <w:t xml:space="preserve"> </w:t>
       </w:r>
+    </w:p>
+    <w:p>
+      <w:pPr>
+        <w:pStyle w:val="APA7Body"/>
+      </w:pPr>
+      <w:r>
+        <w:t>A second set of tables describes the transitive property of relations</w:t>
+      </w:r>
+      <w:r>
+        <w:t xml:space="preserve"> (also referred to as </w:t>
+      </w:r>
+      <w:r>
+        <w:t>combinatorial entailment</w:t>
+      </w:r>
+      <w:r>
+        <w:t xml:space="preserve">): two relations that share </w:t>
+      </w:r>
+      <w:r>
+        <w:t>a common element afford the derivation of a novel relation between the non-shared elements (e.g.,</w:t>
+      </w:r>
+      <w:r>
+        <w:t xml:space="preserve"> if A is related to B and B is related to C, </w:t>
+      </w:r>
+      <w:r>
+        <w:t>then a relation between A and C can be derived)</w:t>
+      </w:r>
+      <w:r>
+        <w:t xml:space="preserve">. </w:t>
+      </w:r>
+      <w:r>
+        <w:t>Importantly, the particular way in which two relations are combined determines what relation</w:t>
+      </w:r>
+      <w:r>
+        <w:t>(</w:t>
+      </w:r>
+      <w:r>
+        <w:t>s</w:t>
+      </w:r>
+      <w:r>
+        <w:t>)</w:t>
+      </w:r>
+      <w:r>
+        <w:t xml:space="preserve"> can be derived.</w:t>
+      </w:r>
+      <w:r>
+        <w:t xml:space="preserve"> T</w:t>
+      </w:r>
+      <w:r>
+        <w:t xml:space="preserve">wo pairs of </w:t>
+      </w:r>
+      <w:r>
+        <w:t xml:space="preserve">related </w:t>
+      </w:r>
+      <w:r>
+        <w:t xml:space="preserve">stimuli can be combined in four ways: </w:t>
+      </w:r>
+    </w:p>
+    <w:p>
+      <w:pPr>
+        <w:pStyle w:val="APA7Body"/>
+        <w:numPr>
+          <w:ilvl w:val="0"/>
+          <w:numId w:val="12"/>
+        </w:numPr>
+      </w:pPr>
+      <w:r>
+        <w:t>linear combination</w:t>
+      </w:r>
+      <w:r>
+        <w:t xml:space="preserve"> - </w:t>
+      </w:r>
+      <w:r>
+        <w:t xml:space="preserve"> </w:t>
+      </w:r>
+      <w:r>
+        <w:t xml:space="preserve">A </w:t>
+      </w:r>
+      <w:r>
+        <w:t xml:space="preserve">x </w:t>
+      </w:r>
+      <w:r>
+        <w:t xml:space="preserve">B </w:t>
+      </w:r>
+      <w:r>
+        <w:t>and</w:t>
+      </w:r>
+      <w:r>
+        <w:t xml:space="preserve"> B </w:t>
+      </w:r>
+      <w:r>
+        <w:t xml:space="preserve">x </w:t>
+      </w:r>
+      <w:r>
+        <w:t xml:space="preserve">C </w:t>
+      </w:r>
+      <w:r>
+        <w:t xml:space="preserve">relation </w:t>
+      </w:r>
+      <w:r>
+        <w:t xml:space="preserve">afford derivation of </w:t>
+      </w:r>
+      <w:r>
+        <w:t xml:space="preserve">relation </w:t>
+      </w:r>
+      <w:r>
+        <w:t>A</w:t>
+      </w:r>
+      <w:r>
+        <w:t xml:space="preserve"> x </w:t>
+      </w:r>
+      <w:r>
+        <w:t>C</w:t>
+      </w:r>
+    </w:p>
+    <w:p>
+      <w:pPr>
+        <w:pStyle w:val="APA7Body"/>
+        <w:numPr>
+          <w:ilvl w:val="0"/>
+          <w:numId w:val="12"/>
+        </w:numPr>
+      </w:pPr>
+      <w:r>
+        <w:t>one-to-many combination</w:t>
+      </w:r>
+      <w:r>
+        <w:t xml:space="preserve"> – A x B and A x C relation afford derivation of B x C relation</w:t>
+      </w:r>
+    </w:p>
+    <w:p>
+      <w:pPr>
+        <w:pStyle w:val="APA7Body"/>
+        <w:numPr>
+          <w:ilvl w:val="0"/>
+          <w:numId w:val="12"/>
+        </w:numPr>
+      </w:pPr>
+      <w:r>
+        <w:t xml:space="preserve">many-to-one combination – A x B and C x B relation afford derivation of </w:t>
+      </w:r>
+      <w:r>
+        <w:t>A x C relation</w:t>
+      </w:r>
+    </w:p>
+    <w:p>
+      <w:pPr>
+        <w:pStyle w:val="APA7Body"/>
+        <w:numPr>
+          <w:ilvl w:val="0"/>
+          <w:numId w:val="12"/>
+        </w:numPr>
+      </w:pPr>
+      <w:r>
+        <w:t xml:space="preserve">reversed linear combination – B x A and C x B relation afford derivation of </w:t>
+      </w:r>
+      <w:r>
+        <w:t>A x C relation</w:t>
+      </w:r>
+    </w:p>
+    <w:p>
+      <w:pPr>
+        <w:pStyle w:val="APA7Body"/>
+      </w:pPr>
+      <w:r>
+        <w:t>As illustrated in Figure 1</w:t>
+      </w:r>
+      <w:r>
+        <w:t>, e</w:t>
+      </w:r>
+      <w:r>
+        <w:t xml:space="preserve">ach </w:t>
+      </w:r>
+      <w:r>
+        <w:t xml:space="preserve"> of these results in a distinct pattern of relational derivations</w:t>
+      </w:r>
+      <w:r>
+        <w:t>.</w:t>
+      </w:r>
+      <w:r>
+        <w:t xml:space="preserve"> Broadly speaking, the patterns of relational derivation are summarized by </w:t>
+      </w:r>
+      <w:r>
+        <w:t>the following rules:</w:t>
+      </w:r>
+    </w:p>
+    <w:p>
+      <w:pPr>
+        <w:pStyle w:val="APA7Body"/>
+        <w:numPr>
+          <w:ilvl w:val="0"/>
+          <w:numId w:val="14"/>
+        </w:numPr>
+      </w:pPr>
+      <w:r>
+        <w:t>Linear</w:t>
+      </w:r>
+      <w:r>
+        <w:t xml:space="preserve"> combination:</w:t>
+      </w:r>
+    </w:p>
+    <w:p>
+      <w:pPr>
+        <w:pStyle w:val="APA7Body"/>
+        <w:numPr>
+          <w:ilvl w:val="0"/>
+          <w:numId w:val="15"/>
+        </w:numPr>
+      </w:pPr>
+      <w:r>
+        <w:t xml:space="preserve">If two identical relations are combined, the derived relation is  also identical, except for </w:t>
+      </w:r>
+      <w:r>
+        <w:t xml:space="preserve">combinations of two </w:t>
+      </w:r>
+      <w:r>
+        <w:t>difference</w:t>
+      </w:r>
+      <w:r>
+        <w:t xml:space="preserve"> relations (no derivation possible) and combinations of two opposition relations (derive sameness relation)</w:t>
+      </w:r>
+    </w:p>
+    <w:p>
+      <w:pPr>
+        <w:pStyle w:val="APA7Body"/>
+        <w:numPr>
+          <w:ilvl w:val="0"/>
+          <w:numId w:val="15"/>
+        </w:numPr>
+      </w:pPr>
+      <w:r>
+        <w:t>If either relation is ‘equivalence’, the derived relation is the same as the second relation in the combination</w:t>
+      </w:r>
+    </w:p>
+    <w:p>
+      <w:pPr>
+        <w:pStyle w:val="APA7Body"/>
+        <w:numPr>
+          <w:ilvl w:val="0"/>
+          <w:numId w:val="15"/>
+        </w:numPr>
+      </w:pPr>
+      <w:r>
+        <w:t>All other combination of relations do not afford valid derivations</w:t>
+      </w:r>
+    </w:p>
+    <w:p>
+      <w:pPr>
+        <w:pStyle w:val="APA7Body"/>
+        <w:numPr>
+          <w:ilvl w:val="0"/>
+          <w:numId w:val="13"/>
+        </w:numPr>
+      </w:pPr>
+      <w:r>
+        <w:t>Reversed linear combination:</w:t>
+      </w:r>
+    </w:p>
+    <w:p>
+      <w:pPr>
+        <w:pStyle w:val="APA7Body"/>
+        <w:numPr>
+          <w:ilvl w:val="2"/>
+          <w:numId w:val="13"/>
+        </w:numPr>
+      </w:pPr>
+      <w:r>
+        <w:lastRenderedPageBreak/>
+        <w:t>Pattern for symmetrical relations (same, different, opposite) is identical to that for linear combination.</w:t>
+      </w:r>
+    </w:p>
+    <w:p>
+      <w:pPr>
+        <w:pStyle w:val="APA7Body"/>
+        <w:numPr>
+          <w:ilvl w:val="2"/>
+          <w:numId w:val="13"/>
+        </w:numPr>
+      </w:pPr>
+      <w:r>
+        <w:t>If two identical asymmetrical relations are combined</w:t>
+      </w:r>
+    </w:p>
+    <w:p>
+      <w:pPr>
+        <w:pStyle w:val="APA7Body"/>
+        <w:numPr>
+          <w:ilvl w:val="2"/>
+          <w:numId w:val="13"/>
+        </w:numPr>
+      </w:pPr>
+    </w:p>
+    <w:p>
+      <w:pPr>
+        <w:pStyle w:val="APA7Body"/>
+      </w:pPr>
+      <w:r>
+        <w:rPr>
+          <w:noProof/>
+        </w:rPr>
+        <w:drawing>
+          <wp:inline distT="0" distB="0" distL="0" distR="0" wp14:anchorId="6B1B2C3C" wp14:editId="2C9DB2F5">
+            <wp:extent cx="5943600" cy="4756785"/>
+            <wp:effectExtent l="0" t="0" r="0" b="5715"/>
+            <wp:docPr id="1391560114" name="Picture 1"/>
+            <wp:cNvGraphicFramePr>
+              <a:graphicFrameLocks xmlns:a="http://schemas.openxmlformats.org/drawingml/2006/main" noChangeAspect="1"/>
+            </wp:cNvGraphicFramePr>
+            <a:graphic xmlns:a="http://schemas.openxmlformats.org/drawingml/2006/main">
+              <a:graphicData uri="http://schemas.openxmlformats.org/drawingml/2006/picture">
+                <pic:pic xmlns:pic="http://schemas.openxmlformats.org/drawingml/2006/picture">
+                  <pic:nvPicPr>
+                    <pic:cNvPr id="0" name="Picture 1"/>
+                    <pic:cNvPicPr>
+                      <a:picLocks noChangeAspect="1" noChangeArrowheads="1"/>
+                    </pic:cNvPicPr>
+                  </pic:nvPicPr>
+                  <pic:blipFill>
+                    <a:blip r:embed="rId13" cstate="print">
+                      <a:extLst>
+                        <a:ext uri="{28A0092B-C50C-407E-A947-70E740481C1C}">
+                          <a14:useLocalDpi xmlns:a14="http://schemas.microsoft.com/office/drawing/2010/main" val="0"/>
+                        </a:ext>
+                      </a:extLst>
+                    </a:blip>
+                    <a:srcRect/>
+                    <a:stretch>
+                      <a:fillRect/>
+                    </a:stretch>
+                  </pic:blipFill>
+                  <pic:spPr bwMode="auto">
+                    <a:xfrm>
+                      <a:off x="0" y="0"/>
+                      <a:ext cx="5943600" cy="4756785"/>
+                    </a:xfrm>
+                    <a:prstGeom prst="rect">
+                      <a:avLst/>
+                    </a:prstGeom>
+                    <a:noFill/>
+                    <a:ln>
+                      <a:noFill/>
+                    </a:ln>
+                  </pic:spPr>
+                </pic:pic>
+              </a:graphicData>
+            </a:graphic>
+          </wp:inline>
+        </w:drawing>
+      </w:r>
+    </w:p>
+    <w:p>
+      <w:pPr>
+        <w:pStyle w:val="APA7Body"/>
+      </w:pPr>
+    </w:p>
+    <w:p>
+      <w:pPr>
+        <w:pStyle w:val="APA7Body"/>
+      </w:pPr>
+      <w:r>
+        <w:t>Linear combinations:</w:t>
+      </w:r>
+    </w:p>
+    <w:p>
+      <w:pPr>
+        <w:pStyle w:val="APA7Body"/>
+      </w:pPr>
+      <w:r>
+        <w:t xml:space="preserve">If </w:t>
+      </w:r>
+      <w:r>
+        <w:t xml:space="preserve">one of the relations is </w:t>
+      </w:r>
+      <w:r>
+        <w:t>equivalence</w:t>
+      </w:r>
+      <w:r>
+        <w:t xml:space="preserve">, </w:t>
+      </w:r>
+      <w:r>
+        <w:t>derived relation is the other relation</w:t>
+      </w:r>
+    </w:p>
+    <w:p>
+      <w:pPr>
+        <w:pStyle w:val="APA7Body"/>
+      </w:pPr>
+      <w:r>
+        <w:t xml:space="preserve">If </w:t>
+      </w:r>
+      <w:r>
+        <w:t>two identical relations are combined, two special cases:</w:t>
+      </w:r>
+    </w:p>
+    <w:p>
+      <w:pPr>
+        <w:pStyle w:val="APA7Body"/>
+        <w:numPr>
+          <w:ilvl w:val="0"/>
+          <w:numId w:val="10"/>
+        </w:numPr>
+      </w:pPr>
+      <w:r>
+        <w:t>Difference x difference -&gt; ill-defined (always)</w:t>
+      </w:r>
+    </w:p>
+    <w:p>
+      <w:pPr>
+        <w:pStyle w:val="APA7Body"/>
+        <w:numPr>
+          <w:ilvl w:val="0"/>
+          <w:numId w:val="10"/>
+        </w:numPr>
+      </w:pPr>
+      <w:r>
+        <w:lastRenderedPageBreak/>
+        <w:t>Opposite x Opposite -&gt; same</w:t>
+      </w:r>
+    </w:p>
+    <w:p>
+      <w:pPr>
+        <w:pStyle w:val="APA7Body"/>
+        <w:numPr>
+          <w:ilvl w:val="0"/>
+          <w:numId w:val="10"/>
+        </w:numPr>
+      </w:pPr>
+      <w:r>
+        <w:t xml:space="preserve">Other relations combined allow derivation of the same relation. </w:t>
+      </w:r>
+    </w:p>
+    <w:p>
+      <w:pPr>
+        <w:pStyle w:val="APA7Body"/>
+      </w:pPr>
+    </w:p>
+    <w:p>
+      <w:pPr>
+        <w:pStyle w:val="APA7Body"/>
+      </w:pPr>
+      <w:r>
+        <w:t>** Insert cool Figure 1 here **</w:t>
+      </w:r>
+    </w:p>
+    <w:p>
+      <w:pPr>
+        <w:pStyle w:val="APA7Body"/>
+      </w:pPr>
+    </w:p>
+    <w:p>
+      <w:pPr>
+        <w:pStyle w:val="APA7Body"/>
+      </w:pPr>
+      <w:commentRangeStart w:id="2"/>
+      <w:r>
+        <w:t>Step</w:t>
+      </w:r>
+      <w:commentRangeEnd w:id="2"/>
+      <w:r>
+        <w:rPr>
+          <w:rStyle w:val="CommentReference"/>
+          <w:sz w:val="24"/>
+          <w:szCs w:val="36"/>
+        </w:rPr>
+        <w:commentReference w:id="2"/>
+      </w:r>
+      <w:r>
+        <w:t>-by-step description of script for derivation.</w:t>
+      </w:r>
+    </w:p>
+    <w:p>
+      <w:pPr>
+        <w:pStyle w:val="APA7Body"/>
+      </w:pPr>
       <w:r>
         <w:t>T</w:t>
       </w:r>
       <w:r>
         <w:t xml:space="preserve">he </w:t>
       </w:r>
-      <w:proofErr w:type="spellStart"/>
+      <w:r>
+        <w:t>create</w:t>
+      </w:r>
       <w:r>
         <w:rPr>
           <w:i/>
           <w:iCs/>
         </w:rPr>
-        <w:t>DerivationTablesFromSourceRelations</w:t>
-      </w:r>
-      <w:proofErr w:type="spellEnd"/>
-      <w:r>
-        <w:t xml:space="preserve"> Python function</w:t>
-      </w:r>
-      <w:r>
-        <w:t xml:space="preserve"> </w:t>
-      </w:r>
-      <w:r>
-        <w:t>generate</w:t>
-      </w:r>
-      <w:r>
-        <w:t>s</w:t>
-      </w:r>
-      <w:r>
-        <w:t xml:space="preserve"> the relational derivation tables </w:t>
-      </w:r>
-      <w:r>
-        <w:t>(</w:t>
-      </w:r>
-      <w:r>
-        <w:t>in Python</w:t>
-      </w:r>
-      <w:r>
-        <w:t>)</w:t>
-      </w:r>
-      <w:r>
-        <w:t xml:space="preserve"> for a given set of source relations. </w:t>
-      </w:r>
-      <w:r>
-        <w:t xml:space="preserve">The function takes one optional </w:t>
-      </w:r>
-      <w:r>
-        <w:t>input argument, which allows u</w:t>
-      </w:r>
-      <w:r>
-        <w:t xml:space="preserve">sers </w:t>
-      </w:r>
-      <w:r>
-        <w:t xml:space="preserve">to </w:t>
-      </w:r>
-      <w:r>
-        <w:t>specify the relations for which they want to create the tables</w:t>
-      </w:r>
-      <w:r>
-        <w:t>. This input argument</w:t>
-      </w:r>
-      <w:r>
-        <w:t xml:space="preserve"> (named</w:t>
-      </w:r>
-      <w:r>
-        <w:t xml:space="preserve"> </w:t>
+        <w:t>DerivationTables</w:t>
       </w:r>
       <w:r>
         <w:rPr>
           <w:i/>
           <w:iCs/>
         </w:rPr>
-        <w:t>relations</w:t>
+        <w:t>.py</w:t>
+      </w:r>
+      <w:r>
+        <w:t xml:space="preserve"> Python function</w:t>
+      </w:r>
+      <w:r>
+        <w:t xml:space="preserve"> </w:t>
+      </w:r>
+      <w:r>
+        <w:t>generate</w:t>
+      </w:r>
+      <w:r>
+        <w:t>s</w:t>
+      </w:r>
+      <w:r>
+        <w:t xml:space="preserve"> the relational derivation tables </w:t>
+      </w:r>
+      <w:r>
+        <w:t>(</w:t>
+      </w:r>
+      <w:r>
+        <w:t>in Python</w:t>
+      </w:r>
+      <w:r>
+        <w:t>)</w:t>
+      </w:r>
+      <w:r>
+        <w:t xml:space="preserve"> for a given set of source relations. </w:t>
+      </w:r>
+      <w:r>
+        <w:t xml:space="preserve">The function takes one optional </w:t>
+      </w:r>
+      <w:r>
+        <w:t>input argument, which allows u</w:t>
+      </w:r>
+      <w:r>
+        <w:t xml:space="preserve">sers </w:t>
+      </w:r>
+      <w:r>
+        <w:t xml:space="preserve">to </w:t>
+      </w:r>
+      <w:r>
+        <w:t>specify the relations for which they want to create the tables</w:t>
+      </w:r>
+      <w:r>
+        <w:t>. This input argument</w:t>
+      </w:r>
+      <w:r>
+        <w:t xml:space="preserve"> (named</w:t>
+      </w:r>
+      <w:r>
+        <w:t xml:space="preserve"> </w:t>
       </w:r>
       <w:r>
         <w:rPr>
           <w:i/>
           <w:iCs/>
         </w:rPr>
-        <w:t>)</w:t>
-      </w:r>
-      <w:r>
-        <w:t xml:space="preserve"> should be </w:t>
-      </w:r>
-      <w:r>
-        <w:t>a Python dict</w:t>
-      </w:r>
-      <w:r>
-        <w:t>ionary</w:t>
-      </w:r>
-      <w:r>
-        <w:t xml:space="preserve"> in which the keys are the relation labels and the values are the ind</w:t>
-      </w:r>
-      <w:r>
-        <w:t>ices</w:t>
-      </w:r>
-      <w:r>
-        <w:t xml:space="preserve"> those relations will take in the </w:t>
-      </w:r>
-      <w:r>
-        <w:t xml:space="preserve">relational derivation </w:t>
-      </w:r>
-      <w:r>
-        <w:t>tables</w:t>
-      </w:r>
-      <w:r>
-        <w:t xml:space="preserve"> (note that Python uses zero-based indexing, and therefore, the values in the list should also </w:t>
-      </w:r>
-      <w:r>
-        <w:lastRenderedPageBreak/>
-        <w:t>start from zero)</w:t>
-      </w:r>
-      <w:r>
-        <w:t>.</w:t>
-      </w:r>
-      <w:r>
-        <w:t xml:space="preserve"> As noted, this is an optional </w:t>
-      </w:r>
-      <w:r>
-        <w:t xml:space="preserve">input </w:t>
-      </w:r>
-      <w:r>
-        <w:t>argument</w:t>
-      </w:r>
-      <w:r>
-        <w:t>:</w:t>
-      </w:r>
-      <w:r>
-        <w:t xml:space="preserve"> If no input is provided, the function </w:t>
-      </w:r>
-      <w:r>
-        <w:t>will generate the tables for a</w:t>
-      </w:r>
-      <w:r>
-        <w:t xml:space="preserve"> default set of relations</w:t>
-      </w:r>
-      <w:r>
-        <w:t xml:space="preserve"> (i.e., same, different, opposite, more than, less than, contains, is part of, before and after)</w:t>
-      </w:r>
-      <w:r>
-        <w:t>.</w:t>
-      </w:r>
-      <w:r>
-        <w:t xml:space="preserve"> </w:t>
-      </w:r>
-      <w:r>
-        <w:t>The function outputs two variables</w:t>
-      </w:r>
-      <w:r>
-        <w:t xml:space="preserve">. The first, named </w:t>
+        <w:t>relations</w:t>
       </w:r>
       <w:r>
         <w:rPr>
           <w:i/>
           <w:iCs/>
         </w:rPr>
-        <w:t>mutual</w:t>
-      </w:r>
-      <w:r>
-        <w:t xml:space="preserve">, is a </w:t>
-      </w:r>
-      <w:r>
-        <w:t>1-by-n</w:t>
-      </w:r>
-      <w:r>
-        <w:t xml:space="preserve"> array</w:t>
-      </w:r>
-      <w:r>
-        <w:t xml:space="preserve"> (where n is the number of relations in the input dictionary</w:t>
-      </w:r>
-      <w:r>
-        <w:t>, or in the default</w:t>
-      </w:r>
-      <w:r>
         <w:t>)</w:t>
       </w:r>
       <w:r>
-        <w:t xml:space="preserve"> that contains the </w:t>
-      </w:r>
-      <w:r>
-        <w:t>mutually entailed relation (i.e., reversal) for each relation in the input dictionary</w:t>
-      </w:r>
-      <w:r>
-        <w:t xml:space="preserve">. </w:t>
-      </w:r>
-      <w:r>
-        <w:t xml:space="preserve">For example, say we input a dictionary </w:t>
+        <w:t xml:space="preserve"> should be </w:t>
+      </w:r>
+      <w:r>
+        <w:t>a Python dict</w:t>
+      </w:r>
+      <w:r>
+        <w:t>ionary</w:t>
+      </w:r>
+      <w:r>
+        <w:t xml:space="preserve"> in which the keys are the relation labels and the values are the ind</w:t>
+      </w:r>
+      <w:r>
+        <w:t>ices</w:t>
+      </w:r>
+      <w:r>
+        <w:t xml:space="preserve"> those relations will take in the </w:t>
+      </w:r>
+      <w:r>
+        <w:t xml:space="preserve">relational derivation </w:t>
+      </w:r>
+      <w:r>
+        <w:t>tables</w:t>
+      </w:r>
+      <w:r>
+        <w:t xml:space="preserve"> (note that Python uses zero-based indexing, and therefore, the values in the list should also start from zero)</w:t>
+      </w:r>
+      <w:r>
+        <w:t>.</w:t>
+      </w:r>
+      <w:r>
+        <w:t xml:space="preserve"> As noted, this is an optional </w:t>
+      </w:r>
+      <w:r>
+        <w:t xml:space="preserve">input </w:t>
+      </w:r>
+      <w:r>
+        <w:t>argument</w:t>
+      </w:r>
+      <w:r>
+        <w:t>:</w:t>
+      </w:r>
+      <w:r>
+        <w:t xml:space="preserve"> If no input is provided, the function </w:t>
+      </w:r>
+      <w:r>
+        <w:t>will generate the tables for a</w:t>
+      </w:r>
+      <w:r>
+        <w:t xml:space="preserve"> default set of relations</w:t>
+      </w:r>
+      <w:r>
+        <w:t xml:space="preserve"> (i.e., same, different, opposite, more than, less than, contains, is part of, before and after)</w:t>
+      </w:r>
+      <w:r>
+        <w:t>.</w:t>
+      </w:r>
+      <w:r>
+        <w:t xml:space="preserve"> </w:t>
+      </w:r>
+      <w:r>
+        <w:t>The function outputs two variables</w:t>
+      </w:r>
+      <w:r>
+        <w:t xml:space="preserve">. The first, named </w:t>
       </w:r>
       <w:r>
         <w:rPr>
           <w:i/>
           <w:iCs/>
         </w:rPr>
-        <w:t>relations</w:t>
-      </w:r>
-      <w:r>
-        <w:t xml:space="preserve"> = {</w:t>
-      </w:r>
-      <w:r>
-        <w:t>‘same’:</w:t>
-      </w:r>
-      <w:r>
-        <w:t xml:space="preserve"> 0</w:t>
-      </w:r>
-      <w:r>
-        <w:t xml:space="preserve">, ‘more than’: </w:t>
-      </w:r>
-      <w:r>
-        <w:t>1</w:t>
-      </w:r>
-      <w:r>
-        <w:t xml:space="preserve">, ‘less than’: </w:t>
-      </w:r>
-      <w:r>
-        <w:t>2</w:t>
-      </w:r>
-      <w:r>
-        <w:t xml:space="preserve">}, the resulting array </w:t>
+        <w:t>mutual</w:t>
+      </w:r>
+      <w:r>
+        <w:t xml:space="preserve">, is a </w:t>
+      </w:r>
+      <w:r>
+        <w:t>1-by-n</w:t>
+      </w:r>
+      <w:r>
+        <w:t xml:space="preserve"> array</w:t>
+      </w:r>
+      <w:r>
+        <w:t xml:space="preserve"> (where n is the number of relations in the input dictionary</w:t>
+      </w:r>
+      <w:r>
+        <w:t>, or in the default</w:t>
+      </w:r>
+      <w:r>
+        <w:t>)</w:t>
+      </w:r>
+      <w:r>
+        <w:t xml:space="preserve"> that contains the </w:t>
+      </w:r>
+      <w:r>
+        <w:t>mutually entailed relation (i.e., reversal) for each relation in the input dictionary</w:t>
+      </w:r>
+      <w:r>
+        <w:t xml:space="preserve">. </w:t>
+      </w:r>
+      <w:r>
+        <w:t xml:space="preserve">For example, say we input a dictionary </w:t>
       </w:r>
       <w:r>
         <w:rPr>
           <w:i/>
           <w:iCs/>
         </w:rPr>
-        <w:t>mutual</w:t>
-      </w:r>
-      <w:r>
-        <w:t xml:space="preserve"> </w:t>
-      </w:r>
-      <w:r>
-        <w:t xml:space="preserve">= </w:t>
-      </w:r>
-      <w:r>
-        <w:t>[</w:t>
-      </w:r>
-      <w:r>
-        <w:t>0, 2, 1]</w:t>
-      </w:r>
-      <w:r>
-        <w:t>.</w:t>
-      </w:r>
-      <w:r>
-        <w:t xml:space="preserve"> That is because the sameness relation is symmetrical, whereas the comparative relations are not.</w:t>
-      </w:r>
-      <w:r>
-        <w:t xml:space="preserve"> </w:t>
-      </w:r>
-      <w:r>
-        <w:t>The second output is a dictionary</w:t>
-      </w:r>
-      <w:r>
-        <w:t xml:space="preserve"> that contains four arrays, one for each order in which two relations can be combined (i.e., linear: A-B and B-C</w:t>
-      </w:r>
-      <w:r>
-        <w:t xml:space="preserve">; one-to-many: A-B and A-C; many-to-one: A-B and C-B; and reversed linear: </w:t>
-      </w:r>
-      <w:r>
-        <w:t xml:space="preserve">B-C and A-B). For symmetrical relations, the </w:t>
-      </w:r>
-      <w:r>
-        <w:t>resulting table will be identical in each order</w:t>
-      </w:r>
-      <w:r>
-        <w:t>, but for asymmetrical relations, different combinations will lead to different derivations.</w:t>
-      </w:r>
-      <w:r>
-        <w:t xml:space="preserve"> </w:t>
-      </w:r>
-      <w:r>
-        <w:t xml:space="preserve">For each order (dictionary key), the value </w:t>
-      </w:r>
-      <w:r>
-        <w:t xml:space="preserve">is an </w:t>
+        <w:t>relations</w:t>
+      </w:r>
+      <w:r>
+        <w:t xml:space="preserve"> = {</w:t>
+      </w:r>
+      <w:r>
+        <w:t>‘same’:</w:t>
+      </w:r>
+      <w:r>
+        <w:t xml:space="preserve"> 0</w:t>
+      </w:r>
+      <w:r>
+        <w:t xml:space="preserve">, ‘more than’: </w:t>
+      </w:r>
+      <w:r>
+        <w:t>1</w:t>
+      </w:r>
+      <w:r>
+        <w:t xml:space="preserve">, ‘less than’: </w:t>
+      </w:r>
+      <w:r>
+        <w:t>2</w:t>
+      </w:r>
+      <w:r>
+        <w:t xml:space="preserve">}, the resulting array </w:t>
       </w:r>
       <w:r>
         <w:rPr>
           <w:i/>
           <w:iCs/>
         </w:rPr>
-        <w:t>n</w:t>
-      </w:r>
-      <w:r>
-        <w:t>-by-</w:t>
+        <w:t>mutual</w:t>
+      </w:r>
+      <w:r>
+        <w:t xml:space="preserve"> </w:t>
+      </w:r>
+      <w:r>
+        <w:t xml:space="preserve">= </w:t>
+      </w:r>
+      <w:r>
+        <w:t>[</w:t>
+      </w:r>
+      <w:r>
+        <w:t>0, 2, 1]</w:t>
+      </w:r>
+      <w:r>
+        <w:t>.</w:t>
+      </w:r>
+      <w:r>
+        <w:t xml:space="preserve"> That is because the sameness relation is symmetrical, whereas the comparative relations are not.</w:t>
+      </w:r>
+      <w:r>
+        <w:t xml:space="preserve"> </w:t>
+      </w:r>
+      <w:r>
+        <w:t>The second output is a dictionary</w:t>
+      </w:r>
+      <w:r>
+        <w:t xml:space="preserve"> that contains four arrays, one for each order in which two relations can be combined (i.e., linear: A-B and B-C</w:t>
+      </w:r>
+      <w:r>
+        <w:t xml:space="preserve">; one-to-many: A-B and A-C; many-to-one: A-B and C-B; and reversed linear: </w:t>
+      </w:r>
+      <w:r>
+        <w:t xml:space="preserve">B-C and A-B). For symmetrical relations, the </w:t>
+      </w:r>
+      <w:r>
+        <w:t>resulting table will be identical in each order</w:t>
+      </w:r>
+      <w:r>
+        <w:t>, but for asymmetrical relations, different combinations will lead to different derivations.</w:t>
+      </w:r>
+      <w:r>
+        <w:t xml:space="preserve"> </w:t>
+      </w:r>
+      <w:r>
+        <w:t xml:space="preserve">For each order (dictionary key), the value </w:t>
+      </w:r>
+      <w:r>
+        <w:t xml:space="preserve">is an </w:t>
       </w:r>
       <w:r>
         <w:rPr>
@@ -1733,7 +2297,7 @@
         <w:t>n</w:t>
       </w:r>
       <w:r>
-        <w:t xml:space="preserve"> array (where </w:t>
+        <w:t>-by-</w:t>
       </w:r>
       <w:r>
         <w:rPr>
@@ -1743,6 +2307,16 @@
         <w:t>n</w:t>
       </w:r>
       <w:r>
+        <w:t xml:space="preserve"> array (where </w:t>
+      </w:r>
+      <w:r>
+        <w:rPr>
+          <w:i/>
+          <w:iCs/>
+        </w:rPr>
+        <w:t>n</w:t>
+      </w:r>
+      <w:r>
         <w:t xml:space="preserve"> is again the number of </w:t>
       </w:r>
       <w:r>
@@ -1755,7 +2329,11 @@
         <w:t xml:space="preserve">, in which </w:t>
       </w:r>
       <w:r>
-        <w:t xml:space="preserve">the row- and column-indices correspond to those provided in the input, and </w:t>
+        <w:t xml:space="preserve">the row- and column-indices correspond to those provided </w:t>
+      </w:r>
+      <w:r>
+        <w:lastRenderedPageBreak/>
+        <w:t xml:space="preserve">in the input, and </w:t>
       </w:r>
       <w:r>
         <w:t>each</w:t>
@@ -1798,10 +2376,107 @@
     </w:p>
     <w:p>
       <w:pPr>
+        <w:pStyle w:val="APA7Body"/>
+        <w:numPr>
+          <w:ilvl w:val="0"/>
+          <w:numId w:val="9"/>
+        </w:numPr>
+      </w:pPr>
+      <w:r>
+        <w:t xml:space="preserve">Follow order of walkthrough </w:t>
+      </w:r>
+      <w:r>
+        <w:t>notebook</w:t>
+      </w:r>
+    </w:p>
+    <w:p>
+      <w:pPr>
+        <w:pStyle w:val="APA7Body"/>
+        <w:numPr>
+          <w:ilvl w:val="0"/>
+          <w:numId w:val="9"/>
+        </w:numPr>
+      </w:pPr>
+      <w:r>
+        <w:t>One or two examples of each functionality</w:t>
+      </w:r>
+    </w:p>
+    <w:p>
+      <w:pPr>
         <w:pStyle w:val="APA7H3"/>
       </w:pPr>
       <w:r>
-        <w:t>Visualizing Relational Networks.</w:t>
+        <w:t>Creating Custom Derivation Tables</w:t>
+      </w:r>
+    </w:p>
+    <w:p>
+      <w:pPr>
+        <w:pStyle w:val="APA7Body"/>
+        <w:numPr>
+          <w:ilvl w:val="0"/>
+          <w:numId w:val="8"/>
+        </w:numPr>
+      </w:pPr>
+      <w:r>
+        <w:t>Describe function to create derivation tables</w:t>
+      </w:r>
+    </w:p>
+    <w:p>
+      <w:pPr>
+        <w:pStyle w:val="APA7Body"/>
+        <w:numPr>
+          <w:ilvl w:val="0"/>
+          <w:numId w:val="8"/>
+        </w:numPr>
+      </w:pPr>
+      <w:r>
+        <w:t>Redundancy of relations here or above?</w:t>
+      </w:r>
+      <w:r>
+        <w:t xml:space="preserve"> Or both: reason for limiting tables to x relations for now; </w:t>
+      </w:r>
+      <w:r>
+        <w:t>also helps explain flexibility of functino</w:t>
+      </w:r>
+    </w:p>
+    <w:p>
+      <w:pPr>
+        <w:pStyle w:val="APA7H3"/>
+      </w:pPr>
+      <w:r>
+        <w:t>Automated Relational Derivation</w:t>
+      </w:r>
+    </w:p>
+    <w:p>
+      <w:pPr>
+        <w:pStyle w:val="APA7Body"/>
+        <w:numPr>
+          <w:ilvl w:val="0"/>
+          <w:numId w:val="8"/>
+        </w:numPr>
+      </w:pPr>
+      <w:r>
+        <w:t>Presets</w:t>
+      </w:r>
+    </w:p>
+    <w:p>
+      <w:pPr>
+        <w:pStyle w:val="APA7Body"/>
+        <w:numPr>
+          <w:ilvl w:val="0"/>
+          <w:numId w:val="8"/>
+        </w:numPr>
+      </w:pPr>
+      <w:r>
+        <w:t>Custom, user-defined networks</w:t>
+      </w:r>
+    </w:p>
+    <w:p>
+      <w:pPr>
+        <w:pStyle w:val="APA7H3"/>
+      </w:pPr>
+      <w:r>
+        <w:t>Visualizing Relational Networks</w:t>
       </w:r>
     </w:p>
     <w:p>
@@ -1847,7 +2522,6 @@
         <w:pStyle w:val="APA7H3"/>
       </w:pPr>
       <w:r>
-        <w:lastRenderedPageBreak/>
         <w:t>Generate a Match-to-Sample Task.</w:t>
       </w:r>
     </w:p>
@@ -1875,6 +2549,7 @@
         </w:numPr>
       </w:pPr>
       <w:r>
+        <w:lastRenderedPageBreak/>
         <w:t>Input parameters</w:t>
       </w:r>
     </w:p>
@@ -1901,13 +2576,8 @@
       <w:r>
         <w:t xml:space="preserve">,  </w:t>
       </w:r>
-      <w:proofErr w:type="spellStart"/>
-      <w:r>
-        <w:t>steele</w:t>
-      </w:r>
-      <w:proofErr w:type="spellEnd"/>
-      <w:r>
-        <w:t xml:space="preserve"> &amp; hayes?,</w:t>
+      <w:r>
+        <w:t>steele &amp; hayes?,</w:t>
       </w:r>
     </w:p>
     <w:p>
@@ -1923,15 +2593,7 @@
         <w:pStyle w:val="APA7Body"/>
       </w:pPr>
       <w:r>
-        <w:t xml:space="preserve">In both RAI and </w:t>
-      </w:r>
-      <w:proofErr w:type="spellStart"/>
-      <w:r>
-        <w:t>cogneuro</w:t>
-      </w:r>
-      <w:proofErr w:type="spellEnd"/>
-      <w:r>
-        <w:t xml:space="preserve"> literature</w:t>
+        <w:t>In both RAI and cogneuro literature</w:t>
       </w:r>
     </w:p>
     <w:p>
@@ -1983,18 +2645,18 @@
       <w:pPr>
         <w:pStyle w:val="APA7H1"/>
       </w:pPr>
-      <w:commentRangeStart w:id="2"/>
+      <w:commentRangeStart w:id="3"/>
       <w:r>
         <w:t>Declarations</w:t>
       </w:r>
-      <w:commentRangeEnd w:id="2"/>
+      <w:commentRangeEnd w:id="3"/>
       <w:r>
         <w:rPr>
           <w:rStyle w:val="CommentReference"/>
-          <w:rFonts w:asciiTheme="minorHAnsi" w:eastAsiaTheme="minorHAnsi" w:hAnsiTheme="minorHAnsi" w:cstheme="minorBidi"/>
-          <w:b w:val="0"/>
-        </w:rPr>
-        <w:commentReference w:id="2"/>
+          <w:sz w:val="24"/>
+          <w:szCs w:val="36"/>
+        </w:rPr>
+        <w:commentReference w:id="3"/>
       </w:r>
     </w:p>
     <w:p>
@@ -2012,7 +2674,13 @@
         <w:t>Funding</w:t>
       </w:r>
       <w:r>
-        <w:t> (information that explains whether and by whom the research was supported)</w:t>
+        <w:t xml:space="preserve">. This research was funded by </w:t>
+      </w:r>
+      <w:r>
+        <w:t>Flemish Research Fund fundamental research grant … to MR.</w:t>
+      </w:r>
+      <w:r>
+        <w:t xml:space="preserve"> JDH is supported by …. MF is supported by Flemish Research Fund grant …</w:t>
       </w:r>
     </w:p>
     <w:p>
@@ -2030,7 +2698,10 @@
         <w:t>Conflicts of interest/Competing interests</w:t>
       </w:r>
       <w:r>
-        <w:t> (include appropriate disclosures)</w:t>
+        <w:t>.</w:t>
+      </w:r>
+      <w:r>
+        <w:t xml:space="preserve"> None.</w:t>
       </w:r>
     </w:p>
     <w:p>
@@ -2050,6 +2721,12 @@
       <w:r>
         <w:t> (include appropriate approvals or waivers)</w:t>
       </w:r>
+      <w:r>
+        <w:t>.</w:t>
+      </w:r>
+      <w:r>
+        <w:t xml:space="preserve"> Not applicable.</w:t>
+      </w:r>
     </w:p>
     <w:p>
       <w:pPr>
@@ -2066,7 +2743,7 @@
         <w:t>Consent to participate</w:t>
       </w:r>
       <w:r>
-        <w:t> (include appropriate statements)</w:t>
+        <w:t>. Not applicable.</w:t>
       </w:r>
     </w:p>
     <w:p>
@@ -2084,7 +2761,7 @@
         <w:t>Consent for publication</w:t>
       </w:r>
       <w:r>
-        <w:t> (include appropriate statements)</w:t>
+        <w:t>. All authors have read and agree with the publication of this version of the manuscript.</w:t>
       </w:r>
     </w:p>
     <w:p>
@@ -2102,7 +2779,10 @@
         <w:t>Availability of data and materials</w:t>
       </w:r>
       <w:r>
-        <w:t> (data transparency)</w:t>
+        <w:t xml:space="preserve">. </w:t>
+      </w:r>
+      <w:r>
+        <w:t>Not applicable.</w:t>
       </w:r>
     </w:p>
     <w:p>
@@ -2120,7 +2800,7 @@
         <w:t>Code availability</w:t>
       </w:r>
       <w:r>
-        <w:t> (software application or custom code)</w:t>
+        <w:t>. Software is available on the Open Science Framework (link).</w:t>
       </w:r>
     </w:p>
     <w:p>
@@ -2184,13 +2864,13 @@
         <w:rPr>
           <w:bCs w:val="0"/>
         </w:rPr>
-        <w:t>E.g.,</w:t>
+        <w:t>A</w:t>
       </w:r>
       <w:r>
         <w:rPr>
           <w:bCs w:val="0"/>
         </w:rPr>
-        <w:t xml:space="preserve"> all materials and</w:t>
+        <w:t>ll materials and</w:t>
       </w:r>
       <w:r>
         <w:rPr>
@@ -2328,7 +3008,7 @@
       </w:r>
     </w:p>
     <w:sectPr>
-      <w:headerReference w:type="default" r:id="rId13"/>
+      <w:headerReference w:type="default" r:id="rId14"/>
       <w:type w:val="continuous"/>
       <w:pgSz w:w="12240" w:h="15840"/>
       <w:pgMar w:top="1440" w:right="1440" w:bottom="1440" w:left="1440" w:header="720" w:footer="720" w:gutter="0"/>
@@ -2390,7 +3070,26 @@
       </w:r>
     </w:p>
   </w:comment>
-  <w:comment w:id="2" w:author="Matthias Raemaekers" w:date="2024-11-17T12:02:00Z" w:initials="MR">
+  <w:comment w:id="2" w:author="Matthias Raemaekers" w:date="2025-11-06T13:42:00Z" w:initials="MR">
+    <w:p>
+      <w:pPr>
+        <w:pStyle w:val="CommentText"/>
+      </w:pPr>
+      <w:r>
+        <w:rPr>
+          <w:rStyle w:val="CommentReference"/>
+        </w:rPr>
+        <w:annotationRef/>
+      </w:r>
+      <w:r>
+        <w:rPr>
+          <w:lang w:val="nl-BE"/>
+        </w:rPr>
+        <w:t>Maybe rather provide tutorial, run through functionality of different scripts step by step? (1) create tables, derive relations</w:t>
+      </w:r>
+    </w:p>
+  </w:comment>
+  <w:comment w:id="3" w:author="Matthias Raemaekers" w:date="2024-11-17T12:02:00Z" w:initials="MR">
     <w:p>
       <w:pPr>
         <w:pStyle w:val="CommentText"/>
@@ -2413,6 +3112,7 @@
 <w15:commentsEx xmlns:wpc="http://schemas.microsoft.com/office/word/2010/wordprocessingCanvas" xmlns:cx="http://schemas.microsoft.com/office/drawing/2014/chartex" xmlns:cx1="http://schemas.microsoft.com/office/drawing/2015/9/8/chartex" xmlns:cx2="http://schemas.microsoft.com/office/drawing/2015/10/21/chartex" xmlns:cx3="http://schemas.microsoft.com/office/drawing/2016/5/9/chartex" xmlns:cx4="http://schemas.microsoft.com/office/drawing/2016/5/10/chartex" xmlns:cx5="http://schemas.microsoft.com/office/drawing/2016/5/11/chartex" xmlns:cx6="http://schemas.microsoft.com/office/drawing/2016/5/12/chartex" xmlns:cx7="http://schemas.microsoft.com/office/drawing/2016/5/13/chartex" xmlns:cx8="http://schemas.microsoft.com/office/drawing/2016/5/14/chartex" xmlns:mc="http://schemas.openxmlformats.org/markup-compatibility/2006" xmlns:aink="http://schemas.microsoft.com/office/drawing/2016/ink" xmlns:am3d="http://schemas.microsoft.com/office/drawing/2017/model3d" xmlns:o="urn:schemas-microsoft-com:office:office" xmlns:oel="http://schemas.microsoft.com/office/2019/extlst" xmlns:r="http://schemas.openxmlformats.org/officeDocument/2006/relationships" xmlns:m="http://schemas.openxmlformats.org/officeDocument/2006/math" xmlns:v="urn:schemas-microsoft-com:vml" xmlns:wp14="http://schemas.microsoft.com/office/word/2010/wordprocessingDrawing" xmlns:wp="http://schemas.openxmlformats.org/drawingml/2006/wordprocessingDrawing" xmlns:w10="urn:schemas-microsoft-com:office:word" xmlns:w="http://schemas.openxmlformats.org/wordprocessingml/2006/main" xmlns:w14="http://schemas.microsoft.com/office/word/2010/wordml" xmlns:w15="http://schemas.microsoft.com/office/word/2012/wordml" xmlns:w16cex="http://schemas.microsoft.com/office/word/2018/wordml/cex" xmlns:w16cid="http://schemas.microsoft.com/office/word/2016/wordml/cid" xmlns:w16="http://schemas.microsoft.com/office/word/2018/wordml" xmlns:w16du="http://schemas.microsoft.com/office/word/2023/wordml/word16du" xmlns:w16sdtdh="http://schemas.microsoft.com/office/word/2020/wordml/sdtdatahash" xmlns:w16sdtfl="http://schemas.microsoft.com/office/word/2024/wordml/sdtformatlock" xmlns:w16se="http://schemas.microsoft.com/office/word/2015/wordml/symex" xmlns:wpg="http://schemas.microsoft.com/office/word/2010/wordprocessingGroup" xmlns:wpi="http://schemas.microsoft.com/office/word/2010/wordprocessingInk" xmlns:wne="http://schemas.microsoft.com/office/word/2006/wordml" xmlns:wps="http://schemas.microsoft.com/office/word/2010/wordprocessingShape" mc:Ignorable="w14 w15 w16se w16cid w16 w16cex w16sdtdh w16sdtfl w16du wp14">
   <w15:commentEx w15:paraId="65F941E0" w15:done="0"/>
   <w15:commentEx w15:paraId="2F662FA5" w15:done="0"/>
+  <w15:commentEx w15:paraId="4D1D521A" w15:done="0"/>
   <w15:commentEx w15:paraId="4AF4B946" w15:done="0"/>
 </w15:commentsEx>
 </file>
@@ -2421,6 +3121,7 @@
 <w16cex:commentsExtensible xmlns:wpc="http://schemas.microsoft.com/office/word/2010/wordprocessingCanvas" xmlns:cx="http://schemas.microsoft.com/office/drawing/2014/chartex" xmlns:cx1="http://schemas.microsoft.com/office/drawing/2015/9/8/chartex" xmlns:cx2="http://schemas.microsoft.com/office/drawing/2015/10/21/chartex" xmlns:cx3="http://schemas.microsoft.com/office/drawing/2016/5/9/chartex" xmlns:cx4="http://schemas.microsoft.com/office/drawing/2016/5/10/chartex" xmlns:cx5="http://schemas.microsoft.com/office/drawing/2016/5/11/chartex" xmlns:cx6="http://schemas.microsoft.com/office/drawing/2016/5/12/chartex" xmlns:cx7="http://schemas.microsoft.com/office/drawing/2016/5/13/chartex" xmlns:cx8="http://schemas.microsoft.com/office/drawing/2016/5/14/chartex" xmlns:cr="http://schemas.microsoft.com/office/comments/2020/reactions" xmlns:mc="http://schemas.openxmlformats.org/markup-compatibility/2006" xmlns:aink="http://schemas.microsoft.com/office/drawing/2016/ink" xmlns:am3d="http://schemas.microsoft.com/office/drawing/2017/model3d" xmlns:o="urn:schemas-microsoft-com:office:office" xmlns:oel="http://schemas.microsoft.com/office/2019/extlst" xmlns:r="http://schemas.openxmlformats.org/officeDocument/2006/relationships" xmlns:m="http://schemas.openxmlformats.org/officeDocument/2006/math" xmlns:v="urn:schemas-microsoft-com:vml" xmlns:wp14="http://schemas.microsoft.com/office/word/2010/wordprocessingDrawing" xmlns:wp="http://schemas.openxmlformats.org/drawingml/2006/wordprocessingDrawing" xmlns:w10="urn:schemas-microsoft-com:office:word" xmlns:w="http://schemas.openxmlformats.org/wordprocessingml/2006/main" xmlns:w14="http://schemas.microsoft.com/office/word/2010/wordml" xmlns:w15="http://schemas.microsoft.com/office/word/2012/wordml" xmlns:w16cex="http://schemas.microsoft.com/office/word/2018/wordml/cex" xmlns:w16cid="http://schemas.microsoft.com/office/word/2016/wordml/cid" xmlns:w16="http://schemas.microsoft.com/office/word/2018/wordml" xmlns:w16du="http://schemas.microsoft.com/office/word/2023/wordml/word16du" xmlns:w16sdtdh="http://schemas.microsoft.com/office/word/2020/wordml/sdtdatahash" xmlns:w16sdtfl="http://schemas.microsoft.com/office/word/2024/wordml/sdtformatlock" xmlns:w16se="http://schemas.microsoft.com/office/word/2015/wordml/symex" xmlns:wpg="http://schemas.microsoft.com/office/word/2010/wordprocessingGroup" xmlns:wpi="http://schemas.microsoft.com/office/word/2010/wordprocessingInk" xmlns:wne="http://schemas.microsoft.com/office/word/2006/wordml" xmlns:wps="http://schemas.microsoft.com/office/word/2010/wordprocessingShape" mc:Ignorable="w14 w15 w16se w16cid w16 w16cex w16sdtdh w16sdtfl cr w16du wp14">
   <w16cex:commentExtensible w16cex:durableId="305EA5E4" w16cex:dateUtc="2024-11-17T11:06:00Z"/>
   <w16cex:commentExtensible w16cex:durableId="5216E95F" w16cex:dateUtc="2024-11-17T11:08:00Z"/>
+  <w16cex:commentExtensible w16cex:durableId="60120697" w16cex:dateUtc="2025-11-06T12:42:00Z"/>
   <w16cex:commentExtensible w16cex:durableId="0BC55A2E" w16cex:dateUtc="2024-11-17T11:02:00Z"/>
 </w16cex:commentsExtensible>
 </file>
@@ -2429,6 +3130,7 @@
 <w16cid:commentsIds xmlns:wpc="http://schemas.microsoft.com/office/word/2010/wordprocessingCanvas" xmlns:cx="http://schemas.microsoft.com/office/drawing/2014/chartex" xmlns:cx1="http://schemas.microsoft.com/office/drawing/2015/9/8/chartex" xmlns:cx2="http://schemas.microsoft.com/office/drawing/2015/10/21/chartex" xmlns:cx3="http://schemas.microsoft.com/office/drawing/2016/5/9/chartex" xmlns:cx4="http://schemas.microsoft.com/office/drawing/2016/5/10/chartex" xmlns:cx5="http://schemas.microsoft.com/office/drawing/2016/5/11/chartex" xmlns:cx6="http://schemas.microsoft.com/office/drawing/2016/5/12/chartex" xmlns:cx7="http://schemas.microsoft.com/office/drawing/2016/5/13/chartex" xmlns:cx8="http://schemas.microsoft.com/office/drawing/2016/5/14/chartex" xmlns:mc="http://schemas.openxmlformats.org/markup-compatibility/2006" xmlns:aink="http://schemas.microsoft.com/office/drawing/2016/ink" xmlns:am3d="http://schemas.microsoft.com/office/drawing/2017/model3d" xmlns:o="urn:schemas-microsoft-com:office:office" xmlns:oel="http://schemas.microsoft.com/office/2019/extlst" xmlns:r="http://schemas.openxmlformats.org/officeDocument/2006/relationships" xmlns:m="http://schemas.openxmlformats.org/officeDocument/2006/math" xmlns:v="urn:schemas-microsoft-com:vml" xmlns:wp14="http://schemas.microsoft.com/office/word/2010/wordprocessingDrawing" xmlns:wp="http://schemas.openxmlformats.org/drawingml/2006/wordprocessingDrawing" xmlns:w10="urn:schemas-microsoft-com:office:word" xmlns:w="http://schemas.openxmlformats.org/wordprocessingml/2006/main" xmlns:w14="http://schemas.microsoft.com/office/word/2010/wordml" xmlns:w15="http://schemas.microsoft.com/office/word/2012/wordml" xmlns:w16cex="http://schemas.microsoft.com/office/word/2018/wordml/cex" xmlns:w16cid="http://schemas.microsoft.com/office/word/2016/wordml/cid" xmlns:w16="http://schemas.microsoft.com/office/word/2018/wordml" xmlns:w16du="http://schemas.microsoft.com/office/word/2023/wordml/word16du" xmlns:w16sdtdh="http://schemas.microsoft.com/office/word/2020/wordml/sdtdatahash" xmlns:w16sdtfl="http://schemas.microsoft.com/office/word/2024/wordml/sdtformatlock" xmlns:w16se="http://schemas.microsoft.com/office/word/2015/wordml/symex" xmlns:wpg="http://schemas.microsoft.com/office/word/2010/wordprocessingGroup" xmlns:wpi="http://schemas.microsoft.com/office/word/2010/wordprocessingInk" xmlns:wne="http://schemas.microsoft.com/office/word/2006/wordml" xmlns:wps="http://schemas.microsoft.com/office/word/2010/wordprocessingShape" mc:Ignorable="w14 w15 w16se w16cid w16 w16cex w16sdtdh w16sdtfl w16du wp14">
   <w16cid:commentId w16cid:paraId="65F941E0" w16cid:durableId="305EA5E4"/>
   <w16cid:commentId w16cid:paraId="2F662FA5" w16cid:durableId="5216E95F"/>
+  <w16cid:commentId w16cid:paraId="4D1D521A" w16cid:durableId="60120697"/>
   <w16cid:commentId w16cid:paraId="4AF4B946" w16cid:durableId="0BC55A2E"/>
 </w16cid:commentsIds>
 </file>
@@ -2477,6 +3179,32 @@
       </w:pPr>
       <w:r>
         <w:continuationSeparator/>
+      </w:r>
+    </w:p>
+  </w:footnote>
+  <w:footnote w:id="1">
+    <w:p>
+      <w:pPr>
+        <w:pStyle w:val="FootnoteText"/>
+        <w:rPr>
+          <w:lang w:val="nl-BE"/>
+        </w:rPr>
+      </w:pPr>
+      <w:r>
+        <w:rPr>
+          <w:rStyle w:val="FootnoteReference"/>
+        </w:rPr>
+        <w:footnoteRef/>
+      </w:r>
+      <w:r>
+        <w:t xml:space="preserve"> </w:t>
+      </w:r>
+      <w:r>
+        <w:rPr>
+          <w:color w:val="EE0000"/>
+          <w:lang w:val="nl-BE"/>
+        </w:rPr>
+        <w:t>Link to OSF</w:t>
       </w:r>
     </w:p>
   </w:footnote>
@@ -2643,6 +3371,95 @@
     </w:lvl>
   </w:abstractNum>
   <w:abstractNum w:abstractNumId="1" w15:restartNumberingAfterBreak="0">
+    <w:nsid w:val="2BEC2D9D"/>
+    <w:multiLevelType w:val="hybridMultilevel"/>
+    <w:tmpl w:val="3412FDD2"/>
+    <w:lvl w:ilvl="0" w:tplc="B2BAFD2C">
+      <w:start w:val="1"/>
+      <w:numFmt w:val="decimal"/>
+      <w:lvlText w:val="(%1)"/>
+      <w:lvlJc w:val="left"/>
+      <w:pPr>
+        <w:ind w:left="1080" w:hanging="360"/>
+      </w:pPr>
+      <w:rPr>
+        <w:rFonts w:hint="default"/>
+      </w:rPr>
+    </w:lvl>
+    <w:lvl w:ilvl="1" w:tplc="08130019" w:tentative="1">
+      <w:start w:val="1"/>
+      <w:numFmt w:val="lowerLetter"/>
+      <w:lvlText w:val="%2."/>
+      <w:lvlJc w:val="left"/>
+      <w:pPr>
+        <w:ind w:left="1800" w:hanging="360"/>
+      </w:pPr>
+    </w:lvl>
+    <w:lvl w:ilvl="2" w:tplc="0813001B" w:tentative="1">
+      <w:start w:val="1"/>
+      <w:numFmt w:val="lowerRoman"/>
+      <w:lvlText w:val="%3."/>
+      <w:lvlJc w:val="right"/>
+      <w:pPr>
+        <w:ind w:left="2520" w:hanging="180"/>
+      </w:pPr>
+    </w:lvl>
+    <w:lvl w:ilvl="3" w:tplc="0813000F" w:tentative="1">
+      <w:start w:val="1"/>
+      <w:numFmt w:val="decimal"/>
+      <w:lvlText w:val="%4."/>
+      <w:lvlJc w:val="left"/>
+      <w:pPr>
+        <w:ind w:left="3240" w:hanging="360"/>
+      </w:pPr>
+    </w:lvl>
+    <w:lvl w:ilvl="4" w:tplc="08130019" w:tentative="1">
+      <w:start w:val="1"/>
+      <w:numFmt w:val="lowerLetter"/>
+      <w:lvlText w:val="%5."/>
+      <w:lvlJc w:val="left"/>
+      <w:pPr>
+        <w:ind w:left="3960" w:hanging="360"/>
+      </w:pPr>
+    </w:lvl>
+    <w:lvl w:ilvl="5" w:tplc="0813001B" w:tentative="1">
+      <w:start w:val="1"/>
+      <w:numFmt w:val="lowerRoman"/>
+      <w:lvlText w:val="%6."/>
+      <w:lvlJc w:val="right"/>
+      <w:pPr>
+        <w:ind w:left="4680" w:hanging="180"/>
+      </w:pPr>
+    </w:lvl>
+    <w:lvl w:ilvl="6" w:tplc="0813000F" w:tentative="1">
+      <w:start w:val="1"/>
+      <w:numFmt w:val="decimal"/>
+      <w:lvlText w:val="%7."/>
+      <w:lvlJc w:val="left"/>
+      <w:pPr>
+        <w:ind w:left="5400" w:hanging="360"/>
+      </w:pPr>
+    </w:lvl>
+    <w:lvl w:ilvl="7" w:tplc="08130019" w:tentative="1">
+      <w:start w:val="1"/>
+      <w:numFmt w:val="lowerLetter"/>
+      <w:lvlText w:val="%8."/>
+      <w:lvlJc w:val="left"/>
+      <w:pPr>
+        <w:ind w:left="6120" w:hanging="360"/>
+      </w:pPr>
+    </w:lvl>
+    <w:lvl w:ilvl="8" w:tplc="0813001B" w:tentative="1">
+      <w:start w:val="1"/>
+      <w:numFmt w:val="lowerRoman"/>
+      <w:lvlText w:val="%9."/>
+      <w:lvlJc w:val="right"/>
+      <w:pPr>
+        <w:ind w:left="6840" w:hanging="180"/>
+      </w:pPr>
+    </w:lvl>
+  </w:abstractNum>
+  <w:abstractNum w:abstractNumId="2" w15:restartNumberingAfterBreak="0">
     <w:nsid w:val="2E78613F"/>
     <w:multiLevelType w:val="hybridMultilevel"/>
     <w:tmpl w:val="F6C0A45A"/>
@@ -2754,7 +3571,119 @@
       </w:rPr>
     </w:lvl>
   </w:abstractNum>
-  <w:abstractNum w:abstractNumId="2" w15:restartNumberingAfterBreak="0">
+  <w:abstractNum w:abstractNumId="3" w15:restartNumberingAfterBreak="0">
+    <w:nsid w:val="2E953F2D"/>
+    <w:multiLevelType w:val="hybridMultilevel"/>
+    <w:tmpl w:val="84DA43FA"/>
+    <w:lvl w:ilvl="0" w:tplc="C2DE68C4">
+      <w:numFmt w:val="bullet"/>
+      <w:lvlText w:val="-"/>
+      <w:lvlJc w:val="left"/>
+      <w:pPr>
+        <w:ind w:left="1080" w:hanging="360"/>
+      </w:pPr>
+      <w:rPr>
+        <w:rFonts w:ascii="Calibri" w:eastAsiaTheme="majorEastAsia" w:hAnsi="Calibri" w:cs="Calibri" w:hint="default"/>
+      </w:rPr>
+    </w:lvl>
+    <w:lvl w:ilvl="1" w:tplc="08130003" w:tentative="1">
+      <w:start w:val="1"/>
+      <w:numFmt w:val="bullet"/>
+      <w:lvlText w:val="o"/>
+      <w:lvlJc w:val="left"/>
+      <w:pPr>
+        <w:ind w:left="1800" w:hanging="360"/>
+      </w:pPr>
+      <w:rPr>
+        <w:rFonts w:ascii="Courier New" w:hAnsi="Courier New" w:cs="Courier New" w:hint="default"/>
+      </w:rPr>
+    </w:lvl>
+    <w:lvl w:ilvl="2" w:tplc="08130005" w:tentative="1">
+      <w:start w:val="1"/>
+      <w:numFmt w:val="bullet"/>
+      <w:lvlText w:val=""/>
+      <w:lvlJc w:val="left"/>
+      <w:pPr>
+        <w:ind w:left="2520" w:hanging="360"/>
+      </w:pPr>
+      <w:rPr>
+        <w:rFonts w:ascii="Wingdings" w:hAnsi="Wingdings" w:hint="default"/>
+      </w:rPr>
+    </w:lvl>
+    <w:lvl w:ilvl="3" w:tplc="08130001" w:tentative="1">
+      <w:start w:val="1"/>
+      <w:numFmt w:val="bullet"/>
+      <w:lvlText w:val=""/>
+      <w:lvlJc w:val="left"/>
+      <w:pPr>
+        <w:ind w:left="3240" w:hanging="360"/>
+      </w:pPr>
+      <w:rPr>
+        <w:rFonts w:ascii="Symbol" w:hAnsi="Symbol" w:hint="default"/>
+      </w:rPr>
+    </w:lvl>
+    <w:lvl w:ilvl="4" w:tplc="08130003" w:tentative="1">
+      <w:start w:val="1"/>
+      <w:numFmt w:val="bullet"/>
+      <w:lvlText w:val="o"/>
+      <w:lvlJc w:val="left"/>
+      <w:pPr>
+        <w:ind w:left="3960" w:hanging="360"/>
+      </w:pPr>
+      <w:rPr>
+        <w:rFonts w:ascii="Courier New" w:hAnsi="Courier New" w:cs="Courier New" w:hint="default"/>
+      </w:rPr>
+    </w:lvl>
+    <w:lvl w:ilvl="5" w:tplc="08130005" w:tentative="1">
+      <w:start w:val="1"/>
+      <w:numFmt w:val="bullet"/>
+      <w:lvlText w:val=""/>
+      <w:lvlJc w:val="left"/>
+      <w:pPr>
+        <w:ind w:left="4680" w:hanging="360"/>
+      </w:pPr>
+      <w:rPr>
+        <w:rFonts w:ascii="Wingdings" w:hAnsi="Wingdings" w:hint="default"/>
+      </w:rPr>
+    </w:lvl>
+    <w:lvl w:ilvl="6" w:tplc="08130001" w:tentative="1">
+      <w:start w:val="1"/>
+      <w:numFmt w:val="bullet"/>
+      <w:lvlText w:val=""/>
+      <w:lvlJc w:val="left"/>
+      <w:pPr>
+        <w:ind w:left="5400" w:hanging="360"/>
+      </w:pPr>
+      <w:rPr>
+        <w:rFonts w:ascii="Symbol" w:hAnsi="Symbol" w:hint="default"/>
+      </w:rPr>
+    </w:lvl>
+    <w:lvl w:ilvl="7" w:tplc="08130003" w:tentative="1">
+      <w:start w:val="1"/>
+      <w:numFmt w:val="bullet"/>
+      <w:lvlText w:val="o"/>
+      <w:lvlJc w:val="left"/>
+      <w:pPr>
+        <w:ind w:left="6120" w:hanging="360"/>
+      </w:pPr>
+      <w:rPr>
+        <w:rFonts w:ascii="Courier New" w:hAnsi="Courier New" w:cs="Courier New" w:hint="default"/>
+      </w:rPr>
+    </w:lvl>
+    <w:lvl w:ilvl="8" w:tplc="08130005" w:tentative="1">
+      <w:start w:val="1"/>
+      <w:numFmt w:val="bullet"/>
+      <w:lvlText w:val=""/>
+      <w:lvlJc w:val="left"/>
+      <w:pPr>
+        <w:ind w:left="6840" w:hanging="360"/>
+      </w:pPr>
+      <w:rPr>
+        <w:rFonts w:ascii="Wingdings" w:hAnsi="Wingdings" w:hint="default"/>
+      </w:rPr>
+    </w:lvl>
+  </w:abstractNum>
+  <w:abstractNum w:abstractNumId="4" w15:restartNumberingAfterBreak="0">
     <w:nsid w:val="338821E2"/>
     <w:multiLevelType w:val="multilevel"/>
     <w:tmpl w:val="0DB43210"/>
@@ -2903,7 +3832,119 @@
       </w:rPr>
     </w:lvl>
   </w:abstractNum>
-  <w:abstractNum w:abstractNumId="3" w15:restartNumberingAfterBreak="0">
+  <w:abstractNum w:abstractNumId="5" w15:restartNumberingAfterBreak="0">
+    <w:nsid w:val="3D605DD8"/>
+    <w:multiLevelType w:val="hybridMultilevel"/>
+    <w:tmpl w:val="FADA224A"/>
+    <w:lvl w:ilvl="0" w:tplc="E2B0002C">
+      <w:numFmt w:val="bullet"/>
+      <w:lvlText w:val="-"/>
+      <w:lvlJc w:val="left"/>
+      <w:pPr>
+        <w:ind w:left="1080" w:hanging="360"/>
+      </w:pPr>
+      <w:rPr>
+        <w:rFonts w:ascii="Calibri" w:eastAsiaTheme="majorEastAsia" w:hAnsi="Calibri" w:cs="Calibri" w:hint="default"/>
+      </w:rPr>
+    </w:lvl>
+    <w:lvl w:ilvl="1" w:tplc="08130003" w:tentative="1">
+      <w:start w:val="1"/>
+      <w:numFmt w:val="bullet"/>
+      <w:lvlText w:val="o"/>
+      <w:lvlJc w:val="left"/>
+      <w:pPr>
+        <w:ind w:left="1800" w:hanging="360"/>
+      </w:pPr>
+      <w:rPr>
+        <w:rFonts w:ascii="Courier New" w:hAnsi="Courier New" w:cs="Courier New" w:hint="default"/>
+      </w:rPr>
+    </w:lvl>
+    <w:lvl w:ilvl="2" w:tplc="08130005" w:tentative="1">
+      <w:start w:val="1"/>
+      <w:numFmt w:val="bullet"/>
+      <w:lvlText w:val=""/>
+      <w:lvlJc w:val="left"/>
+      <w:pPr>
+        <w:ind w:left="2520" w:hanging="360"/>
+      </w:pPr>
+      <w:rPr>
+        <w:rFonts w:ascii="Wingdings" w:hAnsi="Wingdings" w:hint="default"/>
+      </w:rPr>
+    </w:lvl>
+    <w:lvl w:ilvl="3" w:tplc="08130001" w:tentative="1">
+      <w:start w:val="1"/>
+      <w:numFmt w:val="bullet"/>
+      <w:lvlText w:val=""/>
+      <w:lvlJc w:val="left"/>
+      <w:pPr>
+        <w:ind w:left="3240" w:hanging="360"/>
+      </w:pPr>
+      <w:rPr>
+        <w:rFonts w:ascii="Symbol" w:hAnsi="Symbol" w:hint="default"/>
+      </w:rPr>
+    </w:lvl>
+    <w:lvl w:ilvl="4" w:tplc="08130003" w:tentative="1">
+      <w:start w:val="1"/>
+      <w:numFmt w:val="bullet"/>
+      <w:lvlText w:val="o"/>
+      <w:lvlJc w:val="left"/>
+      <w:pPr>
+        <w:ind w:left="3960" w:hanging="360"/>
+      </w:pPr>
+      <w:rPr>
+        <w:rFonts w:ascii="Courier New" w:hAnsi="Courier New" w:cs="Courier New" w:hint="default"/>
+      </w:rPr>
+    </w:lvl>
+    <w:lvl w:ilvl="5" w:tplc="08130005" w:tentative="1">
+      <w:start w:val="1"/>
+      <w:numFmt w:val="bullet"/>
+      <w:lvlText w:val=""/>
+      <w:lvlJc w:val="left"/>
+      <w:pPr>
+        <w:ind w:left="4680" w:hanging="360"/>
+      </w:pPr>
+      <w:rPr>
+        <w:rFonts w:ascii="Wingdings" w:hAnsi="Wingdings" w:hint="default"/>
+      </w:rPr>
+    </w:lvl>
+    <w:lvl w:ilvl="6" w:tplc="08130001" w:tentative="1">
+      <w:start w:val="1"/>
+      <w:numFmt w:val="bullet"/>
+      <w:lvlText w:val=""/>
+      <w:lvlJc w:val="left"/>
+      <w:pPr>
+        <w:ind w:left="5400" w:hanging="360"/>
+      </w:pPr>
+      <w:rPr>
+        <w:rFonts w:ascii="Symbol" w:hAnsi="Symbol" w:hint="default"/>
+      </w:rPr>
+    </w:lvl>
+    <w:lvl w:ilvl="7" w:tplc="08130003" w:tentative="1">
+      <w:start w:val="1"/>
+      <w:numFmt w:val="bullet"/>
+      <w:lvlText w:val="o"/>
+      <w:lvlJc w:val="left"/>
+      <w:pPr>
+        <w:ind w:left="6120" w:hanging="360"/>
+      </w:pPr>
+      <w:rPr>
+        <w:rFonts w:ascii="Courier New" w:hAnsi="Courier New" w:cs="Courier New" w:hint="default"/>
+      </w:rPr>
+    </w:lvl>
+    <w:lvl w:ilvl="8" w:tplc="08130005" w:tentative="1">
+      <w:start w:val="1"/>
+      <w:numFmt w:val="bullet"/>
+      <w:lvlText w:val=""/>
+      <w:lvlJc w:val="left"/>
+      <w:pPr>
+        <w:ind w:left="6840" w:hanging="360"/>
+      </w:pPr>
+      <w:rPr>
+        <w:rFonts w:ascii="Wingdings" w:hAnsi="Wingdings" w:hint="default"/>
+      </w:rPr>
+    </w:lvl>
+  </w:abstractNum>
+  <w:abstractNum w:abstractNumId="6" w15:restartNumberingAfterBreak="0">
     <w:nsid w:val="43B41ED5"/>
     <w:multiLevelType w:val="hybridMultilevel"/>
     <w:tmpl w:val="F85ECAA2"/>
@@ -3015,7 +4056,119 @@
       </w:rPr>
     </w:lvl>
   </w:abstractNum>
-  <w:abstractNum w:abstractNumId="4" w15:restartNumberingAfterBreak="0">
+  <w:abstractNum w:abstractNumId="7" w15:restartNumberingAfterBreak="0">
+    <w:nsid w:val="519E65CA"/>
+    <w:multiLevelType w:val="hybridMultilevel"/>
+    <w:tmpl w:val="B7B4EBF8"/>
+    <w:lvl w:ilvl="0" w:tplc="E3B07116">
+      <w:numFmt w:val="bullet"/>
+      <w:lvlText w:val="-"/>
+      <w:lvlJc w:val="left"/>
+      <w:pPr>
+        <w:ind w:left="1800" w:hanging="360"/>
+      </w:pPr>
+      <w:rPr>
+        <w:rFonts w:ascii="Calibri" w:eastAsiaTheme="majorEastAsia" w:hAnsi="Calibri" w:cs="Calibri" w:hint="default"/>
+      </w:rPr>
+    </w:lvl>
+    <w:lvl w:ilvl="1" w:tplc="08130003" w:tentative="1">
+      <w:start w:val="1"/>
+      <w:numFmt w:val="bullet"/>
+      <w:lvlText w:val="o"/>
+      <w:lvlJc w:val="left"/>
+      <w:pPr>
+        <w:ind w:left="2520" w:hanging="360"/>
+      </w:pPr>
+      <w:rPr>
+        <w:rFonts w:ascii="Courier New" w:hAnsi="Courier New" w:cs="Courier New" w:hint="default"/>
+      </w:rPr>
+    </w:lvl>
+    <w:lvl w:ilvl="2" w:tplc="08130005" w:tentative="1">
+      <w:start w:val="1"/>
+      <w:numFmt w:val="bullet"/>
+      <w:lvlText w:val=""/>
+      <w:lvlJc w:val="left"/>
+      <w:pPr>
+        <w:ind w:left="3240" w:hanging="360"/>
+      </w:pPr>
+      <w:rPr>
+        <w:rFonts w:ascii="Wingdings" w:hAnsi="Wingdings" w:hint="default"/>
+      </w:rPr>
+    </w:lvl>
+    <w:lvl w:ilvl="3" w:tplc="08130001" w:tentative="1">
+      <w:start w:val="1"/>
+      <w:numFmt w:val="bullet"/>
+      <w:lvlText w:val=""/>
+      <w:lvlJc w:val="left"/>
+      <w:pPr>
+        <w:ind w:left="3960" w:hanging="360"/>
+      </w:pPr>
+      <w:rPr>
+        <w:rFonts w:ascii="Symbol" w:hAnsi="Symbol" w:hint="default"/>
+      </w:rPr>
+    </w:lvl>
+    <w:lvl w:ilvl="4" w:tplc="08130003" w:tentative="1">
+      <w:start w:val="1"/>
+      <w:numFmt w:val="bullet"/>
+      <w:lvlText w:val="o"/>
+      <w:lvlJc w:val="left"/>
+      <w:pPr>
+        <w:ind w:left="4680" w:hanging="360"/>
+      </w:pPr>
+      <w:rPr>
+        <w:rFonts w:ascii="Courier New" w:hAnsi="Courier New" w:cs="Courier New" w:hint="default"/>
+      </w:rPr>
+    </w:lvl>
+    <w:lvl w:ilvl="5" w:tplc="08130005" w:tentative="1">
+      <w:start w:val="1"/>
+      <w:numFmt w:val="bullet"/>
+      <w:lvlText w:val=""/>
+      <w:lvlJc w:val="left"/>
+      <w:pPr>
+        <w:ind w:left="5400" w:hanging="360"/>
+      </w:pPr>
+      <w:rPr>
+        <w:rFonts w:ascii="Wingdings" w:hAnsi="Wingdings" w:hint="default"/>
+      </w:rPr>
+    </w:lvl>
+    <w:lvl w:ilvl="6" w:tplc="08130001" w:tentative="1">
+      <w:start w:val="1"/>
+      <w:numFmt w:val="bullet"/>
+      <w:lvlText w:val=""/>
+      <w:lvlJc w:val="left"/>
+      <w:pPr>
+        <w:ind w:left="6120" w:hanging="360"/>
+      </w:pPr>
+      <w:rPr>
+        <w:rFonts w:ascii="Symbol" w:hAnsi="Symbol" w:hint="default"/>
+      </w:rPr>
+    </w:lvl>
+    <w:lvl w:ilvl="7" w:tplc="08130003" w:tentative="1">
+      <w:start w:val="1"/>
+      <w:numFmt w:val="bullet"/>
+      <w:lvlText w:val="o"/>
+      <w:lvlJc w:val="left"/>
+      <w:pPr>
+        <w:ind w:left="6840" w:hanging="360"/>
+      </w:pPr>
+      <w:rPr>
+        <w:rFonts w:ascii="Courier New" w:hAnsi="Courier New" w:cs="Courier New" w:hint="default"/>
+      </w:rPr>
+    </w:lvl>
+    <w:lvl w:ilvl="8" w:tplc="08130005" w:tentative="1">
+      <w:start w:val="1"/>
+      <w:numFmt w:val="bullet"/>
+      <w:lvlText w:val=""/>
+      <w:lvlJc w:val="left"/>
+      <w:pPr>
+        <w:ind w:left="7560" w:hanging="360"/>
+      </w:pPr>
+      <w:rPr>
+        <w:rFonts w:ascii="Wingdings" w:hAnsi="Wingdings" w:hint="default"/>
+      </w:rPr>
+    </w:lvl>
+  </w:abstractNum>
+  <w:abstractNum w:abstractNumId="8" w15:restartNumberingAfterBreak="0">
     <w:nsid w:val="57D12A91"/>
     <w:multiLevelType w:val="hybridMultilevel"/>
     <w:tmpl w:val="60CCF042"/>
@@ -3128,7 +4281,7 @@
       </w:rPr>
     </w:lvl>
   </w:abstractNum>
-  <w:abstractNum w:abstractNumId="5" w15:restartNumberingAfterBreak="0">
+  <w:abstractNum w:abstractNumId="9" w15:restartNumberingAfterBreak="0">
     <w:nsid w:val="593E58EE"/>
     <w:multiLevelType w:val="hybridMultilevel"/>
     <w:tmpl w:val="CE229A1A"/>
@@ -3240,7 +4393,205 @@
       </w:rPr>
     </w:lvl>
   </w:abstractNum>
-  <w:abstractNum w:abstractNumId="6" w15:restartNumberingAfterBreak="0">
+  <w:abstractNum w:abstractNumId="10" w15:restartNumberingAfterBreak="0">
+    <w:nsid w:val="6205150A"/>
+    <w:multiLevelType w:val="hybridMultilevel"/>
+    <w:tmpl w:val="542CAA84"/>
+    <w:lvl w:ilvl="0" w:tplc="E3B07116">
+      <w:numFmt w:val="bullet"/>
+      <w:lvlText w:val="-"/>
+      <w:lvlJc w:val="left"/>
+      <w:pPr>
+        <w:ind w:left="1080" w:hanging="360"/>
+      </w:pPr>
+      <w:rPr>
+        <w:rFonts w:ascii="Calibri" w:eastAsiaTheme="majorEastAsia" w:hAnsi="Calibri" w:cs="Calibri" w:hint="default"/>
+      </w:rPr>
+    </w:lvl>
+    <w:lvl w:ilvl="1" w:tplc="08130003">
+      <w:start w:val="1"/>
+      <w:numFmt w:val="bullet"/>
+      <w:lvlText w:val="o"/>
+      <w:lvlJc w:val="left"/>
+      <w:pPr>
+        <w:ind w:left="720" w:hanging="360"/>
+      </w:pPr>
+      <w:rPr>
+        <w:rFonts w:ascii="Courier New" w:hAnsi="Courier New" w:cs="Courier New" w:hint="default"/>
+      </w:rPr>
+    </w:lvl>
+    <w:lvl w:ilvl="2" w:tplc="08130005" w:tentative="1">
+      <w:start w:val="1"/>
+      <w:numFmt w:val="bullet"/>
+      <w:lvlText w:val=""/>
+      <w:lvlJc w:val="left"/>
+      <w:pPr>
+        <w:ind w:left="1440" w:hanging="360"/>
+      </w:pPr>
+      <w:rPr>
+        <w:rFonts w:ascii="Wingdings" w:hAnsi="Wingdings" w:hint="default"/>
+      </w:rPr>
+    </w:lvl>
+    <w:lvl w:ilvl="3" w:tplc="08130001" w:tentative="1">
+      <w:start w:val="1"/>
+      <w:numFmt w:val="bullet"/>
+      <w:lvlText w:val=""/>
+      <w:lvlJc w:val="left"/>
+      <w:pPr>
+        <w:ind w:left="2160" w:hanging="360"/>
+      </w:pPr>
+      <w:rPr>
+        <w:rFonts w:ascii="Symbol" w:hAnsi="Symbol" w:hint="default"/>
+      </w:rPr>
+    </w:lvl>
+    <w:lvl w:ilvl="4" w:tplc="08130003" w:tentative="1">
+      <w:start w:val="1"/>
+      <w:numFmt w:val="bullet"/>
+      <w:lvlText w:val="o"/>
+      <w:lvlJc w:val="left"/>
+      <w:pPr>
+        <w:ind w:left="2880" w:hanging="360"/>
+      </w:pPr>
+      <w:rPr>
+        <w:rFonts w:ascii="Courier New" w:hAnsi="Courier New" w:cs="Courier New" w:hint="default"/>
+      </w:rPr>
+    </w:lvl>
+    <w:lvl w:ilvl="5" w:tplc="08130005" w:tentative="1">
+      <w:start w:val="1"/>
+      <w:numFmt w:val="bullet"/>
+      <w:lvlText w:val=""/>
+      <w:lvlJc w:val="left"/>
+      <w:pPr>
+        <w:ind w:left="3600" w:hanging="360"/>
+      </w:pPr>
+      <w:rPr>
+        <w:rFonts w:ascii="Wingdings" w:hAnsi="Wingdings" w:hint="default"/>
+      </w:rPr>
+    </w:lvl>
+    <w:lvl w:ilvl="6" w:tplc="08130001" w:tentative="1">
+      <w:start w:val="1"/>
+      <w:numFmt w:val="bullet"/>
+      <w:lvlText w:val=""/>
+      <w:lvlJc w:val="left"/>
+      <w:pPr>
+        <w:ind w:left="4320" w:hanging="360"/>
+      </w:pPr>
+      <w:rPr>
+        <w:rFonts w:ascii="Symbol" w:hAnsi="Symbol" w:hint="default"/>
+      </w:rPr>
+    </w:lvl>
+    <w:lvl w:ilvl="7" w:tplc="08130003" w:tentative="1">
+      <w:start w:val="1"/>
+      <w:numFmt w:val="bullet"/>
+      <w:lvlText w:val="o"/>
+      <w:lvlJc w:val="left"/>
+      <w:pPr>
+        <w:ind w:left="5040" w:hanging="360"/>
+      </w:pPr>
+      <w:rPr>
+        <w:rFonts w:ascii="Courier New" w:hAnsi="Courier New" w:cs="Courier New" w:hint="default"/>
+      </w:rPr>
+    </w:lvl>
+    <w:lvl w:ilvl="8" w:tplc="08130005" w:tentative="1">
+      <w:start w:val="1"/>
+      <w:numFmt w:val="bullet"/>
+      <w:lvlText w:val=""/>
+      <w:lvlJc w:val="left"/>
+      <w:pPr>
+        <w:ind w:left="5760" w:hanging="360"/>
+      </w:pPr>
+      <w:rPr>
+        <w:rFonts w:ascii="Wingdings" w:hAnsi="Wingdings" w:hint="default"/>
+      </w:rPr>
+    </w:lvl>
+  </w:abstractNum>
+  <w:abstractNum w:abstractNumId="11" w15:restartNumberingAfterBreak="0">
+    <w:nsid w:val="65E95BFC"/>
+    <w:multiLevelType w:val="hybridMultilevel"/>
+    <w:tmpl w:val="406CCA7E"/>
+    <w:lvl w:ilvl="0" w:tplc="0813000F">
+      <w:start w:val="1"/>
+      <w:numFmt w:val="decimal"/>
+      <w:lvlText w:val="%1."/>
+      <w:lvlJc w:val="left"/>
+      <w:pPr>
+        <w:ind w:left="1440" w:hanging="360"/>
+      </w:pPr>
+    </w:lvl>
+    <w:lvl w:ilvl="1" w:tplc="08130019" w:tentative="1">
+      <w:start w:val="1"/>
+      <w:numFmt w:val="lowerLetter"/>
+      <w:lvlText w:val="%2."/>
+      <w:lvlJc w:val="left"/>
+      <w:pPr>
+        <w:ind w:left="2160" w:hanging="360"/>
+      </w:pPr>
+    </w:lvl>
+    <w:lvl w:ilvl="2" w:tplc="0813001B" w:tentative="1">
+      <w:start w:val="1"/>
+      <w:numFmt w:val="lowerRoman"/>
+      <w:lvlText w:val="%3."/>
+      <w:lvlJc w:val="right"/>
+      <w:pPr>
+        <w:ind w:left="2880" w:hanging="180"/>
+      </w:pPr>
+    </w:lvl>
+    <w:lvl w:ilvl="3" w:tplc="0813000F" w:tentative="1">
+      <w:start w:val="1"/>
+      <w:numFmt w:val="decimal"/>
+      <w:lvlText w:val="%4."/>
+      <w:lvlJc w:val="left"/>
+      <w:pPr>
+        <w:ind w:left="3600" w:hanging="360"/>
+      </w:pPr>
+    </w:lvl>
+    <w:lvl w:ilvl="4" w:tplc="08130019" w:tentative="1">
+      <w:start w:val="1"/>
+      <w:numFmt w:val="lowerLetter"/>
+      <w:lvlText w:val="%5."/>
+      <w:lvlJc w:val="left"/>
+      <w:pPr>
+        <w:ind w:left="4320" w:hanging="360"/>
+      </w:pPr>
+    </w:lvl>
+    <w:lvl w:ilvl="5" w:tplc="0813001B" w:tentative="1">
+      <w:start w:val="1"/>
+      <w:numFmt w:val="lowerRoman"/>
+      <w:lvlText w:val="%6."/>
+      <w:lvlJc w:val="right"/>
+      <w:pPr>
+        <w:ind w:left="5040" w:hanging="180"/>
+      </w:pPr>
+    </w:lvl>
+    <w:lvl w:ilvl="6" w:tplc="0813000F" w:tentative="1">
+      <w:start w:val="1"/>
+      <w:numFmt w:val="decimal"/>
+      <w:lvlText w:val="%7."/>
+      <w:lvlJc w:val="left"/>
+      <w:pPr>
+        <w:ind w:left="5760" w:hanging="360"/>
+      </w:pPr>
+    </w:lvl>
+    <w:lvl w:ilvl="7" w:tplc="08130019" w:tentative="1">
+      <w:start w:val="1"/>
+      <w:numFmt w:val="lowerLetter"/>
+      <w:lvlText w:val="%8."/>
+      <w:lvlJc w:val="left"/>
+      <w:pPr>
+        <w:ind w:left="6480" w:hanging="360"/>
+      </w:pPr>
+    </w:lvl>
+    <w:lvl w:ilvl="8" w:tplc="0813001B" w:tentative="1">
+      <w:start w:val="1"/>
+      <w:numFmt w:val="lowerRoman"/>
+      <w:lvlText w:val="%9."/>
+      <w:lvlJc w:val="right"/>
+      <w:pPr>
+        <w:ind w:left="7200" w:hanging="180"/>
+      </w:pPr>
+    </w:lvl>
+  </w:abstractNum>
+  <w:abstractNum w:abstractNumId="12" w15:restartNumberingAfterBreak="0">
     <w:nsid w:val="6A406E6C"/>
     <w:multiLevelType w:val="multilevel"/>
     <w:tmpl w:val="F9F035D4"/>
@@ -3389,26 +4740,275 @@
       </w:rPr>
     </w:lvl>
   </w:abstractNum>
+  <w:abstractNum w:abstractNumId="13" w15:restartNumberingAfterBreak="0">
+    <w:nsid w:val="751331BA"/>
+    <w:multiLevelType w:val="hybridMultilevel"/>
+    <w:tmpl w:val="63169712"/>
+    <w:lvl w:ilvl="0" w:tplc="08130001">
+      <w:start w:val="1"/>
+      <w:numFmt w:val="bullet"/>
+      <w:lvlText w:val=""/>
+      <w:lvlJc w:val="left"/>
+      <w:pPr>
+        <w:ind w:left="1440" w:hanging="360"/>
+      </w:pPr>
+      <w:rPr>
+        <w:rFonts w:ascii="Symbol" w:hAnsi="Symbol" w:hint="default"/>
+      </w:rPr>
+    </w:lvl>
+    <w:lvl w:ilvl="1" w:tplc="FFFFFFFF">
+      <w:start w:val="1"/>
+      <w:numFmt w:val="bullet"/>
+      <w:lvlText w:val="o"/>
+      <w:lvlJc w:val="left"/>
+      <w:pPr>
+        <w:ind w:left="1080" w:hanging="360"/>
+      </w:pPr>
+      <w:rPr>
+        <w:rFonts w:ascii="Courier New" w:hAnsi="Courier New" w:cs="Courier New" w:hint="default"/>
+      </w:rPr>
+    </w:lvl>
+    <w:lvl w:ilvl="2" w:tplc="FFFFFFFF" w:tentative="1">
+      <w:start w:val="1"/>
+      <w:numFmt w:val="bullet"/>
+      <w:lvlText w:val=""/>
+      <w:lvlJc w:val="left"/>
+      <w:pPr>
+        <w:ind w:left="1800" w:hanging="360"/>
+      </w:pPr>
+      <w:rPr>
+        <w:rFonts w:ascii="Wingdings" w:hAnsi="Wingdings" w:hint="default"/>
+      </w:rPr>
+    </w:lvl>
+    <w:lvl w:ilvl="3" w:tplc="FFFFFFFF" w:tentative="1">
+      <w:start w:val="1"/>
+      <w:numFmt w:val="bullet"/>
+      <w:lvlText w:val=""/>
+      <w:lvlJc w:val="left"/>
+      <w:pPr>
+        <w:ind w:left="2520" w:hanging="360"/>
+      </w:pPr>
+      <w:rPr>
+        <w:rFonts w:ascii="Symbol" w:hAnsi="Symbol" w:hint="default"/>
+      </w:rPr>
+    </w:lvl>
+    <w:lvl w:ilvl="4" w:tplc="FFFFFFFF" w:tentative="1">
+      <w:start w:val="1"/>
+      <w:numFmt w:val="bullet"/>
+      <w:lvlText w:val="o"/>
+      <w:lvlJc w:val="left"/>
+      <w:pPr>
+        <w:ind w:left="3240" w:hanging="360"/>
+      </w:pPr>
+      <w:rPr>
+        <w:rFonts w:ascii="Courier New" w:hAnsi="Courier New" w:cs="Courier New" w:hint="default"/>
+      </w:rPr>
+    </w:lvl>
+    <w:lvl w:ilvl="5" w:tplc="FFFFFFFF" w:tentative="1">
+      <w:start w:val="1"/>
+      <w:numFmt w:val="bullet"/>
+      <w:lvlText w:val=""/>
+      <w:lvlJc w:val="left"/>
+      <w:pPr>
+        <w:ind w:left="3960" w:hanging="360"/>
+      </w:pPr>
+      <w:rPr>
+        <w:rFonts w:ascii="Wingdings" w:hAnsi="Wingdings" w:hint="default"/>
+      </w:rPr>
+    </w:lvl>
+    <w:lvl w:ilvl="6" w:tplc="FFFFFFFF" w:tentative="1">
+      <w:start w:val="1"/>
+      <w:numFmt w:val="bullet"/>
+      <w:lvlText w:val=""/>
+      <w:lvlJc w:val="left"/>
+      <w:pPr>
+        <w:ind w:left="4680" w:hanging="360"/>
+      </w:pPr>
+      <w:rPr>
+        <w:rFonts w:ascii="Symbol" w:hAnsi="Symbol" w:hint="default"/>
+      </w:rPr>
+    </w:lvl>
+    <w:lvl w:ilvl="7" w:tplc="FFFFFFFF" w:tentative="1">
+      <w:start w:val="1"/>
+      <w:numFmt w:val="bullet"/>
+      <w:lvlText w:val="o"/>
+      <w:lvlJc w:val="left"/>
+      <w:pPr>
+        <w:ind w:left="5400" w:hanging="360"/>
+      </w:pPr>
+      <w:rPr>
+        <w:rFonts w:ascii="Courier New" w:hAnsi="Courier New" w:cs="Courier New" w:hint="default"/>
+      </w:rPr>
+    </w:lvl>
+    <w:lvl w:ilvl="8" w:tplc="FFFFFFFF" w:tentative="1">
+      <w:start w:val="1"/>
+      <w:numFmt w:val="bullet"/>
+      <w:lvlText w:val=""/>
+      <w:lvlJc w:val="left"/>
+      <w:pPr>
+        <w:ind w:left="6120" w:hanging="360"/>
+      </w:pPr>
+      <w:rPr>
+        <w:rFonts w:ascii="Wingdings" w:hAnsi="Wingdings" w:hint="default"/>
+      </w:rPr>
+    </w:lvl>
+  </w:abstractNum>
+  <w:abstractNum w:abstractNumId="14" w15:restartNumberingAfterBreak="0">
+    <w:nsid w:val="791A2796"/>
+    <w:multiLevelType w:val="hybridMultilevel"/>
+    <w:tmpl w:val="5D702F6E"/>
+    <w:lvl w:ilvl="0" w:tplc="E3B07116">
+      <w:numFmt w:val="bullet"/>
+      <w:lvlText w:val="-"/>
+      <w:lvlJc w:val="left"/>
+      <w:pPr>
+        <w:ind w:left="1080" w:hanging="360"/>
+      </w:pPr>
+      <w:rPr>
+        <w:rFonts w:ascii="Calibri" w:eastAsiaTheme="majorEastAsia" w:hAnsi="Calibri" w:cs="Calibri" w:hint="default"/>
+      </w:rPr>
+    </w:lvl>
+    <w:lvl w:ilvl="1" w:tplc="08130003">
+      <w:start w:val="1"/>
+      <w:numFmt w:val="bullet"/>
+      <w:lvlText w:val="o"/>
+      <w:lvlJc w:val="left"/>
+      <w:pPr>
+        <w:ind w:left="720" w:hanging="360"/>
+      </w:pPr>
+      <w:rPr>
+        <w:rFonts w:ascii="Courier New" w:hAnsi="Courier New" w:cs="Courier New" w:hint="default"/>
+      </w:rPr>
+    </w:lvl>
+    <w:lvl w:ilvl="2" w:tplc="08130001">
+      <w:start w:val="1"/>
+      <w:numFmt w:val="bullet"/>
+      <w:lvlText w:val=""/>
+      <w:lvlJc w:val="left"/>
+      <w:pPr>
+        <w:ind w:left="1440" w:hanging="360"/>
+      </w:pPr>
+      <w:rPr>
+        <w:rFonts w:ascii="Symbol" w:hAnsi="Symbol" w:hint="default"/>
+      </w:rPr>
+    </w:lvl>
+    <w:lvl w:ilvl="3" w:tplc="08130001" w:tentative="1">
+      <w:start w:val="1"/>
+      <w:numFmt w:val="bullet"/>
+      <w:lvlText w:val=""/>
+      <w:lvlJc w:val="left"/>
+      <w:pPr>
+        <w:ind w:left="2160" w:hanging="360"/>
+      </w:pPr>
+      <w:rPr>
+        <w:rFonts w:ascii="Symbol" w:hAnsi="Symbol" w:hint="default"/>
+      </w:rPr>
+    </w:lvl>
+    <w:lvl w:ilvl="4" w:tplc="08130003" w:tentative="1">
+      <w:start w:val="1"/>
+      <w:numFmt w:val="bullet"/>
+      <w:lvlText w:val="o"/>
+      <w:lvlJc w:val="left"/>
+      <w:pPr>
+        <w:ind w:left="2880" w:hanging="360"/>
+      </w:pPr>
+      <w:rPr>
+        <w:rFonts w:ascii="Courier New" w:hAnsi="Courier New" w:cs="Courier New" w:hint="default"/>
+      </w:rPr>
+    </w:lvl>
+    <w:lvl w:ilvl="5" w:tplc="08130005" w:tentative="1">
+      <w:start w:val="1"/>
+      <w:numFmt w:val="bullet"/>
+      <w:lvlText w:val=""/>
+      <w:lvlJc w:val="left"/>
+      <w:pPr>
+        <w:ind w:left="3600" w:hanging="360"/>
+      </w:pPr>
+      <w:rPr>
+        <w:rFonts w:ascii="Wingdings" w:hAnsi="Wingdings" w:hint="default"/>
+      </w:rPr>
+    </w:lvl>
+    <w:lvl w:ilvl="6" w:tplc="08130001" w:tentative="1">
+      <w:start w:val="1"/>
+      <w:numFmt w:val="bullet"/>
+      <w:lvlText w:val=""/>
+      <w:lvlJc w:val="left"/>
+      <w:pPr>
+        <w:ind w:left="4320" w:hanging="360"/>
+      </w:pPr>
+      <w:rPr>
+        <w:rFonts w:ascii="Symbol" w:hAnsi="Symbol" w:hint="default"/>
+      </w:rPr>
+    </w:lvl>
+    <w:lvl w:ilvl="7" w:tplc="08130003" w:tentative="1">
+      <w:start w:val="1"/>
+      <w:numFmt w:val="bullet"/>
+      <w:lvlText w:val="o"/>
+      <w:lvlJc w:val="left"/>
+      <w:pPr>
+        <w:ind w:left="5040" w:hanging="360"/>
+      </w:pPr>
+      <w:rPr>
+        <w:rFonts w:ascii="Courier New" w:hAnsi="Courier New" w:cs="Courier New" w:hint="default"/>
+      </w:rPr>
+    </w:lvl>
+    <w:lvl w:ilvl="8" w:tplc="08130005" w:tentative="1">
+      <w:start w:val="1"/>
+      <w:numFmt w:val="bullet"/>
+      <w:lvlText w:val=""/>
+      <w:lvlJc w:val="left"/>
+      <w:pPr>
+        <w:ind w:left="5760" w:hanging="360"/>
+      </w:pPr>
+      <w:rPr>
+        <w:rFonts w:ascii="Wingdings" w:hAnsi="Wingdings" w:hint="default"/>
+      </w:rPr>
+    </w:lvl>
+  </w:abstractNum>
   <w:num w:numId="1" w16cid:durableId="1753895419">
-    <w:abstractNumId w:val="4"/>
+    <w:abstractNumId w:val="8"/>
   </w:num>
   <w:num w:numId="2" w16cid:durableId="1222404982">
     <w:abstractNumId w:val="0"/>
   </w:num>
   <w:num w:numId="3" w16cid:durableId="1576356887">
+    <w:abstractNumId w:val="9"/>
+  </w:num>
+  <w:num w:numId="4" w16cid:durableId="2134712873">
+    <w:abstractNumId w:val="6"/>
+  </w:num>
+  <w:num w:numId="5" w16cid:durableId="1128743861">
+    <w:abstractNumId w:val="2"/>
+  </w:num>
+  <w:num w:numId="6" w16cid:durableId="1280988335">
+    <w:abstractNumId w:val="12"/>
+  </w:num>
+  <w:num w:numId="7" w16cid:durableId="1871213778">
+    <w:abstractNumId w:val="4"/>
+  </w:num>
+  <w:num w:numId="8" w16cid:durableId="1024861742">
+    <w:abstractNumId w:val="3"/>
+  </w:num>
+  <w:num w:numId="9" w16cid:durableId="1291859470">
     <w:abstractNumId w:val="5"/>
   </w:num>
-  <w:num w:numId="4" w16cid:durableId="2134712873">
-    <w:abstractNumId w:val="3"/>
+  <w:num w:numId="10" w16cid:durableId="1684476237">
+    <w:abstractNumId w:val="7"/>
   </w:num>
-  <w:num w:numId="5" w16cid:durableId="1128743861">
+  <w:num w:numId="11" w16cid:durableId="894241804">
+    <w:abstractNumId w:val="11"/>
+  </w:num>
+  <w:num w:numId="12" w16cid:durableId="1041632258">
     <w:abstractNumId w:val="1"/>
   </w:num>
-  <w:num w:numId="6" w16cid:durableId="1280988335">
-    <w:abstractNumId w:val="6"/>
+  <w:num w:numId="13" w16cid:durableId="1780443953">
+    <w:abstractNumId w:val="14"/>
   </w:num>
-  <w:num w:numId="7" w16cid:durableId="1871213778">
-    <w:abstractNumId w:val="2"/>
+  <w:num w:numId="14" w16cid:durableId="170074089">
+    <w:abstractNumId w:val="10"/>
+  </w:num>
+  <w:num w:numId="15" w16cid:durableId="1473062685">
+    <w:abstractNumId w:val="13"/>
   </w:num>
 </w:numbering>
 </file>
@@ -4729,6 +6329,45 @@
       <w:szCs w:val="20"/>
     </w:rPr>
   </w:style>
+  <w:style w:type="paragraph" w:styleId="FootnoteText">
+    <w:name w:val="footnote text"/>
+    <w:basedOn w:val="Normal"/>
+    <w:link w:val="FootnoteTextChar"/>
+    <w:uiPriority w:val="99"/>
+    <w:semiHidden/>
+    <w:unhideWhenUsed/>
+    <w:rsid w:val="00FD1FC6"/>
+    <w:pPr>
+      <w:spacing w:after="0" w:line="240" w:lineRule="auto"/>
+    </w:pPr>
+    <w:rPr>
+      <w:sz w:val="20"/>
+      <w:szCs w:val="20"/>
+    </w:rPr>
+  </w:style>
+  <w:style w:type="character" w:customStyle="1" w:styleId="FootnoteTextChar">
+    <w:name w:val="Footnote Text Char"/>
+    <w:basedOn w:val="DefaultParagraphFont"/>
+    <w:link w:val="FootnoteText"/>
+    <w:uiPriority w:val="99"/>
+    <w:semiHidden/>
+    <w:rsid w:val="00FD1FC6"/>
+    <w:rPr>
+      <w:sz w:val="20"/>
+      <w:szCs w:val="20"/>
+    </w:rPr>
+  </w:style>
+  <w:style w:type="character" w:styleId="FootnoteReference">
+    <w:name w:val="footnote reference"/>
+    <w:basedOn w:val="DefaultParagraphFont"/>
+    <w:uiPriority w:val="99"/>
+    <w:semiHidden/>
+    <w:unhideWhenUsed/>
+    <w:rsid w:val="00FD1FC6"/>
+    <w:rPr>
+      <w:vertAlign w:val="superscript"/>
+    </w:rPr>
+  </w:style>
 </w:styles>
 </file>
 

</xml_diff>